<commit_message>
Documentation: observability pipeline, CI/CD evidence, reflection on the reproducibility gap
</commit_message>
<xml_diff>
--- a/docs/01-design-document.docx
+++ b/docs/01-design-document.docx
@@ -2954,7 +2954,7 @@
         <w:pStyle w:val="FirstParagraph"/>
       </w:pPr>
       <w:r>
-        <w:t xml:space="preserve">The stack runs on k3s in the platform spoke:</w:t>
+        <w:t xml:space="preserve">The stack runs on k3s in the platform spoke and is deployed by pipeline from Helm values held in the repository:</w:t>
       </w:r>
     </w:p>
     <w:tbl>
@@ -3172,6 +3172,22 @@
       </w:r>
       <w:r>
         <w:t xml:space="preserve">. k3s is a CNCF-conformant Kubernetes distribution, so the manifests and Helm charts are unchanged from what EKS would accept. The workload is portable even though the control plane is not managed.</w:t>
+      </w:r>
+    </w:p>
+    <w:p>
+      <w:pPr>
+        <w:pStyle w:val="BodyText"/>
+      </w:pPr>
+      <w:r>
+        <w:t xml:space="preserve">The values files carry placeholders that the pipeline substitutes from Terraform outputs and repository secrets, so no environment-specific value is committed. Two checks guard that substitution: the validate job rejects any placeholder the pipeline does not know how to fill, and the render step fails if one survives into the output. Without them a typo would deploy a configuration containing a literal placeholder, which starts cleanly and behaves wrongly.</w:t>
+      </w:r>
+    </w:p>
+    <w:p>
+      <w:pPr>
+        <w:pStyle w:val="BodyText"/>
+      </w:pPr>
+      <w:r>
+        <w:t xml:space="preserve">This was not the original arrangement. The stack was first installed by running a script on the node by hand, which left it as the only part of the system not reproducible without a person, and meant a rebuilt node came back with no monitoring at all. Section 6.2 describes the pipeline that replaced it.</w:t>
       </w:r>
     </w:p>
     <w:bookmarkEnd w:id="38"/>
@@ -4858,7 +4874,7 @@
     </w:p>
     <w:bookmarkEnd w:id="49"/>
     <w:bookmarkEnd w:id="50"/>
-    <w:bookmarkStart w:id="58" w:name="deployment-and-automation"/>
+    <w:bookmarkStart w:id="59" w:name="deployment-and-automation"/>
     <w:p>
       <w:pPr>
         <w:pStyle w:val="Heading1"/>
@@ -4943,7 +4959,7 @@
       </w:r>
     </w:p>
     <w:bookmarkEnd w:id="51"/>
-    <w:bookmarkStart w:id="57" w:name="X84e8fa2cec28c5a6ca850fb325cee2f916532f9"/>
+    <w:bookmarkStart w:id="58" w:name="X84e8fa2cec28c5a6ca850fb325cee2f916532f9"/>
     <w:p>
       <w:pPr>
         <w:pStyle w:val="Heading2"/>
@@ -5430,7 +5446,62 @@
           </w:p>
         </w:tc>
       </w:tr>
+      <w:tr>
+        <w:tc>
+          <w:tcPr/>
+          <w:p>
+            <w:pPr>
+              <w:pStyle w:val="Compact"/>
+              <w:jc w:val="left"/>
+            </w:pPr>
+            <w:r>
+              <w:t xml:space="preserve">Observability</w:t>
+            </w:r>
+          </w:p>
+        </w:tc>
+        <w:tc>
+          <w:tcPr/>
+          <w:p>
+            <w:pPr>
+              <w:pStyle w:val="Compact"/>
+              <w:jc w:val="left"/>
+            </w:pPr>
+            <w:r>
+              <w:t xml:space="preserve">Changes under</w:t>
+            </w:r>
+            <w:r>
+              <w:t xml:space="preserve"> </w:t>
+            </w:r>
+            <w:r>
+              <w:rPr>
+                <w:rStyle w:val="VerbatimChar"/>
+              </w:rPr>
+              <w:t xml:space="preserve">observability/</w:t>
+            </w:r>
+          </w:p>
+        </w:tc>
+        <w:tc>
+          <w:tcPr/>
+          <w:p>
+            <w:pPr>
+              <w:pStyle w:val="Compact"/>
+              <w:jc w:val="left"/>
+            </w:pPr>
+            <w:r>
+              <w:t xml:space="preserve">Validate the Helm values, render them from Terraform outputs, deploy the stack, verify every pod and the monitoring-to-SOAR path</w:t>
+            </w:r>
+          </w:p>
+        </w:tc>
+      </w:tr>
     </w:tbl>
+    <w:p>
+      <w:pPr>
+        <w:pStyle w:val="BodyText"/>
+      </w:pPr>
+      <w:r>
+        <w:t xml:space="preserve">Between them these cover every deployable part of the system. The only step that remains manual is approving a plan that would destroy a resource, and that is manual deliberately.</w:t>
+      </w:r>
+    </w:p>
     <w:bookmarkEnd w:id="52"/>
     <w:bookmarkStart w:id="53" w:name="testing"/>
     <w:p>
@@ -5584,12 +5655,82 @@
       </w:r>
     </w:p>
     <w:bookmarkEnd w:id="55"/>
-    <w:bookmarkStart w:id="56" w:name="deploying-soar-to-the-container-platform"/>
+    <w:bookmarkStart w:id="56" w:name="deploying-the-observability-stack"/>
     <w:p>
       <w:pPr>
         <w:pStyle w:val="Heading3"/>
       </w:pPr>
       <w:r>
+        <w:t xml:space="preserve">Deploying the observability stack</w:t>
+      </w:r>
+    </w:p>
+    <w:p>
+      <w:pPr>
+        <w:pStyle w:val="FirstParagraph"/>
+      </w:pPr>
+      <w:r>
+        <w:t xml:space="preserve">The Helm values for Prometheus, Alertmanager, Loki, Alloy, Grafana and cloudwatch-exporter are versioned files under</w:t>
+      </w:r>
+      <w:r>
+        <w:t xml:space="preserve"> </w:t>
+      </w:r>
+      <w:r>
+        <w:rPr>
+          <w:rStyle w:val="VerbatimChar"/>
+        </w:rPr>
+        <w:t xml:space="preserve">observability/values/</w:t>
+      </w:r>
+      <w:r>
+        <w:t xml:space="preserve">, and the alert rules are a manifest under</w:t>
+      </w:r>
+      <w:r>
+        <w:t xml:space="preserve"> </w:t>
+      </w:r>
+      <w:r>
+        <w:rPr>
+          <w:rStyle w:val="VerbatimChar"/>
+        </w:rPr>
+        <w:t xml:space="preserve">observability/manifests/</w:t>
+      </w:r>
+      <w:r>
+        <w:t xml:space="preserve">. The pipeline resolves environment-specific values from Terraform state, renders them, and applies them with</w:t>
+      </w:r>
+      <w:r>
+        <w:t xml:space="preserve"> </w:t>
+      </w:r>
+      <w:r>
+        <w:rPr>
+          <w:rStyle w:val="VerbatimChar"/>
+        </w:rPr>
+        <w:t xml:space="preserve">helm upgrade --install</w:t>
+      </w:r>
+      <w:r>
+        <w:t xml:space="preserve">.</w:t>
+      </w:r>
+    </w:p>
+    <w:p>
+      <w:pPr>
+        <w:pStyle w:val="BodyText"/>
+      </w:pPr>
+      <w:r>
+        <w:t xml:space="preserve">After deploying it verifies three things: that every pod in the namespace is Running, that the alert rules loaded, and that a POST from inside the cluster to the private SOAR ingest endpoint returns HTTP 200. That last check matters more than it looks. If Alertmanager cannot reach the ingest endpoint then the observability stack has stopped being part of the SOAR system, whatever its configuration says, and REQ-NCA-P2-09 is silently unmet. Verifying it on every deployment turns that from an assumption into a checked property.</w:t>
+      </w:r>
+    </w:p>
+    <w:p>
+      <w:pPr>
+        <w:pStyle w:val="BodyText"/>
+      </w:pPr>
+      <w:r>
+        <w:t xml:space="preserve">Terraform’s Helm provider was the alternative and is more literally infrastructure as code. It was not used because it needs to reach the Kubernetes API at plan time, which from a runner outside the VPC means carrying a kubeconfig through the bastion, and because it creates an ordering problem: the cluster and the workloads running on it would live in the same configuration and the same state. Helm driven by a pipeline against versioned values achieves the same reproducibility with fewer moving parts. Separating cluster and workload state, then adopting the provider, is the production recommendation.</w:t>
+      </w:r>
+    </w:p>
+    <w:bookmarkEnd w:id="56"/>
+    <w:bookmarkStart w:id="57" w:name="deploying-soar-to-the-container-platform"/>
+    <w:p>
+      <w:pPr>
+        <w:pStyle w:val="Heading3"/>
+      </w:pPr>
+      <w:r>
         <w:t xml:space="preserve">Deploying SOAR to the container platform</w:t>
       </w:r>
     </w:p>
@@ -5614,10 +5755,10 @@
         <w:br w:type="page"/>
       </w:r>
     </w:p>
-    <w:bookmarkEnd w:id="56"/>
     <w:bookmarkEnd w:id="57"/>
     <w:bookmarkEnd w:id="58"/>
-    <w:bookmarkStart w:id="59" w:name="failure-scenarios"/>
+    <w:bookmarkEnd w:id="59"/>
+    <w:bookmarkStart w:id="60" w:name="failure-scenarios"/>
     <w:p>
       <w:pPr>
         <w:pStyle w:val="Heading1"/>
@@ -5975,8 +6116,8 @@
         <w:br w:type="page"/>
       </w:r>
     </w:p>
-    <w:bookmarkEnd w:id="59"/>
-    <w:bookmarkStart w:id="63" w:name="decisions-taken-under-constraint"/>
+    <w:bookmarkEnd w:id="60"/>
+    <w:bookmarkStart w:id="64" w:name="decisions-taken-under-constraint"/>
     <w:p>
       <w:pPr>
         <w:pStyle w:val="Heading1"/>
@@ -5993,7 +6134,7 @@
         <w:t xml:space="preserve">Three significant design decisions were forced by constraints discovered during implementation rather than chosen freely. They are recorded here because the reasoning is part of the design.</w:t>
       </w:r>
     </w:p>
-    <w:bookmarkStart w:id="60" w:name="k3s-instead-of-eks"/>
+    <w:bookmarkStart w:id="61" w:name="k3s-instead-of-eks"/>
     <w:p>
       <w:pPr>
         <w:pStyle w:val="Heading2"/>
@@ -6022,8 +6163,8 @@
         <w:t xml:space="preserve">. This was found by probing the account before designing, not by hitting it during deployment. k3s on EC2 is CNCF-conformant, so the workload remains portable; the difference is that the control plane is self-managed rather than managed.</w:t>
       </w:r>
     </w:p>
-    <w:bookmarkEnd w:id="60"/>
-    <w:bookmarkStart w:id="61" w:name="X348368fae208ab7a7823e02f796da62e3186d3b"/>
+    <w:bookmarkEnd w:id="61"/>
+    <w:bookmarkStart w:id="62" w:name="X348368fae208ab7a7823e02f796da62e3186d3b"/>
     <w:p>
       <w:pPr>
         <w:pStyle w:val="Heading2"/>
@@ -6115,8 +6256,8 @@
         <w:t xml:space="preserve">PostgreSQL instance was always the weaker choice; the policy simply forced the stronger one. SOAR operational state moved to DynamoDB, which suits it better anyway. Events are written once and read by key, with no joins.</w:t>
       </w:r>
     </w:p>
-    <w:bookmarkEnd w:id="61"/>
-    <w:bookmarkStart w:id="62" w:name="Xe92ecc1338b76b4a21367e33c1195b0b2cb6cad"/>
+    <w:bookmarkEnd w:id="62"/>
+    <w:bookmarkStart w:id="63" w:name="Xe92ecc1338b76b4a21367e33c1195b0b2cb6cad"/>
     <w:p>
       <w:pPr>
         <w:pStyle w:val="Heading2"/>
@@ -6185,9 +6326,9 @@
         <w:br w:type="page"/>
       </w:r>
     </w:p>
-    <w:bookmarkEnd w:id="62"/>
     <w:bookmarkEnd w:id="63"/>
-    <w:bookmarkStart w:id="64" w:name="cost"/>
+    <w:bookmarkEnd w:id="64"/>
+    <w:bookmarkStart w:id="65" w:name="cost"/>
     <w:p>
       <w:pPr>
         <w:pStyle w:val="Heading1"/>
@@ -6474,8 +6615,8 @@
         <w:br w:type="page"/>
       </w:r>
     </w:p>
-    <w:bookmarkEnd w:id="64"/>
-    <w:bookmarkStart w:id="65" w:name="recommendations"/>
+    <w:bookmarkEnd w:id="65"/>
+    <w:bookmarkStart w:id="66" w:name="recommendations"/>
     <w:p>
       <w:pPr>
         <w:pStyle w:val="Heading1"/>
@@ -6639,7 +6780,7 @@
         <w:t xml:space="preserve">metric, which shows which real events currently have no automated response.</w:t>
       </w:r>
     </w:p>
-    <w:bookmarkEnd w:id="65"/>
+    <w:bookmarkEnd w:id="66"/>
     <w:sectPr/>
   </w:body>
 </w:document>

</xml_diff>

<commit_message>
Close remaining gaps: on-premises syslog source, SOAR dashboard, cloud agnosticism, planned resilience test
</commit_message>
<xml_diff>
--- a/docs/01-design-document.docx
+++ b/docs/01-design-document.docx
@@ -850,7 +850,7 @@
     </w:p>
     <w:bookmarkEnd w:id="23"/>
     <w:bookmarkEnd w:id="24"/>
-    <w:bookmarkStart w:id="25" w:name="architecture-overview"/>
+    <w:bookmarkStart w:id="26" w:name="architecture-overview"/>
     <w:p>
       <w:pPr>
         <w:pStyle w:val="Heading1"/>
@@ -975,13 +975,93 @@
         <w:t xml:space="preserve">: wherever a security property can be guaranteed by the shape of the system rather than by a configuration setting, it is. A database with no route to the internet cannot be exposed by a misconfigured firewall rule. A rule engine with no write permissions cannot damage the environment however badly it misbehaves.</w:t>
       </w:r>
     </w:p>
+    <w:bookmarkStart w:id="25" w:name="cloud-agnosticism"/>
+    <w:p>
+      <w:pPr>
+        <w:pStyle w:val="Heading2"/>
+      </w:pPr>
+      <w:r>
+        <w:t xml:space="preserve">2.1 Cloud agnosticism</w:t>
+      </w:r>
+    </w:p>
+    <w:p>
+      <w:pPr>
+        <w:pStyle w:val="FirstParagraph"/>
+      </w:pPr>
+      <w:r>
+        <w:t xml:space="preserve">The assignment asks for a design that is cloud-agnostic in principle while being implemented on one platform. That is the position taken here, and it is worth being precise about where it holds and where it does not.</w:t>
+      </w:r>
+    </w:p>
+    <w:p>
+      <w:pPr>
+        <w:pStyle w:val="BodyText"/>
+      </w:pPr>
+      <w:r>
+        <w:rPr>
+          <w:bCs/>
+          <w:b/>
+        </w:rPr>
+        <w:t xml:space="preserve">Portable by design.</w:t>
+      </w:r>
+      <w:r>
+        <w:t xml:space="preserve"> </w:t>
+      </w:r>
+      <w:r>
+        <w:t xml:space="preserve">The network topology is hub-and-spoke with segmented routing, which every major provider expresses: AWS Transit Gateway, Azure Virtual WAN or hub VNet peering, Google Network Connectivity Center. The container platform is k3s, a CNCF-conformant Kubernetes distribution, so every manifest and Helm chart runs unchanged on AKS, GKE or EKS. The observability stack is Prometheus, Loki and Grafana, none of which are provider-specific. The SOAR logic is plain Python with a declarative playbook file, and the rule engine contains no cloud API calls at all.</w:t>
+      </w:r>
+    </w:p>
+    <w:p>
+      <w:pPr>
+        <w:pStyle w:val="BodyText"/>
+      </w:pPr>
+      <w:r>
+        <w:rPr>
+          <w:bCs/>
+          <w:b/>
+        </w:rPr>
+        <w:t xml:space="preserve">Provider-specific by necessity.</w:t>
+      </w:r>
+      <w:r>
+        <w:t xml:space="preserve"> </w:t>
+      </w:r>
+      <w:r>
+        <w:t xml:space="preserve">The response actions manipulate AWS network ACLs and security groups, because containment has to touch the actual network. Porting them means rewriting three handler files against the equivalent primitives: Azure network security groups, or Google firewall rules. The event bus, queue and function runtime are AWS services with direct equivalents elsewhere (Event Grid and Pub/Sub, Service Bus and Cloud Tasks, Azure Functions and Cloud Run Functions).</w:t>
+      </w:r>
+    </w:p>
+    <w:p>
+      <w:pPr>
+        <w:pStyle w:val="BodyText"/>
+      </w:pPr>
+      <w:r>
+        <w:rPr>
+          <w:bCs/>
+          <w:b/>
+        </w:rPr>
+        <w:t xml:space="preserve">The honest summary.</w:t>
+      </w:r>
+      <w:r>
+        <w:t xml:space="preserve"> </w:t>
+      </w:r>
+      <w:r>
+        <w:t xml:space="preserve">The architecture ports. The infrastructure code does not, because Terraform’s AWS provider is not the Azure provider whatever the language in common. Roughly the SOAR logic, the playbooks, the observability configuration and the container workloads move unchanged, and the infrastructure definitions and the three response handlers would be rewritten.</w:t>
+      </w:r>
+    </w:p>
+    <w:p>
+      <w:pPr>
+        <w:pStyle w:val="BodyText"/>
+      </w:pPr>
+      <w:r>
+        <w:t xml:space="preserve">Claiming more than that would be dishonest. A design that is genuinely portable across providers without modification tends to be one that uses none of them well.</w:t>
+      </w:r>
+    </w:p>
     <w:p>
       <w:r>
         <w:br w:type="page"/>
       </w:r>
     </w:p>
     <w:bookmarkEnd w:id="25"/>
-    <w:bookmarkStart w:id="36" w:name="network-design"/>
+    <w:bookmarkEnd w:id="26"/>
+    <w:bookmarkStart w:id="37" w:name="network-design"/>
     <w:p>
       <w:pPr>
         <w:pStyle w:val="Heading1"/>
@@ -999,18 +1079,18 @@
           <wp:inline>
             <wp:extent cx="5334000" cy="3888716"/>
             <wp:effectExtent b="0" l="0" r="0" t="0"/>
-            <wp:docPr descr="Network architecture" title="" id="27" name="Picture"/>
+            <wp:docPr descr="Network architecture" title="" id="28" name="Picture"/>
             <a:graphic>
               <a:graphicData uri="http://schemas.openxmlformats.org/drawingml/2006/picture">
                 <pic:pic>
                   <pic:nvPicPr>
-                    <pic:cNvPr descr="diagrams/network-architecture.png" id="28" name="Picture"/>
+                    <pic:cNvPr descr="diagrams/network-architecture.png" id="29" name="Picture"/>
                     <pic:cNvPicPr>
                       <a:picLocks noChangeArrowheads="1" noChangeAspect="1"/>
                     </pic:cNvPicPr>
                   </pic:nvPicPr>
                   <pic:blipFill>
-                    <a:blip r:embed="rId26"/>
+                    <a:blip r:embed="rId27"/>
                     <a:stretch>
                       <a:fillRect/>
                     </a:stretch>
@@ -1045,7 +1125,7 @@
         <w:t xml:space="preserve">Network architecture</w:t>
       </w:r>
     </w:p>
-    <w:bookmarkStart w:id="29" w:name="address-plan"/>
+    <w:bookmarkStart w:id="30" w:name="address-plan"/>
     <w:p>
       <w:pPr>
         <w:pStyle w:val="Heading2"/>
@@ -1297,8 +1377,8 @@
         <w:t xml:space="preserve">). Each has dedicated /28 subnets for Transit Gateway attachment interfaces, kept separate from workload subnets so the attachment does not consume usable addresses and so flow logs are easier to interpret.</w:t>
       </w:r>
     </w:p>
-    <w:bookmarkEnd w:id="29"/>
-    <w:bookmarkStart w:id="30" w:name="hub-and-spoke-topology-req-nca-p2-02"/>
+    <w:bookmarkEnd w:id="30"/>
+    <w:bookmarkStart w:id="31" w:name="hub-and-spoke-topology-req-nca-p2-02"/>
     <w:p>
       <w:pPr>
         <w:pStyle w:val="Heading2"/>
@@ -1355,8 +1435,8 @@
         <w:t xml:space="preserve">connections and every new spoke requires touching every existing route table. The Transit Gateway makes that O(n), and it supports the segmented routing described next, which peering cannot express at all.</w:t>
       </w:r>
     </w:p>
-    <w:bookmarkEnd w:id="30"/>
-    <w:bookmarkStart w:id="31" w:name="controlled-traffic-flow"/>
+    <w:bookmarkEnd w:id="31"/>
+    <w:bookmarkStart w:id="32" w:name="controlled-traffic-flow"/>
     <w:p>
       <w:pPr>
         <w:pStyle w:val="Heading2"/>
@@ -1621,8 +1701,8 @@
         <w:t xml:space="preserve">”</w:t>
       </w:r>
     </w:p>
-    <w:bookmarkEnd w:id="31"/>
-    <w:bookmarkStart w:id="32" w:name="X71077e9ec1685ff494d79413956d56af7d75ab5"/>
+    <w:bookmarkEnd w:id="32"/>
+    <w:bookmarkStart w:id="33" w:name="X71077e9ec1685ff494d79413956d56af7d75ab5"/>
     <w:p>
       <w:pPr>
         <w:pStyle w:val="Heading2"/>
@@ -1923,8 +2003,8 @@
         <w:t xml:space="preserve">associated with every spoke and aliased to the hub endpoint. Scales better beyond three or four spokes and is the recommended production pattern. At this size the second endpoint is simpler to reason about and costs roughly €7 per month.</w:t>
       </w:r>
     </w:p>
-    <w:bookmarkEnd w:id="32"/>
-    <w:bookmarkStart w:id="33" w:name="design-for-failure-req-nca-p2-01"/>
+    <w:bookmarkEnd w:id="33"/>
+    <w:bookmarkStart w:id="34" w:name="design-for-failure-req-nca-p2-01"/>
     <w:p>
       <w:pPr>
         <w:pStyle w:val="Heading2"/>
@@ -2315,8 +2395,8 @@
         <w:t xml:space="preserve">path trades availability for cost in a way that is documented and reversible.</w:t>
       </w:r>
     </w:p>
-    <w:bookmarkEnd w:id="33"/>
-    <w:bookmarkStart w:id="34" w:name="internal-dns-req-nca-p2-04"/>
+    <w:bookmarkEnd w:id="34"/>
+    <w:bookmarkStart w:id="35" w:name="internal-dns-req-nca-p2-04"/>
     <w:p>
       <w:pPr>
         <w:pStyle w:val="Heading2"/>
@@ -2488,8 +2568,8 @@
         <w:t xml:space="preserve">) because it costs roughly €0.25/hour for its two interfaces. VPC-internal name resolution continues to work when it is disabled; only the on-premises path is affected.</w:t>
       </w:r>
     </w:p>
-    <w:bookmarkEnd w:id="34"/>
-    <w:bookmarkStart w:id="35" w:name="hybrid-connectivity"/>
+    <w:bookmarkEnd w:id="35"/>
+    <w:bookmarkStart w:id="36" w:name="hybrid-connectivity"/>
     <w:p>
       <w:pPr>
         <w:pStyle w:val="Heading2"/>
@@ -2560,9 +2640,9 @@
         <w:br w:type="page"/>
       </w:r>
     </w:p>
-    <w:bookmarkEnd w:id="35"/>
     <w:bookmarkEnd w:id="36"/>
-    <w:bookmarkStart w:id="41" w:name="observability"/>
+    <w:bookmarkEnd w:id="37"/>
+    <w:bookmarkStart w:id="43" w:name="observability"/>
     <w:p>
       <w:pPr>
         <w:pStyle w:val="Heading1"/>
@@ -2571,7 +2651,7 @@
         <w:t xml:space="preserve">4. Observability</w:t>
       </w:r>
     </w:p>
-    <w:bookmarkStart w:id="37" w:name="technology-evaluation-req-nca-p2-05"/>
+    <w:bookmarkStart w:id="38" w:name="technology-evaluation-req-nca-p2-05"/>
     <w:p>
       <w:pPr>
         <w:pStyle w:val="Heading2"/>
@@ -2939,8 +3019,8 @@
         <w:t xml:space="preserve">The deciding factor was not any single feature but the Alertmanager webhook receiver. It is what allows the monitoring system to become the primary event source for the SOAR pipeline rather than a parallel system that a human reads. Every other candidate would have required a bridging component.</w:t>
       </w:r>
     </w:p>
-    <w:bookmarkEnd w:id="37"/>
-    <w:bookmarkStart w:id="38" w:name="deployment"/>
+    <w:bookmarkEnd w:id="38"/>
+    <w:bookmarkStart w:id="39" w:name="deployment"/>
     <w:p>
       <w:pPr>
         <w:pStyle w:val="Heading2"/>
@@ -3190,8 +3270,8 @@
         <w:t xml:space="preserve">This was not the original arrangement. The stack was first installed by running a script on the node by hand, which left it as the only part of the system not reproducible without a person, and meant a rebuilt node came back with no monitoring at all. Section 6.2 describes the pipeline that replaced it.</w:t>
       </w:r>
     </w:p>
-    <w:bookmarkEnd w:id="38"/>
-    <w:bookmarkStart w:id="39" w:name="monitoring-data-storage"/>
+    <w:bookmarkEnd w:id="39"/>
+    <w:bookmarkStart w:id="40" w:name="monitoring-data-storage"/>
     <w:p>
       <w:pPr>
         <w:pStyle w:val="Heading2"/>
@@ -3242,8 +3322,8 @@
         <w:t xml:space="preserve">The bucket lifecycle transitions objects to Infrequent Access after 30 days and expires them at 90, matching Innovatech’s stated retention requirement.</w:t>
       </w:r>
     </w:p>
-    <w:bookmarkEnd w:id="39"/>
-    <w:bookmarkStart w:id="40" w:name="soar-observability-req-nca-p2-08"/>
+    <w:bookmarkEnd w:id="40"/>
+    <w:bookmarkStart w:id="42" w:name="soar-observability-req-nca-p2-08"/>
     <w:p>
       <w:pPr>
         <w:pStyle w:val="Heading2"/>
@@ -3757,14 +3837,162 @@
         <w:t xml:space="preserve">, messages parked in either dead-letter queue</w:t>
       </w:r>
     </w:p>
+    <w:bookmarkStart w:id="41" w:name="dashboard-layout"/>
+    <w:p>
+      <w:pPr>
+        <w:pStyle w:val="Heading3"/>
+      </w:pPr>
+      <w:r>
+        <w:t xml:space="preserve">Dashboard layout</w:t>
+      </w:r>
+    </w:p>
+    <w:p>
+      <w:pPr>
+        <w:pStyle w:val="FirstParagraph"/>
+      </w:pPr>
+      <w:r>
+        <w:t xml:space="preserve">The SOAR Operations dashboard is versioned JSON in</w:t>
+      </w:r>
+      <w:r>
+        <w:t xml:space="preserve"> </w:t>
+      </w:r>
+      <w:r>
+        <w:rPr>
+          <w:rStyle w:val="VerbatimChar"/>
+        </w:rPr>
+        <w:t xml:space="preserve">observability/dashboards/</w:t>
+      </w:r>
+      <w:r>
+        <w:t xml:space="preserve"> </w:t>
+      </w:r>
+      <w:r>
+        <w:t xml:space="preserve">and imported by the pipeline as a ConfigMap that the Grafana sidecar picks up. It is not clicked together in the interface, so it survives a node rebuild.</w:t>
+      </w:r>
+    </w:p>
+    <w:p>
+      <w:pPr>
+        <w:pStyle w:val="BodyText"/>
+      </w:pPr>
+      <w:r>
+        <w:t xml:space="preserve">Four rows, ordered by the question an operator asks first.</w:t>
+      </w:r>
+    </w:p>
+    <w:p>
+      <w:pPr>
+        <w:pStyle w:val="BodyText"/>
+      </w:pPr>
+      <w:r>
+        <w:rPr>
+          <w:bCs/>
+          <w:b/>
+        </w:rPr>
+        <w:t xml:space="preserve">SOAR at a glance.</w:t>
+      </w:r>
+      <w:r>
+        <w:t xml:space="preserve"> </w:t>
+      </w:r>
+      <w:r>
+        <w:t xml:space="preserve">Six counters over the last hour: events ingested, playbooks matched, actions executed, actions failed, actions refused, events unmatched. Read left to right they describe the funnel from raw event to response. Failed is red and refused is amber, because they mean different things: a failure needs investigation, a refusal is a safety guard doing its job.</w:t>
+      </w:r>
+    </w:p>
+    <w:p>
+      <w:pPr>
+        <w:pStyle w:val="BodyText"/>
+      </w:pPr>
+      <w:r>
+        <w:rPr>
+          <w:bCs/>
+          <w:b/>
+        </w:rPr>
+        <w:t xml:space="preserve">Response pipeline.</w:t>
+      </w:r>
+      <w:r>
+        <w:t xml:space="preserve"> </w:t>
+      </w:r>
+      <w:r>
+        <w:t xml:space="preserve">Event flow as four overlaid rates, ingested through matched through dispatched through executed. Dispatched and executed should track each other exactly; a gap between them is the signature of an action failing, and it is visible at a glance without reading any log. Beside it, actions broken down by type, which shows whether the system is mostly notifying or actually containing.</w:t>
+      </w:r>
+    </w:p>
+    <w:p>
+      <w:pPr>
+        <w:pStyle w:val="BodyText"/>
+      </w:pPr>
+      <w:r>
+        <w:rPr>
+          <w:bCs/>
+          <w:b/>
+        </w:rPr>
+        <w:t xml:space="preserve">SOAR system health.</w:t>
+      </w:r>
+      <w:r>
+        <w:t xml:space="preserve"> </w:t>
+      </w:r>
+      <w:r>
+        <w:t xml:space="preserve">Failures and refusals split by action type and reason, dead-letter queue depth for both queues, Lambda duration and Lambda errors. This row answers</w:t>
+      </w:r>
+      <w:r>
+        <w:t xml:space="preserve"> </w:t>
+      </w:r>
+      <w:r>
+        <w:t xml:space="preserve">“</w:t>
+      </w:r>
+      <w:r>
+        <w:t xml:space="preserve">is the responder itself healthy</w:t>
+      </w:r>
+      <w:r>
+        <w:t xml:space="preserve">”</w:t>
+      </w:r>
+      <w:r>
+        <w:t xml:space="preserve">, which is the requirement’s actual demand and is distinct from whether the environment is healthy.</w:t>
+      </w:r>
+    </w:p>
+    <w:p>
+      <w:pPr>
+        <w:pStyle w:val="BodyText"/>
+      </w:pPr>
+      <w:r>
+        <w:rPr>
+          <w:bCs/>
+          <w:b/>
+        </w:rPr>
+        <w:t xml:space="preserve">Monitored estate.</w:t>
+      </w:r>
+      <w:r>
+        <w:t xml:space="preserve"> </w:t>
+      </w:r>
+      <w:r>
+        <w:t xml:space="preserve">Scrape target availability across everything, cloud and on-premises. This is where the two halves of the system visibly meet: a target dropping to zero fires</w:t>
+      </w:r>
+      <w:r>
+        <w:t xml:space="preserve"> </w:t>
+      </w:r>
+      <w:r>
+        <w:rPr>
+          <w:rStyle w:val="VerbatimChar"/>
+        </w:rPr>
+        <w:t xml:space="preserve">TargetDown</w:t>
+      </w:r>
+      <w:r>
+        <w:t xml:space="preserve">, which the Alertmanager webhook turns into a SOAR event, which the rows above then account for.</w:t>
+      </w:r>
+    </w:p>
+    <w:p>
+      <w:pPr>
+        <w:pStyle w:val="BodyText"/>
+      </w:pPr>
+      <w:r>
+        <w:t xml:space="preserve">The ordering is deliberate. An operator opening this during an incident sees whether responses are firing before seeing anything else, because that is the question that determines whether they need to intervene manually.</w:t>
+      </w:r>
+    </w:p>
     <w:p>
       <w:r>
         <w:br w:type="page"/>
       </w:r>
     </w:p>
-    <w:bookmarkEnd w:id="40"/>
     <w:bookmarkEnd w:id="41"/>
-    <w:bookmarkStart w:id="50" w:name="soar-system-design"/>
+    <w:bookmarkEnd w:id="42"/>
+    <w:bookmarkEnd w:id="43"/>
+    <w:bookmarkStart w:id="53" w:name="soar-system-design"/>
     <w:p>
       <w:pPr>
         <w:pStyle w:val="Heading1"/>
@@ -3773,7 +4001,7 @@
         <w:t xml:space="preserve">5. SOAR system design</w:t>
       </w:r>
     </w:p>
-    <w:bookmarkStart w:id="45" w:name="event-driven-architecture-req-nca-p2-06"/>
+    <w:bookmarkStart w:id="47" w:name="event-driven-architecture-req-nca-p2-06"/>
     <w:p>
       <w:pPr>
         <w:pStyle w:val="Heading2"/>
@@ -3791,18 +4019,18 @@
           <wp:inline>
             <wp:extent cx="5334000" cy="3307080"/>
             <wp:effectExtent b="0" l="0" r="0" t="0"/>
-            <wp:docPr descr="SOAR event pipeline" title="" id="43" name="Picture"/>
+            <wp:docPr descr="SOAR event pipeline" title="" id="45" name="Picture"/>
             <a:graphic>
               <a:graphicData uri="http://schemas.openxmlformats.org/drawingml/2006/picture">
                 <pic:pic>
                   <pic:nvPicPr>
-                    <pic:cNvPr descr="diagrams/soar-pipeline.png" id="44" name="Picture"/>
+                    <pic:cNvPr descr="diagrams/soar-pipeline.png" id="46" name="Picture"/>
                     <pic:cNvPicPr>
                       <a:picLocks noChangeArrowheads="1" noChangeAspect="1"/>
                     </pic:cNvPicPr>
                   </pic:nvPicPr>
                   <pic:blipFill>
-                    <a:blip r:embed="rId42"/>
+                    <a:blip r:embed="rId44"/>
                     <a:stretch>
                       <a:fillRect/>
                     </a:stretch>
@@ -4143,14 +4371,14 @@
         <w:t xml:space="preserve">EventBridge retries dispatch twice with a five-minute maximum age, and undeliverable actions land in a dead-letter queue rather than disappearing.</w:t>
       </w:r>
     </w:p>
-    <w:bookmarkEnd w:id="45"/>
-    <w:bookmarkStart w:id="46" w:name="event-normalisation"/>
+    <w:bookmarkEnd w:id="47"/>
+    <w:bookmarkStart w:id="48" w:name="event-sources"/>
     <w:p>
       <w:pPr>
         <w:pStyle w:val="Heading2"/>
       </w:pPr>
       <w:r>
-        <w:t xml:space="preserve">5.2 Event normalisation</w:t>
+        <w:t xml:space="preserve">5.2 Event sources</w:t>
       </w:r>
     </w:p>
     <w:p>
@@ -4158,1083 +4386,7 @@
         <w:pStyle w:val="FirstParagraph"/>
       </w:pPr>
       <w:r>
-        <w:t xml:space="preserve">Each source speaks a different format. The collector normalises all of them into one internal schema so the rule engine never needs to know where an event came from:</w:t>
-      </w:r>
-    </w:p>
-    <w:p>
-      <w:pPr>
-        <w:pStyle w:val="SourceCode"/>
-      </w:pPr>
-      <w:r>
-        <w:rPr>
-          <w:rStyle w:val="FunctionTok"/>
-        </w:rPr>
-        <w:t xml:space="preserve">{</w:t>
-      </w:r>
-      <w:r>
-        <w:br/>
-      </w:r>
-      <w:r>
-        <w:rPr>
-          <w:rStyle w:val="NormalTok"/>
-        </w:rPr>
-        <w:t xml:space="preserve"> </w:t>
-      </w:r>
-      <w:r>
-        <w:rPr>
-          <w:rStyle w:val="DataTypeTok"/>
-        </w:rPr>
-        <w:t xml:space="preserve">"event_id"</w:t>
-      </w:r>
-      <w:r>
-        <w:rPr>
-          <w:rStyle w:val="FunctionTok"/>
-        </w:rPr>
-        <w:t xml:space="preserve">:</w:t>
-      </w:r>
-      <w:r>
-        <w:rPr>
-          <w:rStyle w:val="NormalTok"/>
-        </w:rPr>
-        <w:t xml:space="preserve"> </w:t>
-      </w:r>
-      <w:r>
-        <w:rPr>
-          <w:rStyle w:val="StringTok"/>
-        </w:rPr>
-        <w:t xml:space="preserve">"uuid"</w:t>
-      </w:r>
-      <w:r>
-        <w:rPr>
-          <w:rStyle w:val="FunctionTok"/>
-        </w:rPr>
-        <w:t xml:space="preserve">,</w:t>
-      </w:r>
-      <w:r>
-        <w:br/>
-      </w:r>
-      <w:r>
-        <w:rPr>
-          <w:rStyle w:val="NormalTok"/>
-        </w:rPr>
-        <w:t xml:space="preserve"> </w:t>
-      </w:r>
-      <w:r>
-        <w:rPr>
-          <w:rStyle w:val="DataTypeTok"/>
-        </w:rPr>
-        <w:t xml:space="preserve">"received_at"</w:t>
-      </w:r>
-      <w:r>
-        <w:rPr>
-          <w:rStyle w:val="FunctionTok"/>
-        </w:rPr>
-        <w:t xml:space="preserve">:</w:t>
-      </w:r>
-      <w:r>
-        <w:rPr>
-          <w:rStyle w:val="NormalTok"/>
-        </w:rPr>
-        <w:t xml:space="preserve"> </w:t>
-      </w:r>
-      <w:r>
-        <w:rPr>
-          <w:rStyle w:val="StringTok"/>
-        </w:rPr>
-        <w:t xml:space="preserve">"ISO-8601"</w:t>
-      </w:r>
-      <w:r>
-        <w:rPr>
-          <w:rStyle w:val="FunctionTok"/>
-        </w:rPr>
-        <w:t xml:space="preserve">,</w:t>
-      </w:r>
-      <w:r>
-        <w:br/>
-      </w:r>
-      <w:r>
-        <w:rPr>
-          <w:rStyle w:val="NormalTok"/>
-        </w:rPr>
-        <w:t xml:space="preserve"> </w:t>
-      </w:r>
-      <w:r>
-        <w:rPr>
-          <w:rStyle w:val="DataTypeTok"/>
-        </w:rPr>
-        <w:t xml:space="preserve">"source"</w:t>
-      </w:r>
-      <w:r>
-        <w:rPr>
-          <w:rStyle w:val="FunctionTok"/>
-        </w:rPr>
-        <w:t xml:space="preserve">:</w:t>
-      </w:r>
-      <w:r>
-        <w:rPr>
-          <w:rStyle w:val="NormalTok"/>
-        </w:rPr>
-        <w:t xml:space="preserve"> </w:t>
-      </w:r>
-      <w:r>
-        <w:rPr>
-          <w:rStyle w:val="StringTok"/>
-        </w:rPr>
-        <w:t xml:space="preserve">"alertmanager | syslog | cloudwatch | direct"</w:t>
-      </w:r>
-      <w:r>
-        <w:rPr>
-          <w:rStyle w:val="FunctionTok"/>
-        </w:rPr>
-        <w:t xml:space="preserve">,</w:t>
-      </w:r>
-      <w:r>
-        <w:br/>
-      </w:r>
-      <w:r>
-        <w:rPr>
-          <w:rStyle w:val="NormalTok"/>
-        </w:rPr>
-        <w:t xml:space="preserve"> </w:t>
-      </w:r>
-      <w:r>
-        <w:rPr>
-          <w:rStyle w:val="DataTypeTok"/>
-        </w:rPr>
-        <w:t xml:space="preserve">"event_type"</w:t>
-      </w:r>
-      <w:r>
-        <w:rPr>
-          <w:rStyle w:val="FunctionTok"/>
-        </w:rPr>
-        <w:t xml:space="preserve">:</w:t>
-      </w:r>
-      <w:r>
-        <w:rPr>
-          <w:rStyle w:val="NormalTok"/>
-        </w:rPr>
-        <w:t xml:space="preserve"> </w:t>
-      </w:r>
-      <w:r>
-        <w:rPr>
-          <w:rStyle w:val="StringTok"/>
-        </w:rPr>
-        <w:t xml:space="preserve">"ssh_auth_failure"</w:t>
-      </w:r>
-      <w:r>
-        <w:rPr>
-          <w:rStyle w:val="FunctionTok"/>
-        </w:rPr>
-        <w:t xml:space="preserve">,</w:t>
-      </w:r>
-      <w:r>
-        <w:br/>
-      </w:r>
-      <w:r>
-        <w:rPr>
-          <w:rStyle w:val="NormalTok"/>
-        </w:rPr>
-        <w:t xml:space="preserve"> </w:t>
-      </w:r>
-      <w:r>
-        <w:rPr>
-          <w:rStyle w:val="DataTypeTok"/>
-        </w:rPr>
-        <w:t xml:space="preserve">"severity"</w:t>
-      </w:r>
-      <w:r>
-        <w:rPr>
-          <w:rStyle w:val="FunctionTok"/>
-        </w:rPr>
-        <w:t xml:space="preserve">:</w:t>
-      </w:r>
-      <w:r>
-        <w:rPr>
-          <w:rStyle w:val="NormalTok"/>
-        </w:rPr>
-        <w:t xml:space="preserve"> </w:t>
-      </w:r>
-      <w:r>
-        <w:rPr>
-          <w:rStyle w:val="StringTok"/>
-        </w:rPr>
-        <w:t xml:space="preserve">"critical | high | medium | low"</w:t>
-      </w:r>
-      <w:r>
-        <w:rPr>
-          <w:rStyle w:val="FunctionTok"/>
-        </w:rPr>
-        <w:t xml:space="preserve">,</w:t>
-      </w:r>
-      <w:r>
-        <w:br/>
-      </w:r>
-      <w:r>
-        <w:rPr>
-          <w:rStyle w:val="NormalTok"/>
-        </w:rPr>
-        <w:t xml:space="preserve"> </w:t>
-      </w:r>
-      <w:r>
-        <w:rPr>
-          <w:rStyle w:val="DataTypeTok"/>
-        </w:rPr>
-        <w:t xml:space="preserve">"source_ip"</w:t>
-      </w:r>
-      <w:r>
-        <w:rPr>
-          <w:rStyle w:val="FunctionTok"/>
-        </w:rPr>
-        <w:t xml:space="preserve">:</w:t>
-      </w:r>
-      <w:r>
-        <w:rPr>
-          <w:rStyle w:val="NormalTok"/>
-        </w:rPr>
-        <w:t xml:space="preserve"> </w:t>
-      </w:r>
-      <w:r>
-        <w:rPr>
-          <w:rStyle w:val="StringTok"/>
-        </w:rPr>
-        <w:t xml:space="preserve">"203.0.113.66"</w:t>
-      </w:r>
-      <w:r>
-        <w:rPr>
-          <w:rStyle w:val="FunctionTok"/>
-        </w:rPr>
-        <w:t xml:space="preserve">,</w:t>
-      </w:r>
-      <w:r>
-        <w:br/>
-      </w:r>
-      <w:r>
-        <w:rPr>
-          <w:rStyle w:val="NormalTok"/>
-        </w:rPr>
-        <w:t xml:space="preserve"> </w:t>
-      </w:r>
-      <w:r>
-        <w:rPr>
-          <w:rStyle w:val="DataTypeTok"/>
-        </w:rPr>
-        <w:t xml:space="preserve">"target_host"</w:t>
-      </w:r>
-      <w:r>
-        <w:rPr>
-          <w:rStyle w:val="FunctionTok"/>
-        </w:rPr>
-        <w:t xml:space="preserve">:</w:t>
-      </w:r>
-      <w:r>
-        <w:rPr>
-          <w:rStyle w:val="NormalTok"/>
-        </w:rPr>
-        <w:t xml:space="preserve"> </w:t>
-      </w:r>
-      <w:r>
-        <w:rPr>
-          <w:rStyle w:val="StringTok"/>
-        </w:rPr>
-        <w:t xml:space="preserve">"corp-server.innovatech.internal"</w:t>
-      </w:r>
-      <w:r>
-        <w:rPr>
-          <w:rStyle w:val="FunctionTok"/>
-        </w:rPr>
-        <w:t xml:space="preserve">,</w:t>
-      </w:r>
-      <w:r>
-        <w:br/>
-      </w:r>
-      <w:r>
-        <w:rPr>
-          <w:rStyle w:val="NormalTok"/>
-        </w:rPr>
-        <w:t xml:space="preserve"> </w:t>
-      </w:r>
-      <w:r>
-        <w:rPr>
-          <w:rStyle w:val="DataTypeTok"/>
-        </w:rPr>
-        <w:t xml:space="preserve">"target_instance_id"</w:t>
-      </w:r>
-      <w:r>
-        <w:rPr>
-          <w:rStyle w:val="FunctionTok"/>
-        </w:rPr>
-        <w:t xml:space="preserve">:</w:t>
-      </w:r>
-      <w:r>
-        <w:rPr>
-          <w:rStyle w:val="NormalTok"/>
-        </w:rPr>
-        <w:t xml:space="preserve"> </w:t>
-      </w:r>
-      <w:r>
-        <w:rPr>
-          <w:rStyle w:val="StringTok"/>
-        </w:rPr>
-        <w:t xml:space="preserve">"i-049e95348a865e18d"</w:t>
-      </w:r>
-      <w:r>
-        <w:rPr>
-          <w:rStyle w:val="FunctionTok"/>
-        </w:rPr>
-        <w:t xml:space="preserve">,</w:t>
-      </w:r>
-      <w:r>
-        <w:br/>
-      </w:r>
-      <w:r>
-        <w:rPr>
-          <w:rStyle w:val="NormalTok"/>
-        </w:rPr>
-        <w:t xml:space="preserve"> </w:t>
-      </w:r>
-      <w:r>
-        <w:rPr>
-          <w:rStyle w:val="DataTypeTok"/>
-        </w:rPr>
-        <w:t xml:space="preserve">"description"</w:t>
-      </w:r>
-      <w:r>
-        <w:rPr>
-          <w:rStyle w:val="FunctionTok"/>
-        </w:rPr>
-        <w:t xml:space="preserve">:</w:t>
-      </w:r>
-      <w:r>
-        <w:rPr>
-          <w:rStyle w:val="NormalTok"/>
-        </w:rPr>
-        <w:t xml:space="preserve"> </w:t>
-      </w:r>
-      <w:r>
-        <w:rPr>
-          <w:rStyle w:val="StringTok"/>
-        </w:rPr>
-        <w:t xml:space="preserve">"..."</w:t>
-      </w:r>
-      <w:r>
-        <w:rPr>
-          <w:rStyle w:val="FunctionTok"/>
-        </w:rPr>
-        <w:t xml:space="preserve">,</w:t>
-      </w:r>
-      <w:r>
-        <w:br/>
-      </w:r>
-      <w:r>
-        <w:rPr>
-          <w:rStyle w:val="NormalTok"/>
-        </w:rPr>
-        <w:t xml:space="preserve"> </w:t>
-      </w:r>
-      <w:r>
-        <w:rPr>
-          <w:rStyle w:val="DataTypeTok"/>
-        </w:rPr>
-        <w:t xml:space="preserve">"raw"</w:t>
-      </w:r>
-      <w:r>
-        <w:rPr>
-          <w:rStyle w:val="FunctionTok"/>
-        </w:rPr>
-        <w:t xml:space="preserve">:</w:t>
-      </w:r>
-      <w:r>
-        <w:rPr>
-          <w:rStyle w:val="NormalTok"/>
-        </w:rPr>
-        <w:t xml:space="preserve"> </w:t>
-      </w:r>
-      <w:r>
-        <w:rPr>
-          <w:rStyle w:val="FunctionTok"/>
-        </w:rPr>
-        <w:t xml:space="preserve">{</w:t>
-      </w:r>
-      <w:r>
-        <w:rPr>
-          <w:rStyle w:val="NormalTok"/>
-        </w:rPr>
-        <w:t xml:space="preserve"> </w:t>
-      </w:r>
-      <w:r>
-        <w:rPr>
-          <w:rStyle w:val="FunctionTok"/>
-        </w:rPr>
-        <w:t xml:space="preserve">}</w:t>
-      </w:r>
-      <w:r>
-        <w:br/>
-      </w:r>
-      <w:r>
-        <w:rPr>
-          <w:rStyle w:val="FunctionTok"/>
-        </w:rPr>
-        <w:t xml:space="preserve">}</w:t>
-      </w:r>
-    </w:p>
-    <w:p>
-      <w:pPr>
-        <w:pStyle w:val="FirstParagraph"/>
-      </w:pPr>
-      <w:r>
-        <w:t xml:space="preserve">Adding a fifth source means adding one parser in the collector and changing nothing downstream. Unrecognised syslog lines are stored as</w:t>
-      </w:r>
-      <w:r>
-        <w:t xml:space="preserve"> </w:t>
-      </w:r>
-      <w:r>
-        <w:rPr>
-          <w:rStyle w:val="VerbatimChar"/>
-        </w:rPr>
-        <w:t xml:space="preserve">syslog_generic</w:t>
-      </w:r>
-      <w:r>
-        <w:t xml:space="preserve"> </w:t>
-      </w:r>
-      <w:r>
-        <w:t xml:space="preserve">rather than discarded. An event nobody has written a rule for yet is a gap in coverage, not noise.</w:t>
-      </w:r>
-    </w:p>
-    <w:bookmarkEnd w:id="46"/>
-    <w:bookmarkStart w:id="47" w:name="ingest-path"/>
-    <w:p>
-      <w:pPr>
-        <w:pStyle w:val="Heading2"/>
-      </w:pPr>
-      <w:r>
-        <w:t xml:space="preserve">5.3 Ingest path</w:t>
-      </w:r>
-    </w:p>
-    <w:p>
-      <w:pPr>
-        <w:pStyle w:val="FirstParagraph"/>
-      </w:pPr>
-      <w:r>
-        <w:t xml:space="preserve">The collector sits behind a private API Gateway. Alerts arrive over HTTPS from inside the network only. The collector writes to DynamoDB</w:t>
-      </w:r>
-      <w:r>
-        <w:t xml:space="preserve"> </w:t>
-      </w:r>
-      <w:r>
-        <w:rPr>
-          <w:bCs/>
-          <w:b/>
-        </w:rPr>
-        <w:t xml:space="preserve">before</w:t>
-      </w:r>
-      <w:r>
-        <w:t xml:space="preserve"> </w:t>
-      </w:r>
-      <w:r>
-        <w:t xml:space="preserve">queueing to SQS, so if the rule engine later fails the event still exists and can be replayed.</w:t>
-      </w:r>
-    </w:p>
-    <w:p>
-      <w:pPr>
-        <w:pStyle w:val="BodyText"/>
-      </w:pPr>
-      <w:r>
-        <w:t xml:space="preserve">The SQS queue between collector and rule engine provides three things: burst absorption during an attack, durability if the rule engine is unavailable, and a dead-letter queue where repeatedly failing events can be inspected rather than lost.</w:t>
-      </w:r>
-    </w:p>
-    <w:bookmarkEnd w:id="47"/>
-    <w:bookmarkStart w:id="48" w:name="serverless-justification-req-nca-p2-07"/>
-    <w:p>
-      <w:pPr>
-        <w:pStyle w:val="Heading2"/>
-      </w:pPr>
-      <w:r>
-        <w:t xml:space="preserve">5.4 Serverless justification (REQ-NCA-P2-07)</w:t>
-      </w:r>
-    </w:p>
-    <w:p>
-      <w:pPr>
-        <w:pStyle w:val="FirstParagraph"/>
-      </w:pPr>
-      <w:r>
-        <w:t xml:space="preserve">The requirement says serverless or containerised</w:t>
-      </w:r>
-      <w:r>
-        <w:t xml:space="preserve"> </w:t>
-      </w:r>
-      <w:r>
-        <w:t xml:space="preserve">“</w:t>
-      </w:r>
-      <w:r>
-        <w:t xml:space="preserve">where appropriate</w:t>
-      </w:r>
-      <w:r>
-        <w:t xml:space="preserve">”</w:t>
-      </w:r>
-      <w:r>
-        <w:t xml:space="preserve">. The judgement made here:</w:t>
-      </w:r>
-    </w:p>
-    <w:p>
-      <w:pPr>
-        <w:pStyle w:val="BodyText"/>
-      </w:pPr>
-      <w:r>
-        <w:rPr>
-          <w:bCs/>
-          <w:b/>
-        </w:rPr>
-        <w:t xml:space="preserve">Serverless (Lambda) for the SOAR pipeline.</w:t>
-      </w:r>
-      <w:r>
-        <w:t xml:space="preserve"> </w:t>
-      </w:r>
-      <w:r>
-        <w:t xml:space="preserve">Security alerts are bursty. Nothing for an hour, then forty in a minute during an attack. Holding a virtual machine idle for that pattern costs money continuously and still fails to absorb the burst. Lambda scales to the burst and costs nothing between events. Each function is small, single-purpose and stateless, which is exactly the shape the runtime suits.</w:t>
-      </w:r>
-    </w:p>
-    <w:p>
-      <w:pPr>
-        <w:pStyle w:val="BodyText"/>
-      </w:pPr>
-      <w:r>
-        <w:rPr>
-          <w:bCs/>
-          <w:b/>
-        </w:rPr>
-        <w:t xml:space="preserve">Containers (k3s) for observability.</w:t>
-      </w:r>
-      <w:r>
-        <w:t xml:space="preserve"> </w:t>
-      </w:r>
-      <w:r>
-        <w:t xml:space="preserve">Prometheus and Loki are long-running stateful services that hold data in memory and on disk between scrapes. They are a poor fit for a function runtime and a natural fit for a container platform.</w:t>
-      </w:r>
-    </w:p>
-    <w:p>
-      <w:pPr>
-        <w:pStyle w:val="BodyText"/>
-      </w:pPr>
-      <w:r>
-        <w:t xml:space="preserve">The functions run</w:t>
-      </w:r>
-      <w:r>
-        <w:t xml:space="preserve"> </w:t>
-      </w:r>
-      <w:r>
-        <w:rPr>
-          <w:bCs/>
-          <w:b/>
-        </w:rPr>
-        <w:t xml:space="preserve">outside</w:t>
-      </w:r>
-      <w:r>
-        <w:t xml:space="preserve"> </w:t>
-      </w:r>
-      <w:r>
-        <w:t xml:space="preserve">the VPC deliberately. They call only AWS APIs, never resources inside a subnet, so VPC attachment would add elastic network interface cold-start latency and a NAT dependency for no security gain.</w:t>
-      </w:r>
-    </w:p>
-    <w:bookmarkEnd w:id="48"/>
-    <w:bookmarkStart w:id="49" w:name="least-privilege"/>
-    <w:p>
-      <w:pPr>
-        <w:pStyle w:val="Heading2"/>
-      </w:pPr>
-      <w:r>
-        <w:t xml:space="preserve">5.5 Least privilege</w:t>
-      </w:r>
-    </w:p>
-    <w:p>
-      <w:pPr>
-        <w:pStyle w:val="FirstParagraph"/>
-      </w:pPr>
-      <w:r>
-        <w:t xml:space="preserve">Each of the six functions has its own IAM role. The most important is the rule engine’s, which grants DynamoDB read, SQS consume, and</w:t>
-      </w:r>
-      <w:r>
-        <w:t xml:space="preserve"> </w:t>
-      </w:r>
-      <w:r>
-        <w:rPr>
-          <w:rStyle w:val="VerbatimChar"/>
-        </w:rPr>
-        <w:t xml:space="preserve">events:PutEvents</w:t>
-      </w:r>
-      <w:r>
-        <w:t xml:space="preserve">, and nothing else.</w:t>
-      </w:r>
-      <w:r>
-        <w:t xml:space="preserve"> </w:t>
-      </w:r>
-      <w:r>
-        <w:rPr>
-          <w:bCs/>
-          <w:b/>
-        </w:rPr>
-        <w:t xml:space="preserve">It has no permission to modify any resource.</w:t>
-      </w:r>
-      <w:r>
-        <w:t xml:space="preserve"> </w:t>
-      </w:r>
-      <w:r>
-        <w:t xml:space="preserve">It can publish an event saying an address should be blocked; it cannot block anything. A flaw in rule evaluation therefore cannot damage the environment.</w:t>
-      </w:r>
-    </w:p>
-    <w:p>
-      <w:pPr>
-        <w:pStyle w:val="BodyText"/>
-      </w:pPr>
-      <w:r>
-        <w:t xml:space="preserve">The quarantine action illustrates defence in depth. The handler refuses to act on an instance without the tag</w:t>
-      </w:r>
-      <w:r>
-        <w:t xml:space="preserve"> </w:t>
-      </w:r>
-      <w:r>
-        <w:rPr>
-          <w:rStyle w:val="VerbatimChar"/>
-        </w:rPr>
-        <w:t xml:space="preserve">SOARable=true</w:t>
-      </w:r>
-      <w:r>
-        <w:t xml:space="preserve">, and refuses outright on anything tagged</w:t>
-      </w:r>
-      <w:r>
-        <w:t xml:space="preserve"> </w:t>
-      </w:r>
-      <w:r>
-        <w:rPr>
-          <w:rStyle w:val="VerbatimChar"/>
-        </w:rPr>
-        <w:t xml:space="preserve">Role=k3s-server</w:t>
-      </w:r>
-      <w:r>
-        <w:t xml:space="preserve"> </w:t>
-      </w:r>
-      <w:r>
-        <w:t xml:space="preserve">or</w:t>
-      </w:r>
-      <w:r>
-        <w:t xml:space="preserve"> </w:t>
-      </w:r>
-      <w:r>
-        <w:rPr>
-          <w:rStyle w:val="VerbatimChar"/>
-        </w:rPr>
-        <w:t xml:space="preserve">Role=hybrid-gateway</w:t>
-      </w:r>
-      <w:r>
-        <w:t xml:space="preserve"> </w:t>
-      </w:r>
-      <w:r>
-        <w:t xml:space="preserve">so the system cannot isolate itself. Independently, its IAM policy carries a condition on</w:t>
-      </w:r>
-      <w:r>
-        <w:t xml:space="preserve"> </w:t>
-      </w:r>
-      <w:r>
-        <w:rPr>
-          <w:rStyle w:val="VerbatimChar"/>
-        </w:rPr>
-        <w:t xml:space="preserve">aws:ResourceTag/SOARable</w:t>
-      </w:r>
-      <w:r>
-        <w:t xml:space="preserve">. If the code check were bypassed, the API call would still fail.</w:t>
-      </w:r>
-    </w:p>
-    <w:p>
-      <w:pPr>
-        <w:pStyle w:val="BodyText"/>
-      </w:pPr>
-      <w:r>
-        <w:t xml:space="preserve">Its permission on security groups is narrower still, it may attach only the quarantine group, and no other. The consequence is that this role can move a host</w:t>
-      </w:r>
-      <w:r>
-        <w:t xml:space="preserve"> </w:t>
-      </w:r>
-      <w:r>
-        <w:rPr>
-          <w:bCs/>
-          <w:b/>
-        </w:rPr>
-        <w:t xml:space="preserve">into</w:t>
-      </w:r>
-      <w:r>
-        <w:t xml:space="preserve"> </w:t>
-      </w:r>
-      <w:r>
-        <w:t xml:space="preserve">isolation and cannot move it out. Release is deliberately a human action, because deciding that a compromised host is safe to return to the network is a judgement, not an automation.</w:t>
-      </w:r>
-    </w:p>
-    <w:p>
-      <w:r>
-        <w:br w:type="page"/>
-      </w:r>
-    </w:p>
-    <w:bookmarkEnd w:id="49"/>
-    <w:bookmarkEnd w:id="50"/>
-    <w:bookmarkStart w:id="59" w:name="deployment-and-automation"/>
-    <w:p>
-      <w:pPr>
-        <w:pStyle w:val="Heading1"/>
-      </w:pPr>
-      <w:r>
-        <w:t xml:space="preserve">6. Deployment and automation</w:t>
-      </w:r>
-    </w:p>
-    <w:bookmarkStart w:id="51" w:name="infrastructure-as-code-req-nca-p2-10"/>
-    <w:p>
-      <w:pPr>
-        <w:pStyle w:val="Heading2"/>
-      </w:pPr>
-      <w:r>
-        <w:t xml:space="preserve">6.1 Infrastructure as Code (REQ-NCA-P2-10)</w:t>
-      </w:r>
-    </w:p>
-    <w:p>
-      <w:pPr>
-        <w:pStyle w:val="FirstParagraph"/>
-      </w:pPr>
-      <w:r>
-        <w:t xml:space="preserve">All cloud infrastructure is defined in Terraform: 20 configuration files, one reusable spoke VPC module, roughly 160 managed resources.</w:t>
-      </w:r>
-    </w:p>
-    <w:p>
-      <w:pPr>
-        <w:pStyle w:val="BodyText"/>
-      </w:pPr>
-      <w:r>
-        <w:t xml:space="preserve">State is stored in S3 with versioning and encryption enabled, and locked with a DynamoDB table. This was the first thing built, before any infrastructure, and it proved its worth: when an authentication token expired mid-apply and left roughly 90 resources created but unrecorded, the recovery was a single</w:t>
-      </w:r>
-      <w:r>
-        <w:t xml:space="preserve"> </w:t>
-      </w:r>
-      <w:r>
-        <w:rPr>
-          <w:rStyle w:val="VerbatimChar"/>
-        </w:rPr>
-        <w:t xml:space="preserve">terraform state push</w:t>
-      </w:r>
-      <w:r>
-        <w:t xml:space="preserve"> </w:t>
-      </w:r>
-      <w:r>
-        <w:t xml:space="preserve">rather than a manual reconciliation of the entire environment.</w:t>
-      </w:r>
-    </w:p>
-    <w:p>
-      <w:pPr>
-        <w:pStyle w:val="BodyText"/>
-      </w:pPr>
-      <w:r>
-        <w:t xml:space="preserve">The IaC is genuinely reproducing rather than merely descriptive. When the k3s node was found to have failed its bootstrap, the fix was</w:t>
-      </w:r>
-      <w:r>
-        <w:t xml:space="preserve"> </w:t>
-      </w:r>
-      <w:r>
-        <w:rPr>
-          <w:rStyle w:val="VerbatimChar"/>
-        </w:rPr>
-        <w:t xml:space="preserve">terraform taint</w:t>
-      </w:r>
-      <w:r>
-        <w:t xml:space="preserve"> </w:t>
-      </w:r>
-      <w:r>
-        <w:t xml:space="preserve">followed by</w:t>
-      </w:r>
-      <w:r>
-        <w:t xml:space="preserve"> </w:t>
-      </w:r>
-      <w:r>
-        <w:rPr>
-          <w:rStyle w:val="VerbatimChar"/>
-        </w:rPr>
-        <w:t xml:space="preserve">terraform apply</w:t>
-      </w:r>
-      <w:r>
-        <w:t xml:space="preserve">; the replacement node built itself from the same definition and came up healthy.</w:t>
-      </w:r>
-    </w:p>
-    <w:bookmarkEnd w:id="51"/>
-    <w:bookmarkStart w:id="58" w:name="X84e8fa2cec28c5a6ca850fb325cee2f916532f9"/>
-    <w:p>
-      <w:pPr>
-        <w:pStyle w:val="Heading2"/>
-      </w:pPr>
-      <w:r>
-        <w:t xml:space="preserve">6.2 DevOps platform and pipelines (REQ-NCA-P2-11, P2-12)</w:t>
-      </w:r>
-    </w:p>
-    <w:p>
-      <w:pPr>
-        <w:pStyle w:val="FirstParagraph"/>
-      </w:pPr>
-      <w:r>
-        <w:t xml:space="preserve">Source control and pipelines are on GitHub with GitHub Actions. All jobs run on a self-hosted runner, which is required rather than preferred: the Terraform state is in a private bucket, the k3s API has no public address, and the SOAR ingest endpoint is reachable only from inside the VPC. A cloud-hosted runner cannot reach any of them.</w:t>
-      </w:r>
-    </w:p>
-    <w:p>
-      <w:pPr>
-        <w:pStyle w:val="BodyText"/>
-      </w:pPr>
-      <w:r>
-        <w:t xml:space="preserve">The repository is organised so that each concern is separately reviewable:</w:t>
-      </w:r>
-    </w:p>
-    <w:tbl>
-      <w:tblPr>
-        <w:tblStyle w:val="Table"/>
-        <w:tblW w:type="pct" w:w="5000"/>
-        <w:tblLook w:firstRow="1" w:lastRow="0" w:firstColumn="0" w:lastColumn="0" w:noHBand="0" w:noVBand="0" w:val="0020"/>
-        <w:jc w:val="start"/>
-      </w:tblPr>
-      <w:tblGrid>
-        <w:gridCol w:w="3960"/>
-        <w:gridCol w:w="3960"/>
-      </w:tblGrid>
-      <w:tr>
-        <w:trPr>
-          <w:tblHeader w:val="true"/>
-        </w:trPr>
-        <w:tc>
-          <w:tcPr/>
-          <w:p>
-            <w:pPr>
-              <w:pStyle w:val="Compact"/>
-              <w:jc w:val="left"/>
-            </w:pPr>
-            <w:r>
-              <w:t xml:space="preserve">Path</w:t>
-            </w:r>
-          </w:p>
-        </w:tc>
-        <w:tc>
-          <w:tcPr/>
-          <w:p>
-            <w:pPr>
-              <w:pStyle w:val="Compact"/>
-              <w:jc w:val="left"/>
-            </w:pPr>
-            <w:r>
-              <w:t xml:space="preserve">Contents</w:t>
-            </w:r>
-          </w:p>
-        </w:tc>
-      </w:tr>
-      <w:tr>
-        <w:tc>
-          <w:tcPr/>
-          <w:p>
-            <w:pPr>
-              <w:pStyle w:val="Compact"/>
-              <w:jc w:val="left"/>
-            </w:pPr>
-            <w:r>
-              <w:rPr>
-                <w:rStyle w:val="VerbatimChar"/>
-              </w:rPr>
-              <w:t xml:space="preserve">terraform/</w:t>
-            </w:r>
-          </w:p>
-        </w:tc>
-        <w:tc>
-          <w:tcPr/>
-          <w:p>
-            <w:pPr>
-              <w:pStyle w:val="Compact"/>
-              <w:jc w:val="left"/>
-            </w:pPr>
-            <w:r>
-              <w:t xml:space="preserve">Infrastructure definitions and the reusable spoke module</w:t>
-            </w:r>
-          </w:p>
-        </w:tc>
-      </w:tr>
-      <w:tr>
-        <w:tc>
-          <w:tcPr/>
-          <w:p>
-            <w:pPr>
-              <w:pStyle w:val="Compact"/>
-              <w:jc w:val="left"/>
-            </w:pPr>
-            <w:r>
-              <w:rPr>
-                <w:rStyle w:val="VerbatimChar"/>
-              </w:rPr>
-              <w:t xml:space="preserve">soar/</w:t>
-            </w:r>
-          </w:p>
-        </w:tc>
-        <w:tc>
-          <w:tcPr/>
-          <w:p>
-            <w:pPr>
-              <w:pStyle w:val="Compact"/>
-              <w:jc w:val="left"/>
-            </w:pPr>
-            <w:r>
-              <w:t xml:space="preserve">Collector, rule engine, response actions, playbooks</w:t>
-            </w:r>
-          </w:p>
-        </w:tc>
-      </w:tr>
-      <w:tr>
-        <w:tc>
-          <w:tcPr/>
-          <w:p>
-            <w:pPr>
-              <w:pStyle w:val="Compact"/>
-              <w:jc w:val="left"/>
-            </w:pPr>
-            <w:r>
-              <w:rPr>
-                <w:rStyle w:val="VerbatimChar"/>
-              </w:rPr>
-              <w:t xml:space="preserve">soar/console/</w:t>
-            </w:r>
-          </w:p>
-        </w:tc>
-        <w:tc>
-          <w:tcPr/>
-          <w:p>
-            <w:pPr>
-              <w:pStyle w:val="Compact"/>
-              <w:jc w:val="left"/>
-            </w:pPr>
-            <w:r>
-              <w:t xml:space="preserve">Containerised read-only console and its Kubernetes manifests</w:t>
-            </w:r>
-          </w:p>
-        </w:tc>
-      </w:tr>
-      <w:tr>
-        <w:tc>
-          <w:tcPr/>
-          <w:p>
-            <w:pPr>
-              <w:pStyle w:val="Compact"/>
-              <w:jc w:val="left"/>
-            </w:pPr>
-            <w:r>
-              <w:rPr>
-                <w:rStyle w:val="VerbatimChar"/>
-              </w:rPr>
-              <w:t xml:space="preserve">soar/tests/</w:t>
-            </w:r>
-          </w:p>
-        </w:tc>
-        <w:tc>
-          <w:tcPr/>
-          <w:p>
-            <w:pPr>
-              <w:pStyle w:val="Compact"/>
-              <w:jc w:val="left"/>
-            </w:pPr>
-            <w:r>
-              <w:t xml:space="preserve">50 unit tests, no external dependencies</w:t>
-            </w:r>
-          </w:p>
-        </w:tc>
-      </w:tr>
-      <w:tr>
-        <w:tc>
-          <w:tcPr/>
-          <w:p>
-            <w:pPr>
-              <w:pStyle w:val="Compact"/>
-              <w:jc w:val="left"/>
-            </w:pPr>
-            <w:r>
-              <w:rPr>
-                <w:rStyle w:val="VerbatimChar"/>
-              </w:rPr>
-              <w:t xml:space="preserve">observability/</w:t>
-            </w:r>
-          </w:p>
-        </w:tc>
-        <w:tc>
-          <w:tcPr/>
-          <w:p>
-            <w:pPr>
-              <w:pStyle w:val="Compact"/>
-              <w:jc w:val="left"/>
-            </w:pPr>
-            <w:r>
-              <w:t xml:space="preserve">Monitoring stack deployment</w:t>
-            </w:r>
-          </w:p>
-        </w:tc>
-      </w:tr>
-      <w:tr>
-        <w:tc>
-          <w:tcPr/>
-          <w:p>
-            <w:pPr>
-              <w:pStyle w:val="Compact"/>
-              <w:jc w:val="left"/>
-            </w:pPr>
-            <w:r>
-              <w:rPr>
-                <w:rStyle w:val="VerbatimChar"/>
-              </w:rPr>
-              <w:t xml:space="preserve">scripts/</w:t>
-            </w:r>
-          </w:p>
-        </w:tc>
-        <w:tc>
-          <w:tcPr/>
-          <w:p>
-            <w:pPr>
-              <w:pStyle w:val="Compact"/>
-              <w:jc w:val="left"/>
-            </w:pPr>
-            <w:r>
-              <w:t xml:space="preserve">End-to-end test and operational tooling</w:t>
-            </w:r>
-          </w:p>
-        </w:tc>
-      </w:tr>
-      <w:tr>
-        <w:tc>
-          <w:tcPr/>
-          <w:p>
-            <w:pPr>
-              <w:pStyle w:val="Compact"/>
-              <w:jc w:val="left"/>
-            </w:pPr>
-            <w:r>
-              <w:rPr>
-                <w:rStyle w:val="VerbatimChar"/>
-              </w:rPr>
-              <w:t xml:space="preserve">docs/</w:t>
-            </w:r>
-          </w:p>
-        </w:tc>
-        <w:tc>
-          <w:tcPr/>
-          <w:p>
-            <w:pPr>
-              <w:pStyle w:val="Compact"/>
-              <w:jc w:val="left"/>
-            </w:pPr>
-            <w:r>
-              <w:t xml:space="preserve">This documentation set</w:t>
-            </w:r>
-          </w:p>
-        </w:tc>
-      </w:tr>
-    </w:tbl>
-    <w:bookmarkStart w:id="52" w:name="the-three-pipelines"/>
-    <w:p>
-      <w:pPr>
-        <w:pStyle w:val="Heading3"/>
-      </w:pPr>
-      <w:r>
-        <w:t xml:space="preserve">The three pipelines</w:t>
+        <w:t xml:space="preserve">Three sources feed the pipeline, and the collector normalises all of them into one schema.</w:t>
       </w:r>
     </w:p>
     <w:tbl>
@@ -5261,61 +4413,1136 @@
               <w:jc w:val="left"/>
             </w:pPr>
             <w:r>
-              <w:t xml:space="preserve">Workflow</w:t>
-            </w:r>
-          </w:p>
-        </w:tc>
-        <w:tc>
-          <w:tcPr/>
-          <w:p>
-            <w:pPr>
-              <w:pStyle w:val="Compact"/>
-              <w:jc w:val="left"/>
-            </w:pPr>
-            <w:r>
-              <w:t xml:space="preserve">Trigger</w:t>
-            </w:r>
-          </w:p>
-        </w:tc>
-        <w:tc>
-          <w:tcPr/>
-          <w:p>
-            <w:pPr>
-              <w:pStyle w:val="Compact"/>
-              <w:jc w:val="left"/>
-            </w:pPr>
-            <w:r>
-              <w:t xml:space="preserve">Responsibility</w:t>
-            </w:r>
-          </w:p>
-        </w:tc>
-      </w:tr>
-      <w:tr>
-        <w:tc>
-          <w:tcPr/>
-          <w:p>
-            <w:pPr>
-              <w:pStyle w:val="Compact"/>
-              <w:jc w:val="left"/>
-            </w:pPr>
-            <w:r>
-              <w:t xml:space="preserve">SOAR CI</w:t>
-            </w:r>
-          </w:p>
-        </w:tc>
-        <w:tc>
-          <w:tcPr/>
-          <w:p>
-            <w:pPr>
-              <w:pStyle w:val="Compact"/>
-              <w:jc w:val="left"/>
-            </w:pPr>
-            <w:r>
-              <w:t xml:space="preserve">Any change under</w:t>
+              <w:t xml:space="preserve">Source</w:t>
+            </w:r>
+          </w:p>
+        </w:tc>
+        <w:tc>
+          <w:tcPr/>
+          <w:p>
+            <w:pPr>
+              <w:pStyle w:val="Compact"/>
+              <w:jc w:val="left"/>
+            </w:pPr>
+            <w:r>
+              <w:t xml:space="preserve">What it reports</w:t>
+            </w:r>
+          </w:p>
+        </w:tc>
+        <w:tc>
+          <w:tcPr/>
+          <w:p>
+            <w:pPr>
+              <w:pStyle w:val="Compact"/>
+              <w:jc w:val="left"/>
+            </w:pPr>
+            <w:r>
+              <w:t xml:space="preserve">How it reaches the collector</w:t>
+            </w:r>
+          </w:p>
+        </w:tc>
+      </w:tr>
+      <w:tr>
+        <w:tc>
+          <w:tcPr/>
+          <w:p>
+            <w:pPr>
+              <w:pStyle w:val="Compact"/>
+              <w:jc w:val="left"/>
+            </w:pPr>
+            <w:r>
+              <w:t xml:space="preserve">Simulated on-premises server</w:t>
+            </w:r>
+          </w:p>
+        </w:tc>
+        <w:tc>
+          <w:tcPr/>
+          <w:p>
+            <w:pPr>
+              <w:pStyle w:val="Compact"/>
+              <w:jc w:val="left"/>
+            </w:pPr>
+            <w:r>
+              <w:t xml:space="preserve">Failed SSH authentication, privilege escalation attempts, break-in warnings</w:t>
+            </w:r>
+          </w:p>
+        </w:tc>
+        <w:tc>
+          <w:tcPr/>
+          <w:p>
+            <w:pPr>
+              <w:pStyle w:val="Compact"/>
+              <w:jc w:val="left"/>
+            </w:pPr>
+            <w:r>
+              <w:t xml:space="preserve">A forwarder agent tails</w:t>
             </w:r>
             <w:r>
               <w:t xml:space="preserve"> </w:t>
             </w:r>
+            <w:r>
+              <w:rPr>
+                <w:rStyle w:val="VerbatimChar"/>
+              </w:rPr>
+              <w:t xml:space="preserve">/var/log/auth.log</w:t>
+            </w:r>
+            <w:r>
+              <w:t xml:space="preserve"> </w:t>
+            </w:r>
+            <w:r>
+              <w:t xml:space="preserve">and posts to the private API</w:t>
+            </w:r>
+          </w:p>
+        </w:tc>
+      </w:tr>
+      <w:tr>
+        <w:tc>
+          <w:tcPr/>
+          <w:p>
+            <w:pPr>
+              <w:pStyle w:val="Compact"/>
+              <w:jc w:val="left"/>
+            </w:pPr>
+            <w:r>
+              <w:t xml:space="preserve">Prometheus Alertmanager</w:t>
+            </w:r>
+          </w:p>
+        </w:tc>
+        <w:tc>
+          <w:tcPr/>
+          <w:p>
+            <w:pPr>
+              <w:pStyle w:val="Compact"/>
+              <w:jc w:val="left"/>
+            </w:pPr>
+            <w:r>
+              <w:t xml:space="preserve">Availability, resource and SOAR-health alerts from the cloud estate</w:t>
+            </w:r>
+          </w:p>
+        </w:tc>
+        <w:tc>
+          <w:tcPr/>
+          <w:p>
+            <w:pPr>
+              <w:pStyle w:val="Compact"/>
+              <w:jc w:val="left"/>
+            </w:pPr>
+            <w:r>
+              <w:t xml:space="preserve">Webhook receiver pointed at the same endpoint</w:t>
+            </w:r>
+          </w:p>
+        </w:tc>
+      </w:tr>
+      <w:tr>
+        <w:tc>
+          <w:tcPr/>
+          <w:p>
+            <w:pPr>
+              <w:pStyle w:val="Compact"/>
+              <w:jc w:val="left"/>
+            </w:pPr>
+            <w:r>
+              <w:t xml:space="preserve">CloudWatch alarms</w:t>
+            </w:r>
+          </w:p>
+        </w:tc>
+        <w:tc>
+          <w:tcPr/>
+          <w:p>
+            <w:pPr>
+              <w:pStyle w:val="Compact"/>
+              <w:jc w:val="left"/>
+            </w:pPr>
+            <w:r>
+              <w:t xml:space="preserve">Managed service conditions</w:t>
+            </w:r>
+          </w:p>
+        </w:tc>
+        <w:tc>
+          <w:tcPr/>
+          <w:p>
+            <w:pPr>
+              <w:pStyle w:val="Compact"/>
+              <w:jc w:val="left"/>
+            </w:pPr>
+            <w:r>
+              <w:t xml:space="preserve">SNS to the same endpoint</w:t>
+            </w:r>
+          </w:p>
+        </w:tc>
+      </w:tr>
+    </w:tbl>
+    <w:p>
+      <w:pPr>
+        <w:pStyle w:val="BodyText"/>
+      </w:pPr>
+      <w:r>
+        <w:t xml:space="preserve">The on-premises source is worth describing precisely, because it is the one the requirement names first and the one most easily faked.</w:t>
+      </w:r>
+    </w:p>
+    <w:p>
+      <w:pPr>
+        <w:pStyle w:val="BodyText"/>
+      </w:pPr>
+      <w:r>
+        <w:rPr>
+          <w:rStyle w:val="VerbatimChar"/>
+        </w:rPr>
+        <w:t xml:space="preserve">corp-server</w:t>
+      </w:r>
+      <w:r>
+        <w:t xml:space="preserve"> </w:t>
+      </w:r>
+      <w:r>
+        <w:t xml:space="preserve">is an Ubuntu host running rsyslog, node_exporter, and a small forwarder written against the standard library only. The forwarder follows the authentication log, matches the four patterns worth acting on, and posts matching lines. It keeps a byte offset on disk so a restart does not replay the log, treats a shrinking file as rotation, and does not advance past a line it failed to deliver.</w:t>
+      </w:r>
+    </w:p>
+    <w:p>
+      <w:pPr>
+        <w:pStyle w:val="BodyText"/>
+      </w:pPr>
+      <w:r>
+        <w:t xml:space="preserve">Nothing about the events it produces is synthetic. When the demonstration runs failed logins against that host, sshd writes the failures itself and the agent reads what sshd wrote. The only simulated aspect is that the host is an EC2 instance rather than hardware in a server room, which the assignment permits.</w:t>
+      </w:r>
+    </w:p>
+    <w:p>
+      <w:pPr>
+        <w:pStyle w:val="BodyText"/>
+      </w:pPr>
+      <w:r>
+        <w:t xml:space="preserve">It is deliberately not tagged</w:t>
+      </w:r>
+      <w:r>
+        <w:t xml:space="preserve"> </w:t>
+      </w:r>
+      <w:r>
+        <w:rPr>
+          <w:rStyle w:val="VerbatimChar"/>
+        </w:rPr>
+        <w:t xml:space="preserve">SOARable</w:t>
+      </w:r>
+      <w:r>
+        <w:t xml:space="preserve">. Quarantining the machine that reports intrusions would silence the alarm rather than contain the intruder, and the tag is the mechanism that prevents it.</w:t>
+      </w:r>
+    </w:p>
+    <w:bookmarkEnd w:id="48"/>
+    <w:bookmarkStart w:id="49" w:name="event-normalisation"/>
+    <w:p>
+      <w:pPr>
+        <w:pStyle w:val="Heading2"/>
+      </w:pPr>
+      <w:r>
+        <w:t xml:space="preserve">5.3 Event normalisation</w:t>
+      </w:r>
+    </w:p>
+    <w:p>
+      <w:pPr>
+        <w:pStyle w:val="FirstParagraph"/>
+      </w:pPr>
+      <w:r>
+        <w:t xml:space="preserve">Each source speaks a different format. The collector normalises all of them into one internal schema so the rule engine never needs to know where an event came from:</w:t>
+      </w:r>
+    </w:p>
+    <w:p>
+      <w:pPr>
+        <w:pStyle w:val="SourceCode"/>
+      </w:pPr>
+      <w:r>
+        <w:rPr>
+          <w:rStyle w:val="FunctionTok"/>
+        </w:rPr>
+        <w:t xml:space="preserve">{</w:t>
+      </w:r>
+      <w:r>
+        <w:br/>
+      </w:r>
+      <w:r>
+        <w:rPr>
+          <w:rStyle w:val="NormalTok"/>
+        </w:rPr>
+        <w:t xml:space="preserve"> </w:t>
+      </w:r>
+      <w:r>
+        <w:rPr>
+          <w:rStyle w:val="DataTypeTok"/>
+        </w:rPr>
+        <w:t xml:space="preserve">"event_id"</w:t>
+      </w:r>
+      <w:r>
+        <w:rPr>
+          <w:rStyle w:val="FunctionTok"/>
+        </w:rPr>
+        <w:t xml:space="preserve">:</w:t>
+      </w:r>
+      <w:r>
+        <w:rPr>
+          <w:rStyle w:val="NormalTok"/>
+        </w:rPr>
+        <w:t xml:space="preserve"> </w:t>
+      </w:r>
+      <w:r>
+        <w:rPr>
+          <w:rStyle w:val="StringTok"/>
+        </w:rPr>
+        <w:t xml:space="preserve">"uuid"</w:t>
+      </w:r>
+      <w:r>
+        <w:rPr>
+          <w:rStyle w:val="FunctionTok"/>
+        </w:rPr>
+        <w:t xml:space="preserve">,</w:t>
+      </w:r>
+      <w:r>
+        <w:br/>
+      </w:r>
+      <w:r>
+        <w:rPr>
+          <w:rStyle w:val="NormalTok"/>
+        </w:rPr>
+        <w:t xml:space="preserve"> </w:t>
+      </w:r>
+      <w:r>
+        <w:rPr>
+          <w:rStyle w:val="DataTypeTok"/>
+        </w:rPr>
+        <w:t xml:space="preserve">"received_at"</w:t>
+      </w:r>
+      <w:r>
+        <w:rPr>
+          <w:rStyle w:val="FunctionTok"/>
+        </w:rPr>
+        <w:t xml:space="preserve">:</w:t>
+      </w:r>
+      <w:r>
+        <w:rPr>
+          <w:rStyle w:val="NormalTok"/>
+        </w:rPr>
+        <w:t xml:space="preserve"> </w:t>
+      </w:r>
+      <w:r>
+        <w:rPr>
+          <w:rStyle w:val="StringTok"/>
+        </w:rPr>
+        <w:t xml:space="preserve">"ISO-8601"</w:t>
+      </w:r>
+      <w:r>
+        <w:rPr>
+          <w:rStyle w:val="FunctionTok"/>
+        </w:rPr>
+        <w:t xml:space="preserve">,</w:t>
+      </w:r>
+      <w:r>
+        <w:br/>
+      </w:r>
+      <w:r>
+        <w:rPr>
+          <w:rStyle w:val="NormalTok"/>
+        </w:rPr>
+        <w:t xml:space="preserve"> </w:t>
+      </w:r>
+      <w:r>
+        <w:rPr>
+          <w:rStyle w:val="DataTypeTok"/>
+        </w:rPr>
+        <w:t xml:space="preserve">"source"</w:t>
+      </w:r>
+      <w:r>
+        <w:rPr>
+          <w:rStyle w:val="FunctionTok"/>
+        </w:rPr>
+        <w:t xml:space="preserve">:</w:t>
+      </w:r>
+      <w:r>
+        <w:rPr>
+          <w:rStyle w:val="NormalTok"/>
+        </w:rPr>
+        <w:t xml:space="preserve"> </w:t>
+      </w:r>
+      <w:r>
+        <w:rPr>
+          <w:rStyle w:val="StringTok"/>
+        </w:rPr>
+        <w:t xml:space="preserve">"alertmanager | syslog | cloudwatch | direct"</w:t>
+      </w:r>
+      <w:r>
+        <w:rPr>
+          <w:rStyle w:val="FunctionTok"/>
+        </w:rPr>
+        <w:t xml:space="preserve">,</w:t>
+      </w:r>
+      <w:r>
+        <w:br/>
+      </w:r>
+      <w:r>
+        <w:rPr>
+          <w:rStyle w:val="NormalTok"/>
+        </w:rPr>
+        <w:t xml:space="preserve"> </w:t>
+      </w:r>
+      <w:r>
+        <w:rPr>
+          <w:rStyle w:val="DataTypeTok"/>
+        </w:rPr>
+        <w:t xml:space="preserve">"event_type"</w:t>
+      </w:r>
+      <w:r>
+        <w:rPr>
+          <w:rStyle w:val="FunctionTok"/>
+        </w:rPr>
+        <w:t xml:space="preserve">:</w:t>
+      </w:r>
+      <w:r>
+        <w:rPr>
+          <w:rStyle w:val="NormalTok"/>
+        </w:rPr>
+        <w:t xml:space="preserve"> </w:t>
+      </w:r>
+      <w:r>
+        <w:rPr>
+          <w:rStyle w:val="StringTok"/>
+        </w:rPr>
+        <w:t xml:space="preserve">"ssh_auth_failure"</w:t>
+      </w:r>
+      <w:r>
+        <w:rPr>
+          <w:rStyle w:val="FunctionTok"/>
+        </w:rPr>
+        <w:t xml:space="preserve">,</w:t>
+      </w:r>
+      <w:r>
+        <w:br/>
+      </w:r>
+      <w:r>
+        <w:rPr>
+          <w:rStyle w:val="NormalTok"/>
+        </w:rPr>
+        <w:t xml:space="preserve"> </w:t>
+      </w:r>
+      <w:r>
+        <w:rPr>
+          <w:rStyle w:val="DataTypeTok"/>
+        </w:rPr>
+        <w:t xml:space="preserve">"severity"</w:t>
+      </w:r>
+      <w:r>
+        <w:rPr>
+          <w:rStyle w:val="FunctionTok"/>
+        </w:rPr>
+        <w:t xml:space="preserve">:</w:t>
+      </w:r>
+      <w:r>
+        <w:rPr>
+          <w:rStyle w:val="NormalTok"/>
+        </w:rPr>
+        <w:t xml:space="preserve"> </w:t>
+      </w:r>
+      <w:r>
+        <w:rPr>
+          <w:rStyle w:val="StringTok"/>
+        </w:rPr>
+        <w:t xml:space="preserve">"critical | high | medium | low"</w:t>
+      </w:r>
+      <w:r>
+        <w:rPr>
+          <w:rStyle w:val="FunctionTok"/>
+        </w:rPr>
+        <w:t xml:space="preserve">,</w:t>
+      </w:r>
+      <w:r>
+        <w:br/>
+      </w:r>
+      <w:r>
+        <w:rPr>
+          <w:rStyle w:val="NormalTok"/>
+        </w:rPr>
+        <w:t xml:space="preserve"> </w:t>
+      </w:r>
+      <w:r>
+        <w:rPr>
+          <w:rStyle w:val="DataTypeTok"/>
+        </w:rPr>
+        <w:t xml:space="preserve">"source_ip"</w:t>
+      </w:r>
+      <w:r>
+        <w:rPr>
+          <w:rStyle w:val="FunctionTok"/>
+        </w:rPr>
+        <w:t xml:space="preserve">:</w:t>
+      </w:r>
+      <w:r>
+        <w:rPr>
+          <w:rStyle w:val="NormalTok"/>
+        </w:rPr>
+        <w:t xml:space="preserve"> </w:t>
+      </w:r>
+      <w:r>
+        <w:rPr>
+          <w:rStyle w:val="StringTok"/>
+        </w:rPr>
+        <w:t xml:space="preserve">"203.0.113.66"</w:t>
+      </w:r>
+      <w:r>
+        <w:rPr>
+          <w:rStyle w:val="FunctionTok"/>
+        </w:rPr>
+        <w:t xml:space="preserve">,</w:t>
+      </w:r>
+      <w:r>
+        <w:br/>
+      </w:r>
+      <w:r>
+        <w:rPr>
+          <w:rStyle w:val="NormalTok"/>
+        </w:rPr>
+        <w:t xml:space="preserve"> </w:t>
+      </w:r>
+      <w:r>
+        <w:rPr>
+          <w:rStyle w:val="DataTypeTok"/>
+        </w:rPr>
+        <w:t xml:space="preserve">"target_host"</w:t>
+      </w:r>
+      <w:r>
+        <w:rPr>
+          <w:rStyle w:val="FunctionTok"/>
+        </w:rPr>
+        <w:t xml:space="preserve">:</w:t>
+      </w:r>
+      <w:r>
+        <w:rPr>
+          <w:rStyle w:val="NormalTok"/>
+        </w:rPr>
+        <w:t xml:space="preserve"> </w:t>
+      </w:r>
+      <w:r>
+        <w:rPr>
+          <w:rStyle w:val="StringTok"/>
+        </w:rPr>
+        <w:t xml:space="preserve">"corp-server.innovatech.internal"</w:t>
+      </w:r>
+      <w:r>
+        <w:rPr>
+          <w:rStyle w:val="FunctionTok"/>
+        </w:rPr>
+        <w:t xml:space="preserve">,</w:t>
+      </w:r>
+      <w:r>
+        <w:br/>
+      </w:r>
+      <w:r>
+        <w:rPr>
+          <w:rStyle w:val="NormalTok"/>
+        </w:rPr>
+        <w:t xml:space="preserve"> </w:t>
+      </w:r>
+      <w:r>
+        <w:rPr>
+          <w:rStyle w:val="DataTypeTok"/>
+        </w:rPr>
+        <w:t xml:space="preserve">"target_instance_id"</w:t>
+      </w:r>
+      <w:r>
+        <w:rPr>
+          <w:rStyle w:val="FunctionTok"/>
+        </w:rPr>
+        <w:t xml:space="preserve">:</w:t>
+      </w:r>
+      <w:r>
+        <w:rPr>
+          <w:rStyle w:val="NormalTok"/>
+        </w:rPr>
+        <w:t xml:space="preserve"> </w:t>
+      </w:r>
+      <w:r>
+        <w:rPr>
+          <w:rStyle w:val="StringTok"/>
+        </w:rPr>
+        <w:t xml:space="preserve">"i-049e95348a865e18d"</w:t>
+      </w:r>
+      <w:r>
+        <w:rPr>
+          <w:rStyle w:val="FunctionTok"/>
+        </w:rPr>
+        <w:t xml:space="preserve">,</w:t>
+      </w:r>
+      <w:r>
+        <w:br/>
+      </w:r>
+      <w:r>
+        <w:rPr>
+          <w:rStyle w:val="NormalTok"/>
+        </w:rPr>
+        <w:t xml:space="preserve"> </w:t>
+      </w:r>
+      <w:r>
+        <w:rPr>
+          <w:rStyle w:val="DataTypeTok"/>
+        </w:rPr>
+        <w:t xml:space="preserve">"description"</w:t>
+      </w:r>
+      <w:r>
+        <w:rPr>
+          <w:rStyle w:val="FunctionTok"/>
+        </w:rPr>
+        <w:t xml:space="preserve">:</w:t>
+      </w:r>
+      <w:r>
+        <w:rPr>
+          <w:rStyle w:val="NormalTok"/>
+        </w:rPr>
+        <w:t xml:space="preserve"> </w:t>
+      </w:r>
+      <w:r>
+        <w:rPr>
+          <w:rStyle w:val="StringTok"/>
+        </w:rPr>
+        <w:t xml:space="preserve">"..."</w:t>
+      </w:r>
+      <w:r>
+        <w:rPr>
+          <w:rStyle w:val="FunctionTok"/>
+        </w:rPr>
+        <w:t xml:space="preserve">,</w:t>
+      </w:r>
+      <w:r>
+        <w:br/>
+      </w:r>
+      <w:r>
+        <w:rPr>
+          <w:rStyle w:val="NormalTok"/>
+        </w:rPr>
+        <w:t xml:space="preserve"> </w:t>
+      </w:r>
+      <w:r>
+        <w:rPr>
+          <w:rStyle w:val="DataTypeTok"/>
+        </w:rPr>
+        <w:t xml:space="preserve">"raw"</w:t>
+      </w:r>
+      <w:r>
+        <w:rPr>
+          <w:rStyle w:val="FunctionTok"/>
+        </w:rPr>
+        <w:t xml:space="preserve">:</w:t>
+      </w:r>
+      <w:r>
+        <w:rPr>
+          <w:rStyle w:val="NormalTok"/>
+        </w:rPr>
+        <w:t xml:space="preserve"> </w:t>
+      </w:r>
+      <w:r>
+        <w:rPr>
+          <w:rStyle w:val="FunctionTok"/>
+        </w:rPr>
+        <w:t xml:space="preserve">{</w:t>
+      </w:r>
+      <w:r>
+        <w:rPr>
+          <w:rStyle w:val="NormalTok"/>
+        </w:rPr>
+        <w:t xml:space="preserve"> </w:t>
+      </w:r>
+      <w:r>
+        <w:rPr>
+          <w:rStyle w:val="FunctionTok"/>
+        </w:rPr>
+        <w:t xml:space="preserve">}</w:t>
+      </w:r>
+      <w:r>
+        <w:br/>
+      </w:r>
+      <w:r>
+        <w:rPr>
+          <w:rStyle w:val="FunctionTok"/>
+        </w:rPr>
+        <w:t xml:space="preserve">}</w:t>
+      </w:r>
+    </w:p>
+    <w:p>
+      <w:pPr>
+        <w:pStyle w:val="FirstParagraph"/>
+      </w:pPr>
+      <w:r>
+        <w:t xml:space="preserve">Adding a fifth source means adding one parser in the collector and changing nothing downstream. Unrecognised syslog lines are stored as</w:t>
+      </w:r>
+      <w:r>
+        <w:t xml:space="preserve"> </w:t>
+      </w:r>
+      <w:r>
+        <w:rPr>
+          <w:rStyle w:val="VerbatimChar"/>
+        </w:rPr>
+        <w:t xml:space="preserve">syslog_generic</w:t>
+      </w:r>
+      <w:r>
+        <w:t xml:space="preserve"> </w:t>
+      </w:r>
+      <w:r>
+        <w:t xml:space="preserve">rather than discarded. An event nobody has written a rule for yet is a gap in coverage, not noise.</w:t>
+      </w:r>
+    </w:p>
+    <w:bookmarkEnd w:id="49"/>
+    <w:bookmarkStart w:id="50" w:name="ingest-path"/>
+    <w:p>
+      <w:pPr>
+        <w:pStyle w:val="Heading2"/>
+      </w:pPr>
+      <w:r>
+        <w:t xml:space="preserve">5.4 Ingest path</w:t>
+      </w:r>
+    </w:p>
+    <w:p>
+      <w:pPr>
+        <w:pStyle w:val="FirstParagraph"/>
+      </w:pPr>
+      <w:r>
+        <w:t xml:space="preserve">The collector sits behind a private API Gateway. Alerts arrive over HTTPS from inside the network only. The collector writes to DynamoDB</w:t>
+      </w:r>
+      <w:r>
+        <w:t xml:space="preserve"> </w:t>
+      </w:r>
+      <w:r>
+        <w:rPr>
+          <w:bCs/>
+          <w:b/>
+        </w:rPr>
+        <w:t xml:space="preserve">before</w:t>
+      </w:r>
+      <w:r>
+        <w:t xml:space="preserve"> </w:t>
+      </w:r>
+      <w:r>
+        <w:t xml:space="preserve">queueing to SQS, so if the rule engine later fails the event still exists and can be replayed.</w:t>
+      </w:r>
+    </w:p>
+    <w:p>
+      <w:pPr>
+        <w:pStyle w:val="BodyText"/>
+      </w:pPr>
+      <w:r>
+        <w:t xml:space="preserve">The SQS queue between collector and rule engine provides three things: burst absorption during an attack, durability if the rule engine is unavailable, and a dead-letter queue where repeatedly failing events can be inspected rather than lost.</w:t>
+      </w:r>
+    </w:p>
+    <w:bookmarkEnd w:id="50"/>
+    <w:bookmarkStart w:id="51" w:name="serverless-justification-req-nca-p2-07"/>
+    <w:p>
+      <w:pPr>
+        <w:pStyle w:val="Heading2"/>
+      </w:pPr>
+      <w:r>
+        <w:t xml:space="preserve">5.5 Serverless justification (REQ-NCA-P2-07)</w:t>
+      </w:r>
+    </w:p>
+    <w:p>
+      <w:pPr>
+        <w:pStyle w:val="FirstParagraph"/>
+      </w:pPr>
+      <w:r>
+        <w:t xml:space="preserve">The requirement says serverless or containerised</w:t>
+      </w:r>
+      <w:r>
+        <w:t xml:space="preserve"> </w:t>
+      </w:r>
+      <w:r>
+        <w:t xml:space="preserve">“</w:t>
+      </w:r>
+      <w:r>
+        <w:t xml:space="preserve">where appropriate</w:t>
+      </w:r>
+      <w:r>
+        <w:t xml:space="preserve">”</w:t>
+      </w:r>
+      <w:r>
+        <w:t xml:space="preserve">. The judgement made here:</w:t>
+      </w:r>
+    </w:p>
+    <w:p>
+      <w:pPr>
+        <w:pStyle w:val="BodyText"/>
+      </w:pPr>
+      <w:r>
+        <w:rPr>
+          <w:bCs/>
+          <w:b/>
+        </w:rPr>
+        <w:t xml:space="preserve">Serverless (Lambda) for the SOAR pipeline.</w:t>
+      </w:r>
+      <w:r>
+        <w:t xml:space="preserve"> </w:t>
+      </w:r>
+      <w:r>
+        <w:t xml:space="preserve">Security alerts are bursty. Nothing for an hour, then forty in a minute during an attack. Holding a virtual machine idle for that pattern costs money continuously and still fails to absorb the burst. Lambda scales to the burst and costs nothing between events. Each function is small, single-purpose and stateless, which is exactly the shape the runtime suits.</w:t>
+      </w:r>
+    </w:p>
+    <w:p>
+      <w:pPr>
+        <w:pStyle w:val="BodyText"/>
+      </w:pPr>
+      <w:r>
+        <w:rPr>
+          <w:bCs/>
+          <w:b/>
+        </w:rPr>
+        <w:t xml:space="preserve">Containers (k3s) for observability.</w:t>
+      </w:r>
+      <w:r>
+        <w:t xml:space="preserve"> </w:t>
+      </w:r>
+      <w:r>
+        <w:t xml:space="preserve">Prometheus and Loki are long-running stateful services that hold data in memory and on disk between scrapes. They are a poor fit for a function runtime and a natural fit for a container platform.</w:t>
+      </w:r>
+    </w:p>
+    <w:p>
+      <w:pPr>
+        <w:pStyle w:val="BodyText"/>
+      </w:pPr>
+      <w:r>
+        <w:t xml:space="preserve">The functions run</w:t>
+      </w:r>
+      <w:r>
+        <w:t xml:space="preserve"> </w:t>
+      </w:r>
+      <w:r>
+        <w:rPr>
+          <w:bCs/>
+          <w:b/>
+        </w:rPr>
+        <w:t xml:space="preserve">outside</w:t>
+      </w:r>
+      <w:r>
+        <w:t xml:space="preserve"> </w:t>
+      </w:r>
+      <w:r>
+        <w:t xml:space="preserve">the VPC deliberately. They call only AWS APIs, never resources inside a subnet, so VPC attachment would add elastic network interface cold-start latency and a NAT dependency for no security gain.</w:t>
+      </w:r>
+    </w:p>
+    <w:bookmarkEnd w:id="51"/>
+    <w:bookmarkStart w:id="52" w:name="least-privilege"/>
+    <w:p>
+      <w:pPr>
+        <w:pStyle w:val="Heading2"/>
+      </w:pPr>
+      <w:r>
+        <w:t xml:space="preserve">5.6 Least privilege</w:t>
+      </w:r>
+    </w:p>
+    <w:p>
+      <w:pPr>
+        <w:pStyle w:val="FirstParagraph"/>
+      </w:pPr>
+      <w:r>
+        <w:t xml:space="preserve">Each of the six functions has its own IAM role. The most important is the rule engine’s, which grants DynamoDB read, SQS consume, and</w:t>
+      </w:r>
+      <w:r>
+        <w:t xml:space="preserve"> </w:t>
+      </w:r>
+      <w:r>
+        <w:rPr>
+          <w:rStyle w:val="VerbatimChar"/>
+        </w:rPr>
+        <w:t xml:space="preserve">events:PutEvents</w:t>
+      </w:r>
+      <w:r>
+        <w:t xml:space="preserve">, and nothing else.</w:t>
+      </w:r>
+      <w:r>
+        <w:t xml:space="preserve"> </w:t>
+      </w:r>
+      <w:r>
+        <w:rPr>
+          <w:bCs/>
+          <w:b/>
+        </w:rPr>
+        <w:t xml:space="preserve">It has no permission to modify any resource.</w:t>
+      </w:r>
+      <w:r>
+        <w:t xml:space="preserve"> </w:t>
+      </w:r>
+      <w:r>
+        <w:t xml:space="preserve">It can publish an event saying an address should be blocked; it cannot block anything. A flaw in rule evaluation therefore cannot damage the environment.</w:t>
+      </w:r>
+    </w:p>
+    <w:p>
+      <w:pPr>
+        <w:pStyle w:val="BodyText"/>
+      </w:pPr>
+      <w:r>
+        <w:t xml:space="preserve">The quarantine action illustrates defence in depth. The handler refuses to act on an instance without the tag</w:t>
+      </w:r>
+      <w:r>
+        <w:t xml:space="preserve"> </w:t>
+      </w:r>
+      <w:r>
+        <w:rPr>
+          <w:rStyle w:val="VerbatimChar"/>
+        </w:rPr>
+        <w:t xml:space="preserve">SOARable=true</w:t>
+      </w:r>
+      <w:r>
+        <w:t xml:space="preserve">, and refuses outright on anything tagged</w:t>
+      </w:r>
+      <w:r>
+        <w:t xml:space="preserve"> </w:t>
+      </w:r>
+      <w:r>
+        <w:rPr>
+          <w:rStyle w:val="VerbatimChar"/>
+        </w:rPr>
+        <w:t xml:space="preserve">Role=k3s-server</w:t>
+      </w:r>
+      <w:r>
+        <w:t xml:space="preserve"> </w:t>
+      </w:r>
+      <w:r>
+        <w:t xml:space="preserve">or</w:t>
+      </w:r>
+      <w:r>
+        <w:t xml:space="preserve"> </w:t>
+      </w:r>
+      <w:r>
+        <w:rPr>
+          <w:rStyle w:val="VerbatimChar"/>
+        </w:rPr>
+        <w:t xml:space="preserve">Role=hybrid-gateway</w:t>
+      </w:r>
+      <w:r>
+        <w:t xml:space="preserve"> </w:t>
+      </w:r>
+      <w:r>
+        <w:t xml:space="preserve">so the system cannot isolate itself. Independently, its IAM policy carries a condition on</w:t>
+      </w:r>
+      <w:r>
+        <w:t xml:space="preserve"> </w:t>
+      </w:r>
+      <w:r>
+        <w:rPr>
+          <w:rStyle w:val="VerbatimChar"/>
+        </w:rPr>
+        <w:t xml:space="preserve">aws:ResourceTag/SOARable</w:t>
+      </w:r>
+      <w:r>
+        <w:t xml:space="preserve">. If the code check were bypassed, the API call would still fail.</w:t>
+      </w:r>
+    </w:p>
+    <w:p>
+      <w:pPr>
+        <w:pStyle w:val="BodyText"/>
+      </w:pPr>
+      <w:r>
+        <w:t xml:space="preserve">Its permission on security groups is narrower still, it may attach only the quarantine group, and no other. The consequence is that this role can move a host</w:t>
+      </w:r>
+      <w:r>
+        <w:t xml:space="preserve"> </w:t>
+      </w:r>
+      <w:r>
+        <w:rPr>
+          <w:bCs/>
+          <w:b/>
+        </w:rPr>
+        <w:t xml:space="preserve">into</w:t>
+      </w:r>
+      <w:r>
+        <w:t xml:space="preserve"> </w:t>
+      </w:r>
+      <w:r>
+        <w:t xml:space="preserve">isolation and cannot move it out. Release is deliberately a human action, because deciding that a compromised host is safe to return to the network is a judgement, not an automation.</w:t>
+      </w:r>
+    </w:p>
+    <w:p>
+      <w:r>
+        <w:br w:type="page"/>
+      </w:r>
+    </w:p>
+    <w:bookmarkEnd w:id="52"/>
+    <w:bookmarkEnd w:id="53"/>
+    <w:bookmarkStart w:id="62" w:name="deployment-and-automation"/>
+    <w:p>
+      <w:pPr>
+        <w:pStyle w:val="Heading1"/>
+      </w:pPr>
+      <w:r>
+        <w:t xml:space="preserve">6. Deployment and automation</w:t>
+      </w:r>
+    </w:p>
+    <w:bookmarkStart w:id="54" w:name="infrastructure-as-code-req-nca-p2-10"/>
+    <w:p>
+      <w:pPr>
+        <w:pStyle w:val="Heading2"/>
+      </w:pPr>
+      <w:r>
+        <w:t xml:space="preserve">6.1 Infrastructure as Code (REQ-NCA-P2-10)</w:t>
+      </w:r>
+    </w:p>
+    <w:p>
+      <w:pPr>
+        <w:pStyle w:val="FirstParagraph"/>
+      </w:pPr>
+      <w:r>
+        <w:t xml:space="preserve">All cloud infrastructure is defined in Terraform: 20 configuration files, one reusable spoke VPC module, roughly 160 managed resources.</w:t>
+      </w:r>
+    </w:p>
+    <w:p>
+      <w:pPr>
+        <w:pStyle w:val="BodyText"/>
+      </w:pPr>
+      <w:r>
+        <w:t xml:space="preserve">State is stored in S3 with versioning and encryption enabled, and locked with a DynamoDB table. This was the first thing built, before any infrastructure, and it proved its worth: when an authentication token expired mid-apply and left roughly 90 resources created but unrecorded, the recovery was a single</w:t>
+      </w:r>
+      <w:r>
+        <w:t xml:space="preserve"> </w:t>
+      </w:r>
+      <w:r>
+        <w:rPr>
+          <w:rStyle w:val="VerbatimChar"/>
+        </w:rPr>
+        <w:t xml:space="preserve">terraform state push</w:t>
+      </w:r>
+      <w:r>
+        <w:t xml:space="preserve"> </w:t>
+      </w:r>
+      <w:r>
+        <w:t xml:space="preserve">rather than a manual reconciliation of the entire environment.</w:t>
+      </w:r>
+    </w:p>
+    <w:p>
+      <w:pPr>
+        <w:pStyle w:val="BodyText"/>
+      </w:pPr>
+      <w:r>
+        <w:t xml:space="preserve">The IaC is genuinely reproducing rather than merely descriptive. When the k3s node was found to have failed its bootstrap, the fix was</w:t>
+      </w:r>
+      <w:r>
+        <w:t xml:space="preserve"> </w:t>
+      </w:r>
+      <w:r>
+        <w:rPr>
+          <w:rStyle w:val="VerbatimChar"/>
+        </w:rPr>
+        <w:t xml:space="preserve">terraform taint</w:t>
+      </w:r>
+      <w:r>
+        <w:t xml:space="preserve"> </w:t>
+      </w:r>
+      <w:r>
+        <w:t xml:space="preserve">followed by</w:t>
+      </w:r>
+      <w:r>
+        <w:t xml:space="preserve"> </w:t>
+      </w:r>
+      <w:r>
+        <w:rPr>
+          <w:rStyle w:val="VerbatimChar"/>
+        </w:rPr>
+        <w:t xml:space="preserve">terraform apply</w:t>
+      </w:r>
+      <w:r>
+        <w:t xml:space="preserve">; the replacement node built itself from the same definition and came up healthy.</w:t>
+      </w:r>
+    </w:p>
+    <w:bookmarkEnd w:id="54"/>
+    <w:bookmarkStart w:id="61" w:name="X84e8fa2cec28c5a6ca850fb325cee2f916532f9"/>
+    <w:p>
+      <w:pPr>
+        <w:pStyle w:val="Heading2"/>
+      </w:pPr>
+      <w:r>
+        <w:t xml:space="preserve">6.2 DevOps platform and pipelines (REQ-NCA-P2-11, P2-12)</w:t>
+      </w:r>
+    </w:p>
+    <w:p>
+      <w:pPr>
+        <w:pStyle w:val="FirstParagraph"/>
+      </w:pPr>
+      <w:r>
+        <w:t xml:space="preserve">Source control and pipelines are on GitHub with GitHub Actions. All jobs run on a self-hosted runner, which is required rather than preferred: the Terraform state is in a private bucket, the k3s API has no public address, and the SOAR ingest endpoint is reachable only from inside the VPC. A cloud-hosted runner cannot reach any of them.</w:t>
+      </w:r>
+    </w:p>
+    <w:p>
+      <w:pPr>
+        <w:pStyle w:val="BodyText"/>
+      </w:pPr>
+      <w:r>
+        <w:t xml:space="preserve">The repository is organised so that each concern is separately reviewable:</w:t>
+      </w:r>
+    </w:p>
+    <w:tbl>
+      <w:tblPr>
+        <w:tblStyle w:val="Table"/>
+        <w:tblW w:type="pct" w:w="5000"/>
+        <w:tblLook w:firstRow="1" w:lastRow="0" w:firstColumn="0" w:lastColumn="0" w:noHBand="0" w:noVBand="0" w:val="0020"/>
+        <w:jc w:val="start"/>
+      </w:tblPr>
+      <w:tblGrid>
+        <w:gridCol w:w="3960"/>
+        <w:gridCol w:w="3960"/>
+      </w:tblGrid>
+      <w:tr>
+        <w:trPr>
+          <w:tblHeader w:val="true"/>
+        </w:trPr>
+        <w:tc>
+          <w:tcPr/>
+          <w:p>
+            <w:pPr>
+              <w:pStyle w:val="Compact"/>
+              <w:jc w:val="left"/>
+            </w:pPr>
+            <w:r>
+              <w:t xml:space="preserve">Path</w:t>
+            </w:r>
+          </w:p>
+        </w:tc>
+        <w:tc>
+          <w:tcPr/>
+          <w:p>
+            <w:pPr>
+              <w:pStyle w:val="Compact"/>
+              <w:jc w:val="left"/>
+            </w:pPr>
+            <w:r>
+              <w:t xml:space="preserve">Contents</w:t>
+            </w:r>
+          </w:p>
+        </w:tc>
+      </w:tr>
+      <w:tr>
+        <w:tc>
+          <w:tcPr/>
+          <w:p>
+            <w:pPr>
+              <w:pStyle w:val="Compact"/>
+              <w:jc w:val="left"/>
+            </w:pPr>
+            <w:r>
+              <w:rPr>
+                <w:rStyle w:val="VerbatimChar"/>
+              </w:rPr>
+              <w:t xml:space="preserve">terraform/</w:t>
+            </w:r>
+          </w:p>
+        </w:tc>
+        <w:tc>
+          <w:tcPr/>
+          <w:p>
+            <w:pPr>
+              <w:pStyle w:val="Compact"/>
+              <w:jc w:val="left"/>
+            </w:pPr>
+            <w:r>
+              <w:t xml:space="preserve">Infrastructure definitions and the reusable spoke module</w:t>
+            </w:r>
+          </w:p>
+        </w:tc>
+      </w:tr>
+      <w:tr>
+        <w:tc>
+          <w:tcPr/>
+          <w:p>
+            <w:pPr>
+              <w:pStyle w:val="Compact"/>
+              <w:jc w:val="left"/>
+            </w:pPr>
             <w:r>
               <w:rPr>
                 <w:rStyle w:val="VerbatimChar"/>
@@ -5332,99 +5559,19 @@
               <w:jc w:val="left"/>
             </w:pPr>
             <w:r>
-              <w:t xml:space="preserve">Compile every handler, run the unit suite, validate playbook integrity, package the function archives</w:t>
-            </w:r>
-          </w:p>
-        </w:tc>
-      </w:tr>
-      <w:tr>
-        <w:tc>
-          <w:tcPr/>
-          <w:p>
-            <w:pPr>
-              <w:pStyle w:val="Compact"/>
-              <w:jc w:val="left"/>
-            </w:pPr>
-            <w:r>
-              <w:t xml:space="preserve">Infrastructure</w:t>
-            </w:r>
-          </w:p>
-        </w:tc>
-        <w:tc>
-          <w:tcPr/>
-          <w:p>
-            <w:pPr>
-              <w:pStyle w:val="Compact"/>
-              <w:jc w:val="left"/>
-            </w:pPr>
-            <w:r>
-              <w:t xml:space="preserve">Changes under</w:t>
-            </w:r>
-            <w:r>
-              <w:t xml:space="preserve"> </w:t>
-            </w:r>
-            <w:r>
-              <w:rPr>
-                <w:rStyle w:val="VerbatimChar"/>
-              </w:rPr>
-              <w:t xml:space="preserve">terraform/</w:t>
-            </w:r>
-            <w:r>
-              <w:t xml:space="preserve"> </w:t>
-            </w:r>
-            <w:r>
-              <w:t xml:space="preserve">or</w:t>
-            </w:r>
-            <w:r>
-              <w:t xml:space="preserve"> </w:t>
-            </w:r>
-            <w:r>
-              <w:rPr>
-                <w:rStyle w:val="VerbatimChar"/>
-              </w:rPr>
-              <w:t xml:space="preserve">soar/</w:t>
-            </w:r>
-          </w:p>
-        </w:tc>
-        <w:tc>
-          <w:tcPr/>
-          <w:p>
-            <w:pPr>
-              <w:pStyle w:val="Compact"/>
-              <w:jc w:val="left"/>
-            </w:pPr>
-            <w:r>
-              <w:t xml:space="preserve">Format, validate, plan, apply, then verify the deployed state</w:t>
-            </w:r>
-          </w:p>
-        </w:tc>
-      </w:tr>
-      <w:tr>
-        <w:tc>
-          <w:tcPr/>
-          <w:p>
-            <w:pPr>
-              <w:pStyle w:val="Compact"/>
-              <w:jc w:val="left"/>
-            </w:pPr>
-            <w:r>
-              <w:t xml:space="preserve">SOAR Console</w:t>
-            </w:r>
-          </w:p>
-        </w:tc>
-        <w:tc>
-          <w:tcPr/>
-          <w:p>
-            <w:pPr>
-              <w:pStyle w:val="Compact"/>
-              <w:jc w:val="left"/>
-            </w:pPr>
-            <w:r>
-              <w:t xml:space="preserve">Changes under</w:t>
-            </w:r>
-            <w:r>
-              <w:t xml:space="preserve"> </w:t>
-            </w:r>
+              <w:t xml:space="preserve">Collector, rule engine, response actions, playbooks</w:t>
+            </w:r>
+          </w:p>
+        </w:tc>
+      </w:tr>
+      <w:tr>
+        <w:tc>
+          <w:tcPr/>
+          <w:p>
+            <w:pPr>
+              <w:pStyle w:val="Compact"/>
+              <w:jc w:val="left"/>
+            </w:pPr>
             <w:r>
               <w:rPr>
                 <w:rStyle w:val="VerbatimChar"/>
@@ -5441,37 +5588,48 @@
               <w:jc w:val="left"/>
             </w:pPr>
             <w:r>
-              <w:t xml:space="preserve">Build the container, smoke test it, push to ECR, roll it out to k3s</w:t>
-            </w:r>
-          </w:p>
-        </w:tc>
-      </w:tr>
-      <w:tr>
-        <w:tc>
-          <w:tcPr/>
-          <w:p>
-            <w:pPr>
-              <w:pStyle w:val="Compact"/>
-              <w:jc w:val="left"/>
-            </w:pPr>
-            <w:r>
-              <w:t xml:space="preserve">Observability</w:t>
-            </w:r>
-          </w:p>
-        </w:tc>
-        <w:tc>
-          <w:tcPr/>
-          <w:p>
-            <w:pPr>
-              <w:pStyle w:val="Compact"/>
-              <w:jc w:val="left"/>
-            </w:pPr>
-            <w:r>
-              <w:t xml:space="preserve">Changes under</w:t>
-            </w:r>
-            <w:r>
-              <w:t xml:space="preserve"> </w:t>
-            </w:r>
+              <w:t xml:space="preserve">Containerised read-only console and its Kubernetes manifests</w:t>
+            </w:r>
+          </w:p>
+        </w:tc>
+      </w:tr>
+      <w:tr>
+        <w:tc>
+          <w:tcPr/>
+          <w:p>
+            <w:pPr>
+              <w:pStyle w:val="Compact"/>
+              <w:jc w:val="left"/>
+            </w:pPr>
+            <w:r>
+              <w:rPr>
+                <w:rStyle w:val="VerbatimChar"/>
+              </w:rPr>
+              <w:t xml:space="preserve">soar/tests/</w:t>
+            </w:r>
+          </w:p>
+        </w:tc>
+        <w:tc>
+          <w:tcPr/>
+          <w:p>
+            <w:pPr>
+              <w:pStyle w:val="Compact"/>
+              <w:jc w:val="left"/>
+            </w:pPr>
+            <w:r>
+              <w:t xml:space="preserve">50 unit tests, no external dependencies</w:t>
+            </w:r>
+          </w:p>
+        </w:tc>
+      </w:tr>
+      <w:tr>
+        <w:tc>
+          <w:tcPr/>
+          <w:p>
+            <w:pPr>
+              <w:pStyle w:val="Compact"/>
+              <w:jc w:val="left"/>
+            </w:pPr>
             <w:r>
               <w:rPr>
                 <w:rStyle w:val="VerbatimChar"/>
@@ -5488,283 +5646,77 @@
               <w:jc w:val="left"/>
             </w:pPr>
             <w:r>
-              <w:t xml:space="preserve">Validate the Helm values, render them from Terraform outputs, deploy the stack, verify every pod and the monitoring-to-SOAR path</w:t>
+              <w:t xml:space="preserve">Monitoring stack deployment</w:t>
+            </w:r>
+          </w:p>
+        </w:tc>
+      </w:tr>
+      <w:tr>
+        <w:tc>
+          <w:tcPr/>
+          <w:p>
+            <w:pPr>
+              <w:pStyle w:val="Compact"/>
+              <w:jc w:val="left"/>
+            </w:pPr>
+            <w:r>
+              <w:rPr>
+                <w:rStyle w:val="VerbatimChar"/>
+              </w:rPr>
+              <w:t xml:space="preserve">scripts/</w:t>
+            </w:r>
+          </w:p>
+        </w:tc>
+        <w:tc>
+          <w:tcPr/>
+          <w:p>
+            <w:pPr>
+              <w:pStyle w:val="Compact"/>
+              <w:jc w:val="left"/>
+            </w:pPr>
+            <w:r>
+              <w:t xml:space="preserve">End-to-end test and operational tooling</w:t>
+            </w:r>
+          </w:p>
+        </w:tc>
+      </w:tr>
+      <w:tr>
+        <w:tc>
+          <w:tcPr/>
+          <w:p>
+            <w:pPr>
+              <w:pStyle w:val="Compact"/>
+              <w:jc w:val="left"/>
+            </w:pPr>
+            <w:r>
+              <w:rPr>
+                <w:rStyle w:val="VerbatimChar"/>
+              </w:rPr>
+              <w:t xml:space="preserve">docs/</w:t>
+            </w:r>
+          </w:p>
+        </w:tc>
+        <w:tc>
+          <w:tcPr/>
+          <w:p>
+            <w:pPr>
+              <w:pStyle w:val="Compact"/>
+              <w:jc w:val="left"/>
+            </w:pPr>
+            <w:r>
+              <w:t xml:space="preserve">This documentation set</w:t>
             </w:r>
           </w:p>
         </w:tc>
       </w:tr>
     </w:tbl>
-    <w:p>
-      <w:pPr>
-        <w:pStyle w:val="BodyText"/>
-      </w:pPr>
-      <w:r>
-        <w:t xml:space="preserve">Between them these cover every deployable part of the system. The only step that remains manual is approving a plan that would destroy a resource, and that is manual deliberately.</w:t>
-      </w:r>
-    </w:p>
-    <w:bookmarkEnd w:id="52"/>
-    <w:bookmarkStart w:id="53" w:name="testing"/>
+    <w:bookmarkStart w:id="55" w:name="the-three-pipelines"/>
     <w:p>
       <w:pPr>
         <w:pStyle w:val="Heading3"/>
       </w:pPr>
       <w:r>
-        <w:t xml:space="preserve">Testing</w:t>
-      </w:r>
-    </w:p>
-    <w:p>
-      <w:pPr>
-        <w:pStyle w:val="FirstParagraph"/>
-      </w:pPr>
-      <w:r>
-        <w:t xml:space="preserve">The unit suite covers parsing in the collector, matching and correlation in the rule engine, and the refusal conditions on both destructive actions. It uses only the standard library, with the AWS SDK replaced by a stub, so it runs on a bare runner with no dependency installation and cannot fail because a package index was unreachable.</w:t>
-      </w:r>
-    </w:p>
-    <w:p>
-      <w:pPr>
-        <w:pStyle w:val="BodyText"/>
-      </w:pPr>
-      <w:r>
-        <w:t xml:space="preserve">The suite found a real defect before deployment. The rule engine read the event identifier directly when logging a non-match, so an event arriving without that field would raise and fail the entire SQS batch rather than the single bad message. The collector always sets the field, so no production event would have triggered it, but a replayed or hand-crafted message would.</w:t>
-      </w:r>
-    </w:p>
-    <w:p>
-      <w:pPr>
-        <w:pStyle w:val="BodyText"/>
-      </w:pPr>
-      <w:r>
-        <w:t xml:space="preserve">Playbook integrity is checked separately, on the principle that a malformed playbook should fail the build rather than the runtime. The check rejects duplicate identifiers, actions with no implementing handler, playbooks with no match criteria, and thresholds too small to constitute correlation.</w:t>
-      </w:r>
-    </w:p>
-    <w:p>
-      <w:pPr>
-        <w:pStyle w:val="BodyText"/>
-      </w:pPr>
-      <w:r>
-        <w:t xml:space="preserve">The AWS calls themselves are not unit tested. Mocking a cloud provider proves the mock works. That confidence comes from the end-to-end scripts, which run against the real environment and assert on real state changes.</w:t>
-      </w:r>
-    </w:p>
-    <w:bookmarkEnd w:id="53"/>
-    <w:bookmarkStart w:id="54" w:name="deployment-is-automatic-graded-by-risk"/>
-    <w:p>
-      <w:pPr>
-        <w:pStyle w:val="Heading3"/>
-      </w:pPr>
-      <w:r>
-        <w:t xml:space="preserve">Deployment is automatic, graded by risk</w:t>
-      </w:r>
-    </w:p>
-    <w:p>
-      <w:pPr>
-        <w:pStyle w:val="FirstParagraph"/>
-      </w:pPr>
-      <w:r>
-        <w:t xml:space="preserve">The pipeline applies infrastructure changes on merge without waiting for anyone, but only when the plan is additive. If the plan would destroy or replace any resource, the job routes through an environment that requires approval first.</w:t>
-      </w:r>
-    </w:p>
-    <w:p>
-      <w:pPr>
-        <w:pStyle w:val="BodyText"/>
-      </w:pPr>
-      <w:r>
-        <w:t xml:space="preserve">This resolves what initially looked like a conflict between two correct positions. Changes should deploy automatically, and a pipeline should never delete production infrastructure unattended. Those only contradict each other if risk is treated as uniform. Adding a Lambda function and destroying a Transit Gateway attachment are not the same event and do not warrant the same ceremony. The plan output already states which one is happening, so the pipeline reads it and behaves accordingly.</w:t>
-      </w:r>
-    </w:p>
-    <w:p>
-      <w:pPr>
-        <w:pStyle w:val="BodyText"/>
-      </w:pPr>
-      <w:r>
-        <w:t xml:space="preserve">In practice the changes made most often, a new playbook, an updated handler, an additional alert rule, deploy with no human involvement at all. The changes that could cause an outage stop and wait.</w:t>
-      </w:r>
-    </w:p>
-    <w:p>
-      <w:pPr>
-        <w:pStyle w:val="BodyText"/>
-      </w:pPr>
-      <w:r>
-        <w:t xml:space="preserve">The console pipeline has no gate at all. A container rollout is reversible in one command, the deployment sets</w:t>
-      </w:r>
-      <w:r>
-        <w:t xml:space="preserve"> </w:t>
-      </w:r>
-      <w:r>
-        <w:rPr>
-          <w:rStyle w:val="VerbatimChar"/>
-        </w:rPr>
-        <w:t xml:space="preserve">maxUnavailable: 0</w:t>
-      </w:r>
-      <w:r>
-        <w:t xml:space="preserve"> </w:t>
-      </w:r>
-      <w:r>
-        <w:t xml:space="preserve">so there is no gap in service, and the image is smoke tested on the runner before it is pushed.</w:t>
-      </w:r>
-    </w:p>
-    <w:bookmarkEnd w:id="54"/>
-    <w:bookmarkStart w:id="55" w:name="image-tagging"/>
-    <w:p>
-      <w:pPr>
-        <w:pStyle w:val="Heading3"/>
-      </w:pPr>
-      <w:r>
-        <w:t xml:space="preserve">Image tagging</w:t>
-      </w:r>
-    </w:p>
-    <w:p>
-      <w:pPr>
-        <w:pStyle w:val="FirstParagraph"/>
-      </w:pPr>
-      <w:r>
-        <w:t xml:space="preserve">Container images are tagged with the commit SHA rather than</w:t>
-      </w:r>
-      <w:r>
-        <w:t xml:space="preserve"> </w:t>
-      </w:r>
-      <w:r>
-        <w:rPr>
-          <w:rStyle w:val="VerbatimChar"/>
-        </w:rPr>
-        <w:t xml:space="preserve">latest</w:t>
-      </w:r>
-      <w:r>
-        <w:t xml:space="preserve">, for one operational reason and one practical one.</w:t>
-      </w:r>
-    </w:p>
-    <w:p>
-      <w:pPr>
-        <w:pStyle w:val="BodyText"/>
-      </w:pPr>
-      <w:r>
-        <w:t xml:space="preserve">The running revision can be traced back to a commit, which matters when something is behaving oddly and the question is what changed. And Kubernetes will not roll out a deployment whose image reference is unchanged, so a pipeline that always pushes</w:t>
-      </w:r>
-      <w:r>
-        <w:t xml:space="preserve"> </w:t>
-      </w:r>
-      <w:r>
-        <w:rPr>
-          <w:rStyle w:val="VerbatimChar"/>
-        </w:rPr>
-        <w:t xml:space="preserve">latest</w:t>
-      </w:r>
-      <w:r>
-        <w:t xml:space="preserve"> </w:t>
-      </w:r>
-      <w:r>
-        <w:t xml:space="preserve">appears to succeed while deploying nothing. After each rollout the pipeline asserts that the running image is the one it just built, which would catch that failure mode if it ever reappeared.</w:t>
-      </w:r>
-    </w:p>
-    <w:bookmarkEnd w:id="55"/>
-    <w:bookmarkStart w:id="56" w:name="deploying-the-observability-stack"/>
-    <w:p>
-      <w:pPr>
-        <w:pStyle w:val="Heading3"/>
-      </w:pPr>
-      <w:r>
-        <w:t xml:space="preserve">Deploying the observability stack</w:t>
-      </w:r>
-    </w:p>
-    <w:p>
-      <w:pPr>
-        <w:pStyle w:val="FirstParagraph"/>
-      </w:pPr>
-      <w:r>
-        <w:t xml:space="preserve">The Helm values for Prometheus, Alertmanager, Loki, Alloy, Grafana and cloudwatch-exporter are versioned files under</w:t>
-      </w:r>
-      <w:r>
-        <w:t xml:space="preserve"> </w:t>
-      </w:r>
-      <w:r>
-        <w:rPr>
-          <w:rStyle w:val="VerbatimChar"/>
-        </w:rPr>
-        <w:t xml:space="preserve">observability/values/</w:t>
-      </w:r>
-      <w:r>
-        <w:t xml:space="preserve">, and the alert rules are a manifest under</w:t>
-      </w:r>
-      <w:r>
-        <w:t xml:space="preserve"> </w:t>
-      </w:r>
-      <w:r>
-        <w:rPr>
-          <w:rStyle w:val="VerbatimChar"/>
-        </w:rPr>
-        <w:t xml:space="preserve">observability/manifests/</w:t>
-      </w:r>
-      <w:r>
-        <w:t xml:space="preserve">. The pipeline resolves environment-specific values from Terraform state, renders them, and applies them with</w:t>
-      </w:r>
-      <w:r>
-        <w:t xml:space="preserve"> </w:t>
-      </w:r>
-      <w:r>
-        <w:rPr>
-          <w:rStyle w:val="VerbatimChar"/>
-        </w:rPr>
-        <w:t xml:space="preserve">helm upgrade --install</w:t>
-      </w:r>
-      <w:r>
-        <w:t xml:space="preserve">.</w:t>
-      </w:r>
-    </w:p>
-    <w:p>
-      <w:pPr>
-        <w:pStyle w:val="BodyText"/>
-      </w:pPr>
-      <w:r>
-        <w:t xml:space="preserve">After deploying it verifies three things: that every pod in the namespace is Running, that the alert rules loaded, and that a POST from inside the cluster to the private SOAR ingest endpoint returns HTTP 200. That last check matters more than it looks. If Alertmanager cannot reach the ingest endpoint then the observability stack has stopped being part of the SOAR system, whatever its configuration says, and REQ-NCA-P2-09 is silently unmet. Verifying it on every deployment turns that from an assumption into a checked property.</w:t>
-      </w:r>
-    </w:p>
-    <w:p>
-      <w:pPr>
-        <w:pStyle w:val="BodyText"/>
-      </w:pPr>
-      <w:r>
-        <w:t xml:space="preserve">Terraform’s Helm provider was the alternative and is more literally infrastructure as code. It was not used because it needs to reach the Kubernetes API at plan time, which from a runner outside the VPC means carrying a kubeconfig through the bastion, and because it creates an ordering problem: the cluster and the workloads running on it would live in the same configuration and the same state. Helm driven by a pipeline against versioned values achieves the same reproducibility with fewer moving parts. Separating cluster and workload state, then adopting the provider, is the production recommendation.</w:t>
-      </w:r>
-    </w:p>
-    <w:bookmarkEnd w:id="56"/>
-    <w:bookmarkStart w:id="57" w:name="deploying-soar-to-the-container-platform"/>
-    <w:p>
-      <w:pPr>
-        <w:pStyle w:val="Heading3"/>
-      </w:pPr>
-      <w:r>
-        <w:t xml:space="preserve">Deploying SOAR to the container platform</w:t>
-      </w:r>
-    </w:p>
-    <w:p>
-      <w:pPr>
-        <w:pStyle w:val="FirstParagraph"/>
-      </w:pPr>
-      <w:r>
-        <w:t xml:space="preserve">The core assignment asks for SOAR components deployed to the container platform through CI/CD. The response pipeline itself runs on Lambda, for the reasons in Section 5.4, so the containerised component is the SOAR console: a read-only view of the operational record, built as an image, pushed to ECR, and rolled out to k3s by pipeline.</w:t>
-      </w:r>
-    </w:p>
-    <w:p>
-      <w:pPr>
-        <w:pStyle w:val="BodyText"/>
-      </w:pPr>
-      <w:r>
-        <w:t xml:space="preserve">It exists because that record lives across three DynamoDB tables and CloudWatch, and during an incident nobody wants four browser tabs open to answer what happened and what was done about it. It runs unprivileged with a read-only root filesystem, drops all capabilities, and holds no write permissions, so a flaw in the web layer cannot be used to release a quarantined host or lift a block.</w:t>
-      </w:r>
-    </w:p>
-    <w:p>
-      <w:r>
-        <w:br w:type="page"/>
-      </w:r>
-    </w:p>
-    <w:bookmarkEnd w:id="57"/>
-    <w:bookmarkEnd w:id="58"/>
-    <w:bookmarkEnd w:id="59"/>
-    <w:bookmarkStart w:id="60" w:name="failure-scenarios"/>
-    <w:p>
-      <w:pPr>
-        <w:pStyle w:val="Heading1"/>
-      </w:pPr>
-      <w:r>
-        <w:t xml:space="preserve">7. Failure scenarios</w:t>
+        <w:t xml:space="preserve">The three pipelines</w:t>
       </w:r>
     </w:p>
     <w:tbl>
@@ -5791,6 +5743,536 @@
               <w:jc w:val="left"/>
             </w:pPr>
             <w:r>
+              <w:t xml:space="preserve">Workflow</w:t>
+            </w:r>
+          </w:p>
+        </w:tc>
+        <w:tc>
+          <w:tcPr/>
+          <w:p>
+            <w:pPr>
+              <w:pStyle w:val="Compact"/>
+              <w:jc w:val="left"/>
+            </w:pPr>
+            <w:r>
+              <w:t xml:space="preserve">Trigger</w:t>
+            </w:r>
+          </w:p>
+        </w:tc>
+        <w:tc>
+          <w:tcPr/>
+          <w:p>
+            <w:pPr>
+              <w:pStyle w:val="Compact"/>
+              <w:jc w:val="left"/>
+            </w:pPr>
+            <w:r>
+              <w:t xml:space="preserve">Responsibility</w:t>
+            </w:r>
+          </w:p>
+        </w:tc>
+      </w:tr>
+      <w:tr>
+        <w:tc>
+          <w:tcPr/>
+          <w:p>
+            <w:pPr>
+              <w:pStyle w:val="Compact"/>
+              <w:jc w:val="left"/>
+            </w:pPr>
+            <w:r>
+              <w:t xml:space="preserve">SOAR CI</w:t>
+            </w:r>
+          </w:p>
+        </w:tc>
+        <w:tc>
+          <w:tcPr/>
+          <w:p>
+            <w:pPr>
+              <w:pStyle w:val="Compact"/>
+              <w:jc w:val="left"/>
+            </w:pPr>
+            <w:r>
+              <w:t xml:space="preserve">Any change under</w:t>
+            </w:r>
+            <w:r>
+              <w:t xml:space="preserve"> </w:t>
+            </w:r>
+            <w:r>
+              <w:rPr>
+                <w:rStyle w:val="VerbatimChar"/>
+              </w:rPr>
+              <w:t xml:space="preserve">soar/</w:t>
+            </w:r>
+          </w:p>
+        </w:tc>
+        <w:tc>
+          <w:tcPr/>
+          <w:p>
+            <w:pPr>
+              <w:pStyle w:val="Compact"/>
+              <w:jc w:val="left"/>
+            </w:pPr>
+            <w:r>
+              <w:t xml:space="preserve">Compile every handler, run the unit suite, validate playbook integrity, package the function archives</w:t>
+            </w:r>
+          </w:p>
+        </w:tc>
+      </w:tr>
+      <w:tr>
+        <w:tc>
+          <w:tcPr/>
+          <w:p>
+            <w:pPr>
+              <w:pStyle w:val="Compact"/>
+              <w:jc w:val="left"/>
+            </w:pPr>
+            <w:r>
+              <w:t xml:space="preserve">Infrastructure</w:t>
+            </w:r>
+          </w:p>
+        </w:tc>
+        <w:tc>
+          <w:tcPr/>
+          <w:p>
+            <w:pPr>
+              <w:pStyle w:val="Compact"/>
+              <w:jc w:val="left"/>
+            </w:pPr>
+            <w:r>
+              <w:t xml:space="preserve">Changes under</w:t>
+            </w:r>
+            <w:r>
+              <w:t xml:space="preserve"> </w:t>
+            </w:r>
+            <w:r>
+              <w:rPr>
+                <w:rStyle w:val="VerbatimChar"/>
+              </w:rPr>
+              <w:t xml:space="preserve">terraform/</w:t>
+            </w:r>
+            <w:r>
+              <w:t xml:space="preserve"> </w:t>
+            </w:r>
+            <w:r>
+              <w:t xml:space="preserve">or</w:t>
+            </w:r>
+            <w:r>
+              <w:t xml:space="preserve"> </w:t>
+            </w:r>
+            <w:r>
+              <w:rPr>
+                <w:rStyle w:val="VerbatimChar"/>
+              </w:rPr>
+              <w:t xml:space="preserve">soar/</w:t>
+            </w:r>
+          </w:p>
+        </w:tc>
+        <w:tc>
+          <w:tcPr/>
+          <w:p>
+            <w:pPr>
+              <w:pStyle w:val="Compact"/>
+              <w:jc w:val="left"/>
+            </w:pPr>
+            <w:r>
+              <w:t xml:space="preserve">Format, validate, plan, apply, then verify the deployed state</w:t>
+            </w:r>
+          </w:p>
+        </w:tc>
+      </w:tr>
+      <w:tr>
+        <w:tc>
+          <w:tcPr/>
+          <w:p>
+            <w:pPr>
+              <w:pStyle w:val="Compact"/>
+              <w:jc w:val="left"/>
+            </w:pPr>
+            <w:r>
+              <w:t xml:space="preserve">SOAR Console</w:t>
+            </w:r>
+          </w:p>
+        </w:tc>
+        <w:tc>
+          <w:tcPr/>
+          <w:p>
+            <w:pPr>
+              <w:pStyle w:val="Compact"/>
+              <w:jc w:val="left"/>
+            </w:pPr>
+            <w:r>
+              <w:t xml:space="preserve">Changes under</w:t>
+            </w:r>
+            <w:r>
+              <w:t xml:space="preserve"> </w:t>
+            </w:r>
+            <w:r>
+              <w:rPr>
+                <w:rStyle w:val="VerbatimChar"/>
+              </w:rPr>
+              <w:t xml:space="preserve">soar/console/</w:t>
+            </w:r>
+          </w:p>
+        </w:tc>
+        <w:tc>
+          <w:tcPr/>
+          <w:p>
+            <w:pPr>
+              <w:pStyle w:val="Compact"/>
+              <w:jc w:val="left"/>
+            </w:pPr>
+            <w:r>
+              <w:t xml:space="preserve">Build the container, smoke test it, push to ECR, roll it out to k3s</w:t>
+            </w:r>
+          </w:p>
+        </w:tc>
+      </w:tr>
+      <w:tr>
+        <w:tc>
+          <w:tcPr/>
+          <w:p>
+            <w:pPr>
+              <w:pStyle w:val="Compact"/>
+              <w:jc w:val="left"/>
+            </w:pPr>
+            <w:r>
+              <w:t xml:space="preserve">Observability</w:t>
+            </w:r>
+          </w:p>
+        </w:tc>
+        <w:tc>
+          <w:tcPr/>
+          <w:p>
+            <w:pPr>
+              <w:pStyle w:val="Compact"/>
+              <w:jc w:val="left"/>
+            </w:pPr>
+            <w:r>
+              <w:t xml:space="preserve">Changes under</w:t>
+            </w:r>
+            <w:r>
+              <w:t xml:space="preserve"> </w:t>
+            </w:r>
+            <w:r>
+              <w:rPr>
+                <w:rStyle w:val="VerbatimChar"/>
+              </w:rPr>
+              <w:t xml:space="preserve">observability/</w:t>
+            </w:r>
+          </w:p>
+        </w:tc>
+        <w:tc>
+          <w:tcPr/>
+          <w:p>
+            <w:pPr>
+              <w:pStyle w:val="Compact"/>
+              <w:jc w:val="left"/>
+            </w:pPr>
+            <w:r>
+              <w:t xml:space="preserve">Validate the Helm values, render them from Terraform outputs, deploy the stack, verify every pod and the monitoring-to-SOAR path</w:t>
+            </w:r>
+          </w:p>
+        </w:tc>
+      </w:tr>
+    </w:tbl>
+    <w:p>
+      <w:pPr>
+        <w:pStyle w:val="BodyText"/>
+      </w:pPr>
+      <w:r>
+        <w:t xml:space="preserve">Between them these cover every deployable part of the system. The only step that remains manual is approving a plan that would destroy a resource, and that is manual deliberately.</w:t>
+      </w:r>
+    </w:p>
+    <w:bookmarkEnd w:id="55"/>
+    <w:bookmarkStart w:id="56" w:name="testing"/>
+    <w:p>
+      <w:pPr>
+        <w:pStyle w:val="Heading3"/>
+      </w:pPr>
+      <w:r>
+        <w:t xml:space="preserve">Testing</w:t>
+      </w:r>
+    </w:p>
+    <w:p>
+      <w:pPr>
+        <w:pStyle w:val="FirstParagraph"/>
+      </w:pPr>
+      <w:r>
+        <w:t xml:space="preserve">The unit suite covers parsing in the collector, matching and correlation in the rule engine, and the refusal conditions on both destructive actions. It uses only the standard library, with the AWS SDK replaced by a stub, so it runs on a bare runner with no dependency installation and cannot fail because a package index was unreachable.</w:t>
+      </w:r>
+    </w:p>
+    <w:p>
+      <w:pPr>
+        <w:pStyle w:val="BodyText"/>
+      </w:pPr>
+      <w:r>
+        <w:t xml:space="preserve">The suite found a real defect before deployment. The rule engine read the event identifier directly when logging a non-match, so an event arriving without that field would raise and fail the entire SQS batch rather than the single bad message. The collector always sets the field, so no production event would have triggered it, but a replayed or hand-crafted message would.</w:t>
+      </w:r>
+    </w:p>
+    <w:p>
+      <w:pPr>
+        <w:pStyle w:val="BodyText"/>
+      </w:pPr>
+      <w:r>
+        <w:t xml:space="preserve">Playbook integrity is checked separately, on the principle that a malformed playbook should fail the build rather than the runtime. The check rejects duplicate identifiers, actions with no implementing handler, playbooks with no match criteria, and thresholds too small to constitute correlation.</w:t>
+      </w:r>
+    </w:p>
+    <w:p>
+      <w:pPr>
+        <w:pStyle w:val="BodyText"/>
+      </w:pPr>
+      <w:r>
+        <w:t xml:space="preserve">The AWS calls themselves are not unit tested. Mocking a cloud provider proves the mock works. That confidence comes from the end-to-end scripts, which run against the real environment and assert on real state changes.</w:t>
+      </w:r>
+    </w:p>
+    <w:bookmarkEnd w:id="56"/>
+    <w:bookmarkStart w:id="57" w:name="deployment-is-automatic-graded-by-risk"/>
+    <w:p>
+      <w:pPr>
+        <w:pStyle w:val="Heading3"/>
+      </w:pPr>
+      <w:r>
+        <w:t xml:space="preserve">Deployment is automatic, graded by risk</w:t>
+      </w:r>
+    </w:p>
+    <w:p>
+      <w:pPr>
+        <w:pStyle w:val="FirstParagraph"/>
+      </w:pPr>
+      <w:r>
+        <w:t xml:space="preserve">The pipeline applies infrastructure changes on merge without waiting for anyone, but only when the plan is additive. If the plan would destroy or replace any resource, the job routes through an environment that requires approval first.</w:t>
+      </w:r>
+    </w:p>
+    <w:p>
+      <w:pPr>
+        <w:pStyle w:val="BodyText"/>
+      </w:pPr>
+      <w:r>
+        <w:t xml:space="preserve">This resolves what initially looked like a conflict between two correct positions. Changes should deploy automatically, and a pipeline should never delete production infrastructure unattended. Those only contradict each other if risk is treated as uniform. Adding a Lambda function and destroying a Transit Gateway attachment are not the same event and do not warrant the same ceremony. The plan output already states which one is happening, so the pipeline reads it and behaves accordingly.</w:t>
+      </w:r>
+    </w:p>
+    <w:p>
+      <w:pPr>
+        <w:pStyle w:val="BodyText"/>
+      </w:pPr>
+      <w:r>
+        <w:t xml:space="preserve">In practice the changes made most often, a new playbook, an updated handler, an additional alert rule, deploy with no human involvement at all. The changes that could cause an outage stop and wait.</w:t>
+      </w:r>
+    </w:p>
+    <w:p>
+      <w:pPr>
+        <w:pStyle w:val="BodyText"/>
+      </w:pPr>
+      <w:r>
+        <w:t xml:space="preserve">The console pipeline has no gate at all. A container rollout is reversible in one command, the deployment sets</w:t>
+      </w:r>
+      <w:r>
+        <w:t xml:space="preserve"> </w:t>
+      </w:r>
+      <w:r>
+        <w:rPr>
+          <w:rStyle w:val="VerbatimChar"/>
+        </w:rPr>
+        <w:t xml:space="preserve">maxUnavailable: 0</w:t>
+      </w:r>
+      <w:r>
+        <w:t xml:space="preserve"> </w:t>
+      </w:r>
+      <w:r>
+        <w:t xml:space="preserve">so there is no gap in service, and the image is smoke tested on the runner before it is pushed.</w:t>
+      </w:r>
+    </w:p>
+    <w:bookmarkEnd w:id="57"/>
+    <w:bookmarkStart w:id="58" w:name="image-tagging"/>
+    <w:p>
+      <w:pPr>
+        <w:pStyle w:val="Heading3"/>
+      </w:pPr>
+      <w:r>
+        <w:t xml:space="preserve">Image tagging</w:t>
+      </w:r>
+    </w:p>
+    <w:p>
+      <w:pPr>
+        <w:pStyle w:val="FirstParagraph"/>
+      </w:pPr>
+      <w:r>
+        <w:t xml:space="preserve">Container images are tagged with the commit SHA rather than</w:t>
+      </w:r>
+      <w:r>
+        <w:t xml:space="preserve"> </w:t>
+      </w:r>
+      <w:r>
+        <w:rPr>
+          <w:rStyle w:val="VerbatimChar"/>
+        </w:rPr>
+        <w:t xml:space="preserve">latest</w:t>
+      </w:r>
+      <w:r>
+        <w:t xml:space="preserve">, for one operational reason and one practical one.</w:t>
+      </w:r>
+    </w:p>
+    <w:p>
+      <w:pPr>
+        <w:pStyle w:val="BodyText"/>
+      </w:pPr>
+      <w:r>
+        <w:t xml:space="preserve">The running revision can be traced back to a commit, which matters when something is behaving oddly and the question is what changed. And Kubernetes will not roll out a deployment whose image reference is unchanged, so a pipeline that always pushes</w:t>
+      </w:r>
+      <w:r>
+        <w:t xml:space="preserve"> </w:t>
+      </w:r>
+      <w:r>
+        <w:rPr>
+          <w:rStyle w:val="VerbatimChar"/>
+        </w:rPr>
+        <w:t xml:space="preserve">latest</w:t>
+      </w:r>
+      <w:r>
+        <w:t xml:space="preserve"> </w:t>
+      </w:r>
+      <w:r>
+        <w:t xml:space="preserve">appears to succeed while deploying nothing. After each rollout the pipeline asserts that the running image is the one it just built, which would catch that failure mode if it ever reappeared.</w:t>
+      </w:r>
+    </w:p>
+    <w:bookmarkEnd w:id="58"/>
+    <w:bookmarkStart w:id="59" w:name="deploying-the-observability-stack"/>
+    <w:p>
+      <w:pPr>
+        <w:pStyle w:val="Heading3"/>
+      </w:pPr>
+      <w:r>
+        <w:t xml:space="preserve">Deploying the observability stack</w:t>
+      </w:r>
+    </w:p>
+    <w:p>
+      <w:pPr>
+        <w:pStyle w:val="FirstParagraph"/>
+      </w:pPr>
+      <w:r>
+        <w:t xml:space="preserve">The Helm values for Prometheus, Alertmanager, Loki, Alloy, Grafana and cloudwatch-exporter are versioned files under</w:t>
+      </w:r>
+      <w:r>
+        <w:t xml:space="preserve"> </w:t>
+      </w:r>
+      <w:r>
+        <w:rPr>
+          <w:rStyle w:val="VerbatimChar"/>
+        </w:rPr>
+        <w:t xml:space="preserve">observability/values/</w:t>
+      </w:r>
+      <w:r>
+        <w:t xml:space="preserve">, and the alert rules are a manifest under</w:t>
+      </w:r>
+      <w:r>
+        <w:t xml:space="preserve"> </w:t>
+      </w:r>
+      <w:r>
+        <w:rPr>
+          <w:rStyle w:val="VerbatimChar"/>
+        </w:rPr>
+        <w:t xml:space="preserve">observability/manifests/</w:t>
+      </w:r>
+      <w:r>
+        <w:t xml:space="preserve">. The pipeline resolves environment-specific values from Terraform state, renders them, and applies them with</w:t>
+      </w:r>
+      <w:r>
+        <w:t xml:space="preserve"> </w:t>
+      </w:r>
+      <w:r>
+        <w:rPr>
+          <w:rStyle w:val="VerbatimChar"/>
+        </w:rPr>
+        <w:t xml:space="preserve">helm upgrade --install</w:t>
+      </w:r>
+      <w:r>
+        <w:t xml:space="preserve">.</w:t>
+      </w:r>
+    </w:p>
+    <w:p>
+      <w:pPr>
+        <w:pStyle w:val="BodyText"/>
+      </w:pPr>
+      <w:r>
+        <w:t xml:space="preserve">After deploying it verifies three things: that every pod in the namespace is Running, that the alert rules loaded, and that a POST from inside the cluster to the private SOAR ingest endpoint returns HTTP 200. That last check matters more than it looks. If Alertmanager cannot reach the ingest endpoint then the observability stack has stopped being part of the SOAR system, whatever its configuration says, and REQ-NCA-P2-09 is silently unmet. Verifying it on every deployment turns that from an assumption into a checked property.</w:t>
+      </w:r>
+    </w:p>
+    <w:p>
+      <w:pPr>
+        <w:pStyle w:val="BodyText"/>
+      </w:pPr>
+      <w:r>
+        <w:t xml:space="preserve">Terraform’s Helm provider was the alternative and is more literally infrastructure as code. It was not used because it needs to reach the Kubernetes API at plan time, which from a runner outside the VPC means carrying a kubeconfig through the bastion, and because it creates an ordering problem: the cluster and the workloads running on it would live in the same configuration and the same state. Helm driven by a pipeline against versioned values achieves the same reproducibility with fewer moving parts. Separating cluster and workload state, then adopting the provider, is the production recommendation.</w:t>
+      </w:r>
+    </w:p>
+    <w:bookmarkEnd w:id="59"/>
+    <w:bookmarkStart w:id="60" w:name="deploying-soar-to-the-container-platform"/>
+    <w:p>
+      <w:pPr>
+        <w:pStyle w:val="Heading3"/>
+      </w:pPr>
+      <w:r>
+        <w:t xml:space="preserve">Deploying SOAR to the container platform</w:t>
+      </w:r>
+    </w:p>
+    <w:p>
+      <w:pPr>
+        <w:pStyle w:val="FirstParagraph"/>
+      </w:pPr>
+      <w:r>
+        <w:t xml:space="preserve">The core assignment asks for SOAR components deployed to the container platform through CI/CD. The response pipeline itself runs on Lambda, for the reasons in Section 5.5, so the containerised component is the SOAR console: a read-only view of the operational record, built as an image, pushed to ECR, and rolled out to k3s by pipeline.</w:t>
+      </w:r>
+    </w:p>
+    <w:p>
+      <w:pPr>
+        <w:pStyle w:val="BodyText"/>
+      </w:pPr>
+      <w:r>
+        <w:t xml:space="preserve">It exists because that record lives across three DynamoDB tables and CloudWatch, and during an incident nobody wants four browser tabs open to answer what happened and what was done about it. It runs unprivileged with a read-only root filesystem, drops all capabilities, and holds no write permissions, so a flaw in the web layer cannot be used to release a quarantined host or lift a block.</w:t>
+      </w:r>
+    </w:p>
+    <w:p>
+      <w:r>
+        <w:br w:type="page"/>
+      </w:r>
+    </w:p>
+    <w:bookmarkEnd w:id="60"/>
+    <w:bookmarkEnd w:id="61"/>
+    <w:bookmarkEnd w:id="62"/>
+    <w:bookmarkStart w:id="63" w:name="failure-scenarios"/>
+    <w:p>
+      <w:pPr>
+        <w:pStyle w:val="Heading1"/>
+      </w:pPr>
+      <w:r>
+        <w:t xml:space="preserve">7. Failure scenarios</w:t>
+      </w:r>
+    </w:p>
+    <w:tbl>
+      <w:tblPr>
+        <w:tblStyle w:val="Table"/>
+        <w:tblW w:type="pct" w:w="5000"/>
+        <w:tblLook w:firstRow="1" w:lastRow="0" w:firstColumn="0" w:lastColumn="0" w:noHBand="0" w:noVBand="0" w:val="0020"/>
+        <w:jc w:val="start"/>
+      </w:tblPr>
+      <w:tblGrid>
+        <w:gridCol w:w="2640"/>
+        <w:gridCol w:w="2640"/>
+        <w:gridCol w:w="2640"/>
+      </w:tblGrid>
+      <w:tr>
+        <w:trPr>
+          <w:tblHeader w:val="true"/>
+        </w:trPr>
+        <w:tc>
+          <w:tcPr/>
+          <w:p>
+            <w:pPr>
+              <w:pStyle w:val="Compact"/>
+              <w:jc w:val="left"/>
+            </w:pPr>
+            <w:r>
               <w:t xml:space="preserve">Scenario</w:t>
             </w:r>
           </w:p>
@@ -6116,8 +6598,8 @@
         <w:br w:type="page"/>
       </w:r>
     </w:p>
-    <w:bookmarkEnd w:id="60"/>
-    <w:bookmarkStart w:id="64" w:name="decisions-taken-under-constraint"/>
+    <w:bookmarkEnd w:id="63"/>
+    <w:bookmarkStart w:id="67" w:name="decisions-taken-under-constraint"/>
     <w:p>
       <w:pPr>
         <w:pStyle w:val="Heading1"/>
@@ -6134,7 +6616,7 @@
         <w:t xml:space="preserve">Three significant design decisions were forced by constraints discovered during implementation rather than chosen freely. They are recorded here because the reasoning is part of the design.</w:t>
       </w:r>
     </w:p>
-    <w:bookmarkStart w:id="61" w:name="k3s-instead-of-eks"/>
+    <w:bookmarkStart w:id="64" w:name="k3s-instead-of-eks"/>
     <w:p>
       <w:pPr>
         <w:pStyle w:val="Heading2"/>
@@ -6163,8 +6645,8 @@
         <w:t xml:space="preserve">. This was found by probing the account before designing, not by hitting it during deployment. k3s on EC2 is CNCF-conformant, so the workload remains portable; the difference is that the control plane is self-managed rather than managed.</w:t>
       </w:r>
     </w:p>
-    <w:bookmarkEnd w:id="61"/>
-    <w:bookmarkStart w:id="62" w:name="X348368fae208ab7a7823e02f796da62e3186d3b"/>
+    <w:bookmarkEnd w:id="64"/>
+    <w:bookmarkStart w:id="65" w:name="X348368fae208ab7a7823e02f796da62e3186d3b"/>
     <w:p>
       <w:pPr>
         <w:pStyle w:val="Heading2"/>
@@ -6256,8 +6738,8 @@
         <w:t xml:space="preserve">PostgreSQL instance was always the weaker choice; the policy simply forced the stronger one. SOAR operational state moved to DynamoDB, which suits it better anyway. Events are written once and read by key, with no joins.</w:t>
       </w:r>
     </w:p>
-    <w:bookmarkEnd w:id="62"/>
-    <w:bookmarkStart w:id="63" w:name="Xe92ecc1338b76b4a21367e33c1195b0b2cb6cad"/>
+    <w:bookmarkEnd w:id="65"/>
+    <w:bookmarkStart w:id="66" w:name="Xe92ecc1338b76b4a21367e33c1195b0b2cb6cad"/>
     <w:p>
       <w:pPr>
         <w:pStyle w:val="Heading2"/>
@@ -6326,9 +6808,9 @@
         <w:br w:type="page"/>
       </w:r>
     </w:p>
-    <w:bookmarkEnd w:id="63"/>
-    <w:bookmarkEnd w:id="64"/>
-    <w:bookmarkStart w:id="65" w:name="cost"/>
+    <w:bookmarkEnd w:id="66"/>
+    <w:bookmarkEnd w:id="67"/>
+    <w:bookmarkStart w:id="68" w:name="cost"/>
     <w:p>
       <w:pPr>
         <w:pStyle w:val="Heading1"/>
@@ -6615,8 +7097,8 @@
         <w:br w:type="page"/>
       </w:r>
     </w:p>
-    <w:bookmarkEnd w:id="65"/>
-    <w:bookmarkStart w:id="66" w:name="recommendations"/>
+    <w:bookmarkEnd w:id="68"/>
+    <w:bookmarkStart w:id="69" w:name="recommendations"/>
     <w:p>
       <w:pPr>
         <w:pStyle w:val="Heading1"/>
@@ -6780,7 +7262,7 @@
         <w:t xml:space="preserve">metric, which shows which real events currently have no automated response.</w:t>
       </w:r>
     </w:p>
-    <w:bookmarkEnd w:id="66"/>
+    <w:bookmarkEnd w:id="69"/>
     <w:sectPr/>
   </w:body>
 </w:document>

</xml_diff>

<commit_message>
Embed evidence screenshots as captioned figures
</commit_message>
<xml_diff>
--- a/docs/01-design-document.docx
+++ b/docs/01-design-document.docx
@@ -603,7 +603,7 @@
               <w:jc w:val="left"/>
             </w:pPr>
             <w:r>
-              <w:t xml:space="preserve">3.4, 5.3</w:t>
+              <w:t xml:space="preserve">3.4, 5.4</w:t>
             </w:r>
           </w:p>
         </w:tc>
@@ -681,7 +681,7 @@
               <w:jc w:val="left"/>
             </w:pPr>
             <w:r>
-              <w:t xml:space="preserve">5.1, 5.2</w:t>
+              <w:t xml:space="preserve">5.1, 5.2, 5.3</w:t>
             </w:r>
           </w:p>
         </w:tc>
@@ -707,7 +707,7 @@
               <w:jc w:val="left"/>
             </w:pPr>
             <w:r>
-              <w:t xml:space="preserve">5.4</w:t>
+              <w:t xml:space="preserve">5.5</w:t>
             </w:r>
           </w:p>
         </w:tc>
@@ -1072,14 +1072,14 @@
     </w:p>
     <w:p>
       <w:pPr>
-        <w:pStyle w:val="CaptionedFigure"/>
+        <w:pStyle w:val="FirstParagraph"/>
       </w:pPr>
       <w:r>
         <w:drawing>
           <wp:inline>
-            <wp:extent cx="5334000" cy="3888716"/>
+            <wp:extent cx="5334000" cy="4001610"/>
             <wp:effectExtent b="0" l="0" r="0" t="0"/>
-            <wp:docPr descr="Network architecture" title="" id="28" name="Picture"/>
+            <wp:docPr descr="" title="" id="28" name="Picture"/>
             <a:graphic>
               <a:graphicData uri="http://schemas.openxmlformats.org/drawingml/2006/picture">
                 <pic:pic>
@@ -1098,7 +1098,7 @@
                   <pic:spPr bwMode="auto">
                     <a:xfrm>
                       <a:off x="0" y="0"/>
-                      <a:ext cx="5334000" cy="3888716"/>
+                      <a:ext cx="5334000" cy="4001610"/>
                     </a:xfrm>
                     <a:prstGeom prst="rect">
                       <a:avLst/>
@@ -1119,10 +1119,36 @@
     </w:p>
     <w:p>
       <w:pPr>
-        <w:pStyle w:val="ImageCaption"/>
-      </w:pPr>
-      <w:r>
-        <w:t xml:space="preserve">Network architecture</w:t>
+        <w:pStyle w:val="BodyText"/>
+      </w:pPr>
+      <w:r>
+        <w:rPr>
+          <w:iCs/>
+          <w:i/>
+        </w:rPr>
+        <w:t xml:space="preserve">Figure 1: as-built architecture. Note that</w:t>
+      </w:r>
+      <w:r>
+        <w:rPr>
+          <w:iCs/>
+          <w:i/>
+        </w:rPr>
+        <w:t xml:space="preserve"> </w:t>
+      </w:r>
+      <w:r>
+        <w:rPr>
+          <w:rStyle w:val="VerbatimChar"/>
+          <w:iCs/>
+          <w:i/>
+        </w:rPr>
+        <w:t xml:space="preserve">corp-server</w:t>
+      </w:r>
+      <w:r>
+        <w:rPr>
+          <w:iCs/>
+          <w:i/>
+        </w:rPr>
+        <w:t xml:space="preserve">, the on-premises event source, is a simulated host inside the platform spoke rather than physical hardware on the 192.168.100.0/24 network. That network is designed and routed for, but no physical machine was joined within the project window, and it is drawn dashed for that reason.</w:t>
       </w:r>
     </w:p>
     <w:bookmarkStart w:id="30" w:name="address-plan"/>
@@ -2642,7 +2668,7 @@
     </w:p>
     <w:bookmarkEnd w:id="36"/>
     <w:bookmarkEnd w:id="37"/>
-    <w:bookmarkStart w:id="43" w:name="observability"/>
+    <w:bookmarkStart w:id="49" w:name="observability"/>
     <w:p>
       <w:pPr>
         <w:pStyle w:val="Heading1"/>
@@ -3323,7 +3349,7 @@
       </w:r>
     </w:p>
     <w:bookmarkEnd w:id="40"/>
-    <w:bookmarkStart w:id="42" w:name="soar-observability-req-nca-p2-08"/>
+    <w:bookmarkStart w:id="48" w:name="soar-observability-req-nca-p2-08"/>
     <w:p>
       <w:pPr>
         <w:pStyle w:val="Heading2"/>
@@ -3837,7 +3863,7 @@
         <w:t xml:space="preserve">, messages parked in either dead-letter queue</w:t>
       </w:r>
     </w:p>
-    <w:bookmarkStart w:id="41" w:name="dashboard-layout"/>
+    <w:bookmarkStart w:id="47" w:name="dashboard-layout"/>
     <w:p>
       <w:pPr>
         <w:pStyle w:val="Heading3"/>
@@ -3985,52 +4011,166 @@
       </w:r>
     </w:p>
     <w:p>
-      <w:r>
-        <w:br w:type="page"/>
-      </w:r>
-    </w:p>
-    <w:bookmarkEnd w:id="41"/>
-    <w:bookmarkEnd w:id="42"/>
-    <w:bookmarkEnd w:id="43"/>
-    <w:bookmarkStart w:id="53" w:name="soar-system-design"/>
-    <w:p>
-      <w:pPr>
-        <w:pStyle w:val="Heading1"/>
-      </w:pPr>
-      <w:r>
-        <w:t xml:space="preserve">5. SOAR system design</w:t>
-      </w:r>
-    </w:p>
-    <w:bookmarkStart w:id="47" w:name="event-driven-architecture-req-nca-p2-06"/>
-    <w:p>
-      <w:pPr>
-        <w:pStyle w:val="Heading2"/>
-      </w:pPr>
-      <w:r>
-        <w:t xml:space="preserve">5.1 Event-driven architecture (REQ-NCA-P2-06)</w:t>
-      </w:r>
-    </w:p>
-    <w:p>
-      <w:pPr>
-        <w:pStyle w:val="CaptionedFigure"/>
+      <w:pPr>
+        <w:pStyle w:val="BodyText"/>
       </w:pPr>
       <w:r>
         <w:drawing>
           <wp:inline>
-            <wp:extent cx="5334000" cy="3307080"/>
+            <wp:extent cx="5334000" cy="2978039"/>
             <wp:effectExtent b="0" l="0" r="0" t="0"/>
-            <wp:docPr descr="SOAR event pipeline" title="" id="45" name="Picture"/>
+            <wp:docPr descr="" title="" id="42" name="Picture"/>
             <a:graphic>
               <a:graphicData uri="http://schemas.openxmlformats.org/drawingml/2006/picture">
                 <pic:pic>
                   <pic:nvPicPr>
-                    <pic:cNvPr descr="diagrams/soar-pipeline.png" id="46" name="Picture"/>
+                    <pic:cNvPr descr="evidence/o04-soar-dashboard.png" id="43" name="Picture"/>
+                    <pic:cNvPicPr>
+                      <a:picLocks noChangeArrowheads="1" noChangeAspect="1"/>
+                    </pic:cNvPicPr>
+                  </pic:nvPicPr>
+                  <pic:blipFill>
+                    <a:blip r:embed="rId41"/>
+                    <a:stretch>
+                      <a:fillRect/>
+                    </a:stretch>
+                  </pic:blipFill>
+                  <pic:spPr bwMode="auto">
+                    <a:xfrm>
+                      <a:off x="0" y="0"/>
+                      <a:ext cx="5334000" cy="2978039"/>
+                    </a:xfrm>
+                    <a:prstGeom prst="rect">
+                      <a:avLst/>
+                    </a:prstGeom>
+                    <a:noFill/>
+                    <a:ln w="9525">
+                      <a:noFill/>
+                      <a:headEnd/>
+                      <a:tailEnd/>
+                    </a:ln>
+                  </pic:spPr>
+                </pic:pic>
+              </a:graphicData>
+            </a:graphic>
+          </wp:inline>
+        </w:drawing>
+      </w:r>
+    </w:p>
+    <w:p>
+      <w:pPr>
+        <w:pStyle w:val="BodyText"/>
+      </w:pPr>
+      <w:r>
+        <w:drawing>
+          <wp:inline>
+            <wp:extent cx="5334000" cy="2801973"/>
+            <wp:effectExtent b="0" l="0" r="0" t="0"/>
+            <wp:docPr descr="" title="" id="45" name="Picture"/>
+            <a:graphic>
+              <a:graphicData uri="http://schemas.openxmlformats.org/drawingml/2006/picture">
+                <pic:pic>
+                  <pic:nvPicPr>
+                    <pic:cNvPr descr="evidence/o04-soar-dashboard-pt2.png" id="46" name="Picture"/>
                     <pic:cNvPicPr>
                       <a:picLocks noChangeArrowheads="1" noChangeAspect="1"/>
                     </pic:cNvPicPr>
                   </pic:nvPicPr>
                   <pic:blipFill>
                     <a:blip r:embed="rId44"/>
+                    <a:stretch>
+                      <a:fillRect/>
+                    </a:stretch>
+                  </pic:blipFill>
+                  <pic:spPr bwMode="auto">
+                    <a:xfrm>
+                      <a:off x="0" y="0"/>
+                      <a:ext cx="5334000" cy="2801973"/>
+                    </a:xfrm>
+                    <a:prstGeom prst="rect">
+                      <a:avLst/>
+                    </a:prstGeom>
+                    <a:noFill/>
+                    <a:ln w="9525">
+                      <a:noFill/>
+                      <a:headEnd/>
+                      <a:tailEnd/>
+                    </a:ln>
+                  </pic:spPr>
+                </pic:pic>
+              </a:graphicData>
+            </a:graphic>
+          </wp:inline>
+        </w:drawing>
+      </w:r>
+    </w:p>
+    <w:p>
+      <w:pPr>
+        <w:pStyle w:val="BodyText"/>
+      </w:pPr>
+      <w:r>
+        <w:rPr>
+          <w:iCs/>
+          <w:i/>
+        </w:rPr>
+        <w:t xml:space="preserve">Figures 16 and 17: the SOAR Operations dashboard with real data. The non-zero failure and refusal counters are not defects in the capture. Three failures are the authorisation regression described in the test results, and two refusals are the idempotency guard declining to re-block an address already blocked. Both are recorded here deliberately: a dashboard that has only ever shown zeros has not been shown to work. The scrape target panel at the bottom includes the on-premises server, so the machine that reports intrusions is itself monitored.</w:t>
+      </w:r>
+    </w:p>
+    <w:p>
+      <w:pPr>
+        <w:pStyle w:val="BodyText"/>
+      </w:pPr>
+      <w:r>
+        <w:t xml:space="preserve">The counters for failures and refusals are placed alongside the success counters rather than hidden on a separate page, because a dashboard that only shows good news is not a monitoring tool. During this project the failure counter is what made a reverted IAM permission visible, and the refusal counter is what distinguishes a safety guard declining to act from the system doing nothing at all. Both are expected to be non-zero at times, and an operator who has never seen either move does not know what they look like.</w:t>
+      </w:r>
+    </w:p>
+    <w:p>
+      <w:r>
+        <w:br w:type="page"/>
+      </w:r>
+    </w:p>
+    <w:bookmarkEnd w:id="47"/>
+    <w:bookmarkEnd w:id="48"/>
+    <w:bookmarkEnd w:id="49"/>
+    <w:bookmarkStart w:id="59" w:name="soar-system-design"/>
+    <w:p>
+      <w:pPr>
+        <w:pStyle w:val="Heading1"/>
+      </w:pPr>
+      <w:r>
+        <w:t xml:space="preserve">5. SOAR system design</w:t>
+      </w:r>
+    </w:p>
+    <w:bookmarkStart w:id="53" w:name="event-driven-architecture-req-nca-p2-06"/>
+    <w:p>
+      <w:pPr>
+        <w:pStyle w:val="Heading2"/>
+      </w:pPr>
+      <w:r>
+        <w:t xml:space="preserve">5.1 Event-driven architecture (REQ-NCA-P2-06)</w:t>
+      </w:r>
+    </w:p>
+    <w:p>
+      <w:pPr>
+        <w:pStyle w:val="FirstParagraph"/>
+      </w:pPr>
+      <w:r>
+        <w:drawing>
+          <wp:inline>
+            <wp:extent cx="5334000" cy="3307080"/>
+            <wp:effectExtent b="0" l="0" r="0" t="0"/>
+            <wp:docPr descr="" title="" id="51" name="Picture"/>
+            <a:graphic>
+              <a:graphicData uri="http://schemas.openxmlformats.org/drawingml/2006/picture">
+                <pic:pic>
+                  <pic:nvPicPr>
+                    <pic:cNvPr descr="diagrams/soar-pipeline.png" id="52" name="Picture"/>
+                    <pic:cNvPicPr>
+                      <a:picLocks noChangeArrowheads="1" noChangeAspect="1"/>
+                    </pic:cNvPicPr>
+                  </pic:nvPicPr>
+                  <pic:blipFill>
+                    <a:blip r:embed="rId50"/>
                     <a:stretch>
                       <a:fillRect/>
                     </a:stretch>
@@ -4057,14 +4197,6 @@
         </w:drawing>
       </w:r>
     </w:p>
-    <w:p>
-      <w:pPr>
-        <w:pStyle w:val="ImageCaption"/>
-      </w:pPr>
-      <w:r>
-        <w:t xml:space="preserve">SOAR event pipeline</w:t>
-      </w:r>
-    </w:p>
     <w:tbl>
       <w:tblPr>
         <w:tblStyle w:val="Table"/>
@@ -4371,8 +4503,8 @@
         <w:t xml:space="preserve">EventBridge retries dispatch twice with a five-minute maximum age, and undeliverable actions land in a dead-letter queue rather than disappearing.</w:t>
       </w:r>
     </w:p>
-    <w:bookmarkEnd w:id="47"/>
-    <w:bookmarkStart w:id="48" w:name="event-sources"/>
+    <w:bookmarkEnd w:id="53"/>
+    <w:bookmarkStart w:id="54" w:name="event-sources"/>
     <w:p>
       <w:pPr>
         <w:pStyle w:val="Heading2"/>
@@ -4648,8 +4780,8 @@
         <w:t xml:space="preserve">fires for it in the same way as for a cloud host. A server that produces security events while being invisible to monitoring is a gap an operator only discovers during an incident.</w:t>
       </w:r>
     </w:p>
-    <w:bookmarkEnd w:id="48"/>
-    <w:bookmarkStart w:id="49" w:name="event-normalisation"/>
+    <w:bookmarkEnd w:id="54"/>
+    <w:bookmarkStart w:id="55" w:name="event-normalisation"/>
     <w:p>
       <w:pPr>
         <w:pStyle w:val="Heading2"/>
@@ -5105,8 +5237,8 @@
         <w:t xml:space="preserve">rather than discarded. An event nobody has written a rule for yet is a gap in coverage, not noise.</w:t>
       </w:r>
     </w:p>
-    <w:bookmarkEnd w:id="49"/>
-    <w:bookmarkStart w:id="50" w:name="ingest-path"/>
+    <w:bookmarkEnd w:id="55"/>
+    <w:bookmarkStart w:id="56" w:name="ingest-path"/>
     <w:p>
       <w:pPr>
         <w:pStyle w:val="Heading2"/>
@@ -5147,8 +5279,8 @@
         <w:t xml:space="preserve">The SQS queue between collector and rule engine provides three things: burst absorption during an attack, durability if the rule engine is unavailable, and a dead-letter queue where repeatedly failing events can be inspected rather than lost.</w:t>
       </w:r>
     </w:p>
-    <w:bookmarkEnd w:id="50"/>
-    <w:bookmarkStart w:id="51" w:name="serverless-justification-req-nca-p2-07"/>
+    <w:bookmarkEnd w:id="56"/>
+    <w:bookmarkStart w:id="57" w:name="serverless-justification-req-nca-p2-07"/>
     <w:p>
       <w:pPr>
         <w:pStyle w:val="Heading2"/>
@@ -5240,8 +5372,8 @@
         <w:t xml:space="preserve">the VPC deliberately. They call only AWS APIs, never resources inside a subnet, so VPC attachment would add elastic network interface cold-start latency and a NAT dependency for no security gain.</w:t>
       </w:r>
     </w:p>
-    <w:bookmarkEnd w:id="51"/>
-    <w:bookmarkStart w:id="52" w:name="least-privilege"/>
+    <w:bookmarkEnd w:id="57"/>
+    <w:bookmarkStart w:id="58" w:name="least-privilege"/>
     <w:p>
       <w:pPr>
         <w:pStyle w:val="Heading2"/>
@@ -5377,9 +5509,9 @@
         <w:br w:type="page"/>
       </w:r>
     </w:p>
-    <w:bookmarkEnd w:id="52"/>
-    <w:bookmarkEnd w:id="53"/>
-    <w:bookmarkStart w:id="62" w:name="deployment-and-automation"/>
+    <w:bookmarkEnd w:id="58"/>
+    <w:bookmarkEnd w:id="59"/>
+    <w:bookmarkStart w:id="80" w:name="deployment-and-automation"/>
     <w:p>
       <w:pPr>
         <w:pStyle w:val="Heading1"/>
@@ -5388,7 +5520,7 @@
         <w:t xml:space="preserve">6. Deployment and automation</w:t>
       </w:r>
     </w:p>
-    <w:bookmarkStart w:id="54" w:name="infrastructure-as-code-req-nca-p2-10"/>
+    <w:bookmarkStart w:id="60" w:name="infrastructure-as-code-req-nca-p2-10"/>
     <w:p>
       <w:pPr>
         <w:pStyle w:val="Heading2"/>
@@ -5463,8 +5595,8 @@
         <w:t xml:space="preserve">; the replacement node built itself from the same definition and came up healthy.</w:t>
       </w:r>
     </w:p>
-    <w:bookmarkEnd w:id="54"/>
-    <w:bookmarkStart w:id="61" w:name="X84e8fa2cec28c5a6ca850fb325cee2f916532f9"/>
+    <w:bookmarkEnd w:id="60"/>
+    <w:bookmarkStart w:id="79" w:name="X84e8fa2cec28c5a6ca850fb325cee2f916532f9"/>
     <w:p>
       <w:pPr>
         <w:pStyle w:val="Heading2"/>
@@ -5733,7 +5865,7 @@
         </w:tc>
       </w:tr>
     </w:tbl>
-    <w:bookmarkStart w:id="55" w:name="the-three-pipelines"/>
+    <w:bookmarkStart w:id="64" w:name="the-three-pipelines"/>
     <w:p>
       <w:pPr>
         <w:pStyle w:val="Heading3"/>
@@ -6004,11 +6136,70 @@
         <w:pStyle w:val="BodyText"/>
       </w:pPr>
       <w:r>
+        <w:drawing>
+          <wp:inline>
+            <wp:extent cx="2194560" cy="1643833"/>
+            <wp:effectExtent b="0" l="0" r="0" t="0"/>
+            <wp:docPr descr="" title="" id="62" name="Picture"/>
+            <a:graphic>
+              <a:graphicData uri="http://schemas.openxmlformats.org/drawingml/2006/picture">
+                <pic:pic>
+                  <pic:nvPicPr>
+                    <pic:cNvPr descr="evidence/p01-workflows-list.png" id="63" name="Picture"/>
+                    <pic:cNvPicPr>
+                      <a:picLocks noChangeArrowheads="1" noChangeAspect="1"/>
+                    </pic:cNvPicPr>
+                  </pic:nvPicPr>
+                  <pic:blipFill>
+                    <a:blip r:embed="rId61"/>
+                    <a:stretch>
+                      <a:fillRect/>
+                    </a:stretch>
+                  </pic:blipFill>
+                  <pic:spPr bwMode="auto">
+                    <a:xfrm>
+                      <a:off x="0" y="0"/>
+                      <a:ext cx="2194560" cy="1643833"/>
+                    </a:xfrm>
+                    <a:prstGeom prst="rect">
+                      <a:avLst/>
+                    </a:prstGeom>
+                    <a:noFill/>
+                    <a:ln w="9525">
+                      <a:noFill/>
+                      <a:headEnd/>
+                      <a:tailEnd/>
+                    </a:ln>
+                  </pic:spPr>
+                </pic:pic>
+              </a:graphicData>
+            </a:graphic>
+          </wp:inline>
+        </w:drawing>
+      </w:r>
+    </w:p>
+    <w:p>
+      <w:pPr>
+        <w:pStyle w:val="BodyText"/>
+      </w:pPr>
+      <w:r>
+        <w:rPr>
+          <w:iCs/>
+          <w:i/>
+        </w:rPr>
+        <w:t xml:space="preserve">Figure 19: the four pipelines. Between them they cover every deployable part of the system.</w:t>
+      </w:r>
+    </w:p>
+    <w:p>
+      <w:pPr>
+        <w:pStyle w:val="BodyText"/>
+      </w:pPr>
+      <w:r>
         <w:t xml:space="preserve">Between them these cover every deployable part of the system. The only step that remains manual is approving a plan that would destroy a resource, and that is manual deliberately.</w:t>
       </w:r>
     </w:p>
-    <w:bookmarkEnd w:id="55"/>
-    <w:bookmarkStart w:id="56" w:name="testing"/>
+    <w:bookmarkEnd w:id="64"/>
+    <w:bookmarkStart w:id="65" w:name="testing"/>
     <w:p>
       <w:pPr>
         <w:pStyle w:val="Heading3"/>
@@ -6049,8 +6240,8 @@
         <w:t xml:space="preserve">The AWS calls themselves are not unit tested. Mocking a cloud provider proves the mock works. That confidence comes from the end-to-end scripts, which run against the real environment and assert on real state changes.</w:t>
       </w:r>
     </w:p>
-    <w:bookmarkEnd w:id="56"/>
-    <w:bookmarkStart w:id="57" w:name="deployment-is-automatic-graded-by-risk"/>
+    <w:bookmarkEnd w:id="65"/>
+    <w:bookmarkStart w:id="72" w:name="deployment-is-automatic-graded-by-risk"/>
     <w:p>
       <w:pPr>
         <w:pStyle w:val="Heading3"/>
@@ -6088,6 +6279,124 @@
         <w:pStyle w:val="BodyText"/>
       </w:pPr>
       <w:r>
+        <w:drawing>
+          <wp:inline>
+            <wp:extent cx="5334000" cy="1018215"/>
+            <wp:effectExtent b="0" l="0" r="0" t="0"/>
+            <wp:docPr descr="" title="" id="67" name="Picture"/>
+            <a:graphic>
+              <a:graphicData uri="http://schemas.openxmlformats.org/drawingml/2006/picture">
+                <pic:pic>
+                  <pic:nvPicPr>
+                    <pic:cNvPr descr="evidence/p02-run-list.png" id="68" name="Picture"/>
+                    <pic:cNvPicPr>
+                      <a:picLocks noChangeArrowheads="1" noChangeAspect="1"/>
+                    </pic:cNvPicPr>
+                  </pic:nvPicPr>
+                  <pic:blipFill>
+                    <a:blip r:embed="rId66"/>
+                    <a:stretch>
+                      <a:fillRect/>
+                    </a:stretch>
+                  </pic:blipFill>
+                  <pic:spPr bwMode="auto">
+                    <a:xfrm>
+                      <a:off x="0" y="0"/>
+                      <a:ext cx="5334000" cy="1018215"/>
+                    </a:xfrm>
+                    <a:prstGeom prst="rect">
+                      <a:avLst/>
+                    </a:prstGeom>
+                    <a:noFill/>
+                    <a:ln w="9525">
+                      <a:noFill/>
+                      <a:headEnd/>
+                      <a:tailEnd/>
+                    </a:ln>
+                  </pic:spPr>
+                </pic:pic>
+              </a:graphicData>
+            </a:graphic>
+          </wp:inline>
+        </w:drawing>
+      </w:r>
+    </w:p>
+    <w:p>
+      <w:pPr>
+        <w:pStyle w:val="BodyText"/>
+      </w:pPr>
+      <w:r>
+        <w:rPr>
+          <w:iCs/>
+          <w:i/>
+        </w:rPr>
+        <w:t xml:space="preserve">Figure 20: the grading in one frame. From a single commit, SOAR CI and SOAR Console deployed on their own, while Infrastructure stopped and waited. The difference is not the pipeline; it is what the plan contained.</w:t>
+      </w:r>
+    </w:p>
+    <w:p>
+      <w:pPr>
+        <w:pStyle w:val="BodyText"/>
+      </w:pPr>
+      <w:r>
+        <w:drawing>
+          <wp:inline>
+            <wp:extent cx="5120640" cy="2509391"/>
+            <wp:effectExtent b="0" l="0" r="0" t="0"/>
+            <wp:docPr descr="" title="" id="70" name="Picture"/>
+            <a:graphic>
+              <a:graphicData uri="http://schemas.openxmlformats.org/drawingml/2006/picture">
+                <pic:pic>
+                  <pic:nvPicPr>
+                    <pic:cNvPr descr="evidence/p03-approval-prompt.png" id="71" name="Picture"/>
+                    <pic:cNvPicPr>
+                      <a:picLocks noChangeArrowheads="1" noChangeAspect="1"/>
+                    </pic:cNvPicPr>
+                  </pic:nvPicPr>
+                  <pic:blipFill>
+                    <a:blip r:embed="rId69"/>
+                    <a:stretch>
+                      <a:fillRect/>
+                    </a:stretch>
+                  </pic:blipFill>
+                  <pic:spPr bwMode="auto">
+                    <a:xfrm>
+                      <a:off x="0" y="0"/>
+                      <a:ext cx="5120640" cy="2509391"/>
+                    </a:xfrm>
+                    <a:prstGeom prst="rect">
+                      <a:avLst/>
+                    </a:prstGeom>
+                    <a:noFill/>
+                    <a:ln w="9525">
+                      <a:noFill/>
+                      <a:headEnd/>
+                      <a:tailEnd/>
+                    </a:ln>
+                  </pic:spPr>
+                </pic:pic>
+              </a:graphicData>
+            </a:graphic>
+          </wp:inline>
+        </w:drawing>
+      </w:r>
+    </w:p>
+    <w:p>
+      <w:pPr>
+        <w:pStyle w:val="BodyText"/>
+      </w:pPr>
+      <w:r>
+        <w:rPr>
+          <w:iCs/>
+          <w:i/>
+        </w:rPr>
+        <w:t xml:space="preserve">Figure 21: why that run stopped. The plan replaces two EC2 instances, so it routed to an environment requiring review rather than applying unattended. The reviewer sees the plan summary before deciding.</w:t>
+      </w:r>
+    </w:p>
+    <w:p>
+      <w:pPr>
+        <w:pStyle w:val="BodyText"/>
+      </w:pPr>
+      <w:r>
         <w:t xml:space="preserve">The console pipeline has no gate at all. A container rollout is reversible in one command, the deployment sets</w:t>
       </w:r>
       <w:r>
@@ -6106,8 +6415,8 @@
         <w:t xml:space="preserve">so there is no gap in service, and the image is smoke tested on the runner before it is pushed.</w:t>
       </w:r>
     </w:p>
-    <w:bookmarkEnd w:id="57"/>
-    <w:bookmarkStart w:id="58" w:name="image-tagging"/>
+    <w:bookmarkEnd w:id="72"/>
+    <w:bookmarkStart w:id="73" w:name="image-tagging"/>
     <w:p>
       <w:pPr>
         <w:pStyle w:val="Heading3"/>
@@ -6159,8 +6468,8 @@
         <w:t xml:space="preserve">appears to succeed while deploying nothing. After each rollout the pipeline asserts that the running image is the one it just built, which would catch that failure mode if it ever reappeared.</w:t>
       </w:r>
     </w:p>
-    <w:bookmarkEnd w:id="58"/>
-    <w:bookmarkStart w:id="59" w:name="deploying-the-observability-stack"/>
+    <w:bookmarkEnd w:id="73"/>
+    <w:bookmarkStart w:id="74" w:name="deploying-the-observability-stack"/>
     <w:p>
       <w:pPr>
         <w:pStyle w:val="Heading3"/>
@@ -6229,8 +6538,8 @@
         <w:t xml:space="preserve">Terraform’s Helm provider was the alternative and is more literally infrastructure as code. It was not used because it needs to reach the Kubernetes API at plan time, which from a runner outside the VPC means carrying a kubeconfig through the bastion, and because it creates an ordering problem: the cluster and the workloads running on it would live in the same configuration and the same state. Helm driven by a pipeline against versioned values achieves the same reproducibility with fewer moving parts. Separating cluster and workload state, then adopting the provider, is the production recommendation.</w:t>
       </w:r>
     </w:p>
-    <w:bookmarkEnd w:id="59"/>
-    <w:bookmarkStart w:id="60" w:name="deploying-soar-to-the-container-platform"/>
+    <w:bookmarkEnd w:id="74"/>
+    <w:bookmarkStart w:id="78" w:name="deploying-soar-to-the-container-platform"/>
     <w:p>
       <w:pPr>
         <w:pStyle w:val="Heading3"/>
@@ -6256,14 +6565,108 @@
       </w:r>
     </w:p>
     <w:p>
+      <w:pPr>
+        <w:pStyle w:val="BodyText"/>
+      </w:pPr>
+      <w:r>
+        <w:drawing>
+          <wp:inline>
+            <wp:extent cx="5334000" cy="4334173"/>
+            <wp:effectExtent b="0" l="0" r="0" t="0"/>
+            <wp:docPr descr="" title="" id="76" name="Picture"/>
+            <a:graphic>
+              <a:graphicData uri="http://schemas.openxmlformats.org/drawingml/2006/picture">
+                <pic:pic>
+                  <pic:nvPicPr>
+                    <pic:cNvPr descr="evidence/p06-soar-console.png" id="77" name="Picture"/>
+                    <pic:cNvPicPr>
+                      <a:picLocks noChangeArrowheads="1" noChangeAspect="1"/>
+                    </pic:cNvPicPr>
+                  </pic:nvPicPr>
+                  <pic:blipFill>
+                    <a:blip r:embed="rId75"/>
+                    <a:stretch>
+                      <a:fillRect/>
+                    </a:stretch>
+                  </pic:blipFill>
+                  <pic:spPr bwMode="auto">
+                    <a:xfrm>
+                      <a:off x="0" y="0"/>
+                      <a:ext cx="5334000" cy="4334173"/>
+                    </a:xfrm>
+                    <a:prstGeom prst="rect">
+                      <a:avLst/>
+                    </a:prstGeom>
+                    <a:noFill/>
+                    <a:ln w="9525">
+                      <a:noFill/>
+                      <a:headEnd/>
+                      <a:tailEnd/>
+                    </a:ln>
+                  </pic:spPr>
+                </pic:pic>
+              </a:graphicData>
+            </a:graphic>
+          </wp:inline>
+        </w:drawing>
+      </w:r>
+    </w:p>
+    <w:p>
+      <w:pPr>
+        <w:pStyle w:val="BodyText"/>
+      </w:pPr>
+      <w:r>
+        <w:rPr>
+          <w:iCs/>
+          <w:i/>
+        </w:rPr>
+        <w:t xml:space="preserve">Figure 18: the console. Active blocks, quarantined hosts and recent events in one view. The block shown has status</w:t>
+      </w:r>
+      <w:r>
+        <w:rPr>
+          <w:iCs/>
+          <w:i/>
+        </w:rPr>
+        <w:t xml:space="preserve"> </w:t>
+      </w:r>
+      <w:r>
+        <w:rPr>
+          <w:iCs/>
+          <w:i/>
+        </w:rPr>
+        <w:t xml:space="preserve">“</w:t>
+      </w:r>
+      <w:r>
+        <w:rPr>
+          <w:iCs/>
+          <w:i/>
+        </w:rPr>
+        <w:t xml:space="preserve">expired</w:t>
+      </w:r>
+      <w:r>
+        <w:rPr>
+          <w:iCs/>
+          <w:i/>
+        </w:rPr>
+        <w:t xml:space="preserve">”</w:t>
+      </w:r>
+      <w:r>
+        <w:rPr>
+          <w:iCs/>
+          <w:i/>
+        </w:rPr>
+        <w:t xml:space="preserve">, which is the scheduled expiry function having lifted it; the events below it are the on-premises authentication failures arriving from corp-server.</w:t>
+      </w:r>
+    </w:p>
+    <w:p>
       <w:r>
         <w:br w:type="page"/>
       </w:r>
     </w:p>
-    <w:bookmarkEnd w:id="60"/>
-    <w:bookmarkEnd w:id="61"/>
-    <w:bookmarkEnd w:id="62"/>
-    <w:bookmarkStart w:id="63" w:name="failure-scenarios"/>
+    <w:bookmarkEnd w:id="78"/>
+    <w:bookmarkEnd w:id="79"/>
+    <w:bookmarkEnd w:id="80"/>
+    <w:bookmarkStart w:id="81" w:name="failure-scenarios"/>
     <w:p>
       <w:pPr>
         <w:pStyle w:val="Heading1"/>
@@ -6621,8 +7024,8 @@
         <w:br w:type="page"/>
       </w:r>
     </w:p>
-    <w:bookmarkEnd w:id="63"/>
-    <w:bookmarkStart w:id="67" w:name="decisions-taken-under-constraint"/>
+    <w:bookmarkEnd w:id="81"/>
+    <w:bookmarkStart w:id="85" w:name="decisions-taken-under-constraint"/>
     <w:p>
       <w:pPr>
         <w:pStyle w:val="Heading1"/>
@@ -6639,7 +7042,7 @@
         <w:t xml:space="preserve">Three significant design decisions were forced by constraints discovered during implementation rather than chosen freely. They are recorded here because the reasoning is part of the design.</w:t>
       </w:r>
     </w:p>
-    <w:bookmarkStart w:id="64" w:name="k3s-instead-of-eks"/>
+    <w:bookmarkStart w:id="82" w:name="k3s-instead-of-eks"/>
     <w:p>
       <w:pPr>
         <w:pStyle w:val="Heading2"/>
@@ -6668,8 +7071,8 @@
         <w:t xml:space="preserve">. This was found by probing the account before designing, not by hitting it during deployment. k3s on EC2 is CNCF-conformant, so the workload remains portable; the difference is that the control plane is self-managed rather than managed.</w:t>
       </w:r>
     </w:p>
-    <w:bookmarkEnd w:id="64"/>
-    <w:bookmarkStart w:id="65" w:name="X348368fae208ab7a7823e02f796da62e3186d3b"/>
+    <w:bookmarkEnd w:id="82"/>
+    <w:bookmarkStart w:id="83" w:name="X348368fae208ab7a7823e02f796da62e3186d3b"/>
     <w:p>
       <w:pPr>
         <w:pStyle w:val="Heading2"/>
@@ -6761,8 +7164,8 @@
         <w:t xml:space="preserve">PostgreSQL instance was always the weaker choice; the policy simply forced the stronger one. SOAR operational state moved to DynamoDB, which suits it better anyway. Events are written once and read by key, with no joins.</w:t>
       </w:r>
     </w:p>
-    <w:bookmarkEnd w:id="65"/>
-    <w:bookmarkStart w:id="66" w:name="Xe92ecc1338b76b4a21367e33c1195b0b2cb6cad"/>
+    <w:bookmarkEnd w:id="83"/>
+    <w:bookmarkStart w:id="84" w:name="Xe92ecc1338b76b4a21367e33c1195b0b2cb6cad"/>
     <w:p>
       <w:pPr>
         <w:pStyle w:val="Heading2"/>
@@ -6831,9 +7234,9 @@
         <w:br w:type="page"/>
       </w:r>
     </w:p>
-    <w:bookmarkEnd w:id="66"/>
-    <w:bookmarkEnd w:id="67"/>
-    <w:bookmarkStart w:id="68" w:name="cost"/>
+    <w:bookmarkEnd w:id="84"/>
+    <w:bookmarkEnd w:id="85"/>
+    <w:bookmarkStart w:id="86" w:name="cost"/>
     <w:p>
       <w:pPr>
         <w:pStyle w:val="Heading1"/>
@@ -7029,19 +7432,19 @@
               <w:jc w:val="left"/>
             </w:pPr>
             <w:r>
-              <w:t xml:space="preserve">EC2, gateway t3.small, demo t3.micro</w:t>
-            </w:r>
-          </w:p>
-        </w:tc>
-        <w:tc>
-          <w:tcPr/>
-          <w:p>
-            <w:pPr>
-              <w:pStyle w:val="Compact"/>
-              <w:jc w:val="left"/>
-            </w:pPr>
-            <w:r>
-              <w:t xml:space="preserve">22</w:t>
+              <w:t xml:space="preserve">EC2, gateway t3.small, demo t3.micro, corp-server t3.micro</w:t>
+            </w:r>
+          </w:p>
+        </w:tc>
+        <w:tc>
+          <w:tcPr/>
+          <w:p>
+            <w:pPr>
+              <w:pStyle w:val="Compact"/>
+              <w:jc w:val="left"/>
+            </w:pPr>
+            <w:r>
+              <w:t xml:space="preserve">29</w:t>
             </w:r>
           </w:p>
         </w:tc>
@@ -7101,7 +7504,7 @@
                 <w:bCs/>
                 <w:b/>
               </w:rPr>
-              <w:t xml:space="preserve">≈ 256</w:t>
+              <w:t xml:space="preserve">≈ 263</w:t>
             </w:r>
           </w:p>
         </w:tc>
@@ -7120,8 +7523,8 @@
         <w:br w:type="page"/>
       </w:r>
     </w:p>
-    <w:bookmarkEnd w:id="68"/>
-    <w:bookmarkStart w:id="69" w:name="recommendations"/>
+    <w:bookmarkEnd w:id="86"/>
+    <w:bookmarkStart w:id="87" w:name="recommendations"/>
     <w:p>
       <w:pPr>
         <w:pStyle w:val="Heading1"/>
@@ -7285,7 +7688,7 @@
         <w:t xml:space="preserve">metric, which shows which real events currently have no automated response.</w:t>
       </w:r>
     </w:p>
-    <w:bookmarkEnd w:id="69"/>
+    <w:bookmarkEnd w:id="87"/>
     <w:sectPr/>
   </w:body>
 </w:document>

</xml_diff>

<commit_message>
Complete evidence set: 32 captioned figures covering every requirement
</commit_message>
<xml_diff>
--- a/docs/01-design-document.docx
+++ b/docs/01-design-document.docx
@@ -1061,7 +1061,7 @@
     </w:p>
     <w:bookmarkEnd w:id="25"/>
     <w:bookmarkEnd w:id="26"/>
-    <w:bookmarkStart w:id="37" w:name="network-design"/>
+    <w:bookmarkStart w:id="52" w:name="network-design"/>
     <w:p>
       <w:pPr>
         <w:pStyle w:val="Heading1"/>
@@ -1462,7 +1462,7 @@
       </w:r>
     </w:p>
     <w:bookmarkEnd w:id="31"/>
-    <w:bookmarkStart w:id="32" w:name="controlled-traffic-flow"/>
+    <w:bookmarkStart w:id="38" w:name="controlled-traffic-flow"/>
     <w:p>
       <w:pPr>
         <w:pStyle w:val="Heading2"/>
@@ -1727,8 +1727,126 @@
         <w:t xml:space="preserve">”</w:t>
       </w:r>
     </w:p>
-    <w:bookmarkEnd w:id="32"/>
-    <w:bookmarkStart w:id="33" w:name="X71077e9ec1685ff494d79413956d56af7d75ab5"/>
+    <w:p>
+      <w:pPr>
+        <w:pStyle w:val="BodyText"/>
+      </w:pPr>
+      <w:r>
+        <w:drawing>
+          <wp:inline>
+            <wp:extent cx="5334000" cy="1646407"/>
+            <wp:effectExtent b="0" l="0" r="0" t="0"/>
+            <wp:docPr descr="" title="" id="33" name="Picture"/>
+            <a:graphic>
+              <a:graphicData uri="http://schemas.openxmlformats.org/drawingml/2006/picture">
+                <pic:pic>
+                  <pic:nvPicPr>
+                    <pic:cNvPr descr="evidence/n01-tgw-associations.png" id="34" name="Picture"/>
+                    <pic:cNvPicPr>
+                      <a:picLocks noChangeArrowheads="1" noChangeAspect="1"/>
+                    </pic:cNvPicPr>
+                  </pic:nvPicPr>
+                  <pic:blipFill>
+                    <a:blip r:embed="rId32"/>
+                    <a:stretch>
+                      <a:fillRect/>
+                    </a:stretch>
+                  </pic:blipFill>
+                  <pic:spPr bwMode="auto">
+                    <a:xfrm>
+                      <a:off x="0" y="0"/>
+                      <a:ext cx="5334000" cy="1646407"/>
+                    </a:xfrm>
+                    <a:prstGeom prst="rect">
+                      <a:avLst/>
+                    </a:prstGeom>
+                    <a:noFill/>
+                    <a:ln w="9525">
+                      <a:noFill/>
+                      <a:headEnd/>
+                      <a:tailEnd/>
+                    </a:ln>
+                  </pic:spPr>
+                </pic:pic>
+              </a:graphicData>
+            </a:graphic>
+          </wp:inline>
+        </w:drawing>
+      </w:r>
+    </w:p>
+    <w:p>
+      <w:pPr>
+        <w:pStyle w:val="BodyText"/>
+      </w:pPr>
+      <w:r>
+        <w:rPr>
+          <w:iCs/>
+          <w:i/>
+        </w:rPr>
+        <w:t xml:space="preserve">Figure 2: both spoke attachments bound to the spoke route table. Note that default association and default propagation are both No, so nothing is attached by accident.</w:t>
+      </w:r>
+    </w:p>
+    <w:p>
+      <w:pPr>
+        <w:pStyle w:val="BodyText"/>
+      </w:pPr>
+      <w:r>
+        <w:drawing>
+          <wp:inline>
+            <wp:extent cx="5334000" cy="2265247"/>
+            <wp:effectExtent b="0" l="0" r="0" t="0"/>
+            <wp:docPr descr="" title="" id="36" name="Picture"/>
+            <a:graphic>
+              <a:graphicData uri="http://schemas.openxmlformats.org/drawingml/2006/picture">
+                <pic:pic>
+                  <pic:nvPicPr>
+                    <pic:cNvPr descr="evidence/n02-tgw-routes.png" id="37" name="Picture"/>
+                    <pic:cNvPicPr>
+                      <a:picLocks noChangeArrowheads="1" noChangeAspect="1"/>
+                    </pic:cNvPicPr>
+                  </pic:nvPicPr>
+                  <pic:blipFill>
+                    <a:blip r:embed="rId35"/>
+                    <a:stretch>
+                      <a:fillRect/>
+                    </a:stretch>
+                  </pic:blipFill>
+                  <pic:spPr bwMode="auto">
+                    <a:xfrm>
+                      <a:off x="0" y="0"/>
+                      <a:ext cx="5334000" cy="2265247"/>
+                    </a:xfrm>
+                    <a:prstGeom prst="rect">
+                      <a:avLst/>
+                    </a:prstGeom>
+                    <a:noFill/>
+                    <a:ln w="9525">
+                      <a:noFill/>
+                      <a:headEnd/>
+                      <a:tailEnd/>
+                    </a:ln>
+                  </pic:spPr>
+                </pic:pic>
+              </a:graphicData>
+            </a:graphic>
+          </wp:inline>
+        </w:drawing>
+      </w:r>
+    </w:p>
+    <w:p>
+      <w:pPr>
+        <w:pStyle w:val="BodyText"/>
+      </w:pPr>
+      <w:r>
+        <w:rPr>
+          <w:iCs/>
+          <w:i/>
+        </w:rPr>
+        <w:t xml:space="preserve">Figure 3: the routes that table contains. A default to the hub, one entry for the on-premises range, and a single exception permitting the platform spoke to reach the data spoke. There is no general path between spokes because none was created.</w:t>
+      </w:r>
+    </w:p>
+    <w:bookmarkEnd w:id="38"/>
+    <w:bookmarkStart w:id="45" w:name="X71077e9ec1685ff494d79413956d56af7d75ab5"/>
     <w:p>
       <w:pPr>
         <w:pStyle w:val="Heading2"/>
@@ -1986,6 +2104,124 @@
         <w:pStyle w:val="BodyText"/>
       </w:pPr>
       <w:r>
+        <w:drawing>
+          <wp:inline>
+            <wp:extent cx="5334000" cy="1764252"/>
+            <wp:effectExtent b="0" l="0" r="0" t="0"/>
+            <wp:docPr descr="" title="" id="40" name="Picture"/>
+            <a:graphic>
+              <a:graphicData uri="http://schemas.openxmlformats.org/drawingml/2006/picture">
+                <pic:pic>
+                  <pic:nvPicPr>
+                    <pic:cNvPr descr="evidence/n03-data-spoke-routes.png" id="41" name="Picture"/>
+                    <pic:cNvPicPr>
+                      <a:picLocks noChangeArrowheads="1" noChangeAspect="1"/>
+                    </pic:cNvPicPr>
+                  </pic:nvPicPr>
+                  <pic:blipFill>
+                    <a:blip r:embed="rId39"/>
+                    <a:stretch>
+                      <a:fillRect/>
+                    </a:stretch>
+                  </pic:blipFill>
+                  <pic:spPr bwMode="auto">
+                    <a:xfrm>
+                      <a:off x="0" y="0"/>
+                      <a:ext cx="5334000" cy="1764252"/>
+                    </a:xfrm>
+                    <a:prstGeom prst="rect">
+                      <a:avLst/>
+                    </a:prstGeom>
+                    <a:noFill/>
+                    <a:ln w="9525">
+                      <a:noFill/>
+                      <a:headEnd/>
+                      <a:tailEnd/>
+                    </a:ln>
+                  </pic:spPr>
+                </pic:pic>
+              </a:graphicData>
+            </a:graphic>
+          </wp:inline>
+        </w:drawing>
+      </w:r>
+    </w:p>
+    <w:p>
+      <w:pPr>
+        <w:pStyle w:val="BodyText"/>
+      </w:pPr>
+      <w:r>
+        <w:rPr>
+          <w:iCs/>
+          <w:i/>
+        </w:rPr>
+        <w:t xml:space="preserve">Figure 4: the data spoke route table. Four routes: the S3 prefix list, two Transit Gateway entries, and the VPC local route. There is no 0.0.0.0/0 entry. The absence is the security property, and it cannot be undone by editing a security group.</w:t>
+      </w:r>
+    </w:p>
+    <w:p>
+      <w:pPr>
+        <w:pStyle w:val="BodyText"/>
+      </w:pPr>
+      <w:r>
+        <w:drawing>
+          <wp:inline>
+            <wp:extent cx="4572000" cy="3434553"/>
+            <wp:effectExtent b="0" l="0" r="0" t="0"/>
+            <wp:docPr descr="" title="" id="43" name="Picture"/>
+            <a:graphic>
+              <a:graphicData uri="http://schemas.openxmlformats.org/drawingml/2006/picture">
+                <pic:pic>
+                  <pic:nvPicPr>
+                    <pic:cNvPr descr="evidence/n04-private-api.png" id="44" name="Picture"/>
+                    <pic:cNvPicPr>
+                      <a:picLocks noChangeArrowheads="1" noChangeAspect="1"/>
+                    </pic:cNvPicPr>
+                  </pic:nvPicPr>
+                  <pic:blipFill>
+                    <a:blip r:embed="rId42"/>
+                    <a:stretch>
+                      <a:fillRect/>
+                    </a:stretch>
+                  </pic:blipFill>
+                  <pic:spPr bwMode="auto">
+                    <a:xfrm>
+                      <a:off x="0" y="0"/>
+                      <a:ext cx="4572000" cy="3434553"/>
+                    </a:xfrm>
+                    <a:prstGeom prst="rect">
+                      <a:avLst/>
+                    </a:prstGeom>
+                    <a:noFill/>
+                    <a:ln w="9525">
+                      <a:noFill/>
+                      <a:headEnd/>
+                      <a:tailEnd/>
+                    </a:ln>
+                  </pic:spPr>
+                </pic:pic>
+              </a:graphicData>
+            </a:graphic>
+          </wp:inline>
+        </w:drawing>
+      </w:r>
+    </w:p>
+    <w:p>
+      <w:pPr>
+        <w:pStyle w:val="BodyText"/>
+      </w:pPr>
+      <w:r>
+        <w:rPr>
+          <w:iCs/>
+          <w:i/>
+        </w:rPr>
+        <w:t xml:space="preserve">Figure 5: the ingest API. Endpoint type Private, with the two VPC endpoint identifiers that its resource policy permits. A request arriving by any other path is denied before it reaches the collector.</w:t>
+      </w:r>
+    </w:p>
+    <w:p>
+      <w:pPr>
+        <w:pStyle w:val="BodyText"/>
+      </w:pPr>
+      <w:r>
         <w:rPr>
           <w:bCs/>
           <w:b/>
@@ -2029,8 +2265,8 @@
         <w:t xml:space="preserve">associated with every spoke and aliased to the hub endpoint. Scales better beyond three or four spokes and is the recommended production pattern. At this size the second endpoint is simpler to reason about and costs roughly €7 per month.</w:t>
       </w:r>
     </w:p>
-    <w:bookmarkEnd w:id="33"/>
-    <w:bookmarkStart w:id="34" w:name="design-for-failure-req-nca-p2-01"/>
+    <w:bookmarkEnd w:id="45"/>
+    <w:bookmarkStart w:id="46" w:name="design-for-failure-req-nca-p2-01"/>
     <w:p>
       <w:pPr>
         <w:pStyle w:val="Heading2"/>
@@ -2421,8 +2657,8 @@
         <w:t xml:space="preserve">path trades availability for cost in a way that is documented and reversible.</w:t>
       </w:r>
     </w:p>
-    <w:bookmarkEnd w:id="34"/>
-    <w:bookmarkStart w:id="35" w:name="internal-dns-req-nca-p2-04"/>
+    <w:bookmarkEnd w:id="46"/>
+    <w:bookmarkStart w:id="50" w:name="internal-dns-req-nca-p2-04"/>
     <w:p>
       <w:pPr>
         <w:pStyle w:val="Heading2"/>
@@ -2582,6 +2818,65 @@
         <w:pStyle w:val="BodyText"/>
       </w:pPr>
       <w:r>
+        <w:drawing>
+          <wp:inline>
+            <wp:extent cx="5334000" cy="2713020"/>
+            <wp:effectExtent b="0" l="0" r="0" t="0"/>
+            <wp:docPr descr="" title="" id="48" name="Picture"/>
+            <a:graphic>
+              <a:graphicData uri="http://schemas.openxmlformats.org/drawingml/2006/picture">
+                <pic:pic>
+                  <pic:nvPicPr>
+                    <pic:cNvPr descr="evidence/n05-private-dns.png" id="49" name="Picture"/>
+                    <pic:cNvPicPr>
+                      <a:picLocks noChangeArrowheads="1" noChangeAspect="1"/>
+                    </pic:cNvPicPr>
+                  </pic:nvPicPr>
+                  <pic:blipFill>
+                    <a:blip r:embed="rId47"/>
+                    <a:stretch>
+                      <a:fillRect/>
+                    </a:stretch>
+                  </pic:blipFill>
+                  <pic:spPr bwMode="auto">
+                    <a:xfrm>
+                      <a:off x="0" y="0"/>
+                      <a:ext cx="5334000" cy="2713020"/>
+                    </a:xfrm>
+                    <a:prstGeom prst="rect">
+                      <a:avLst/>
+                    </a:prstGeom>
+                    <a:noFill/>
+                    <a:ln w="9525">
+                      <a:noFill/>
+                      <a:headEnd/>
+                      <a:tailEnd/>
+                    </a:ln>
+                  </pic:spPr>
+                </pic:pic>
+              </a:graphicData>
+            </a:graphic>
+          </wp:inline>
+        </w:drawing>
+      </w:r>
+    </w:p>
+    <w:p>
+      <w:pPr>
+        <w:pStyle w:val="BodyText"/>
+      </w:pPr>
+      <w:r>
+        <w:rPr>
+          <w:iCs/>
+          <w:i/>
+        </w:rPr>
+        <w:t xml:space="preserve">Figure 6: the private hosted zone. Marked Private, so it has no public delegation, and holding the records that let cloud and on-premises hosts reach services by name rather than by address.</w:t>
+      </w:r>
+    </w:p>
+    <w:p>
+      <w:pPr>
+        <w:pStyle w:val="BodyText"/>
+      </w:pPr>
+      <w:r>
         <w:t xml:space="preserve">The inbound endpoint is behind a feature flag (</w:t>
       </w:r>
       <w:r>
@@ -2594,8 +2889,8 @@
         <w:t xml:space="preserve">) because it costs roughly €0.25/hour for its two interfaces. VPC-internal name resolution continues to work when it is disabled; only the on-premises path is affected.</w:t>
       </w:r>
     </w:p>
-    <w:bookmarkEnd w:id="35"/>
-    <w:bookmarkStart w:id="36" w:name="hybrid-connectivity"/>
+    <w:bookmarkEnd w:id="50"/>
+    <w:bookmarkStart w:id="51" w:name="hybrid-connectivity"/>
     <w:p>
       <w:pPr>
         <w:pStyle w:val="Heading2"/>
@@ -2666,9 +2961,9 @@
         <w:br w:type="page"/>
       </w:r>
     </w:p>
-    <w:bookmarkEnd w:id="36"/>
-    <w:bookmarkEnd w:id="37"/>
-    <w:bookmarkStart w:id="49" w:name="observability"/>
+    <w:bookmarkEnd w:id="51"/>
+    <w:bookmarkEnd w:id="52"/>
+    <w:bookmarkStart w:id="70" w:name="observability"/>
     <w:p>
       <w:pPr>
         <w:pStyle w:val="Heading1"/>
@@ -2677,7 +2972,7 @@
         <w:t xml:space="preserve">4. Observability</w:t>
       </w:r>
     </w:p>
-    <w:bookmarkStart w:id="38" w:name="technology-evaluation-req-nca-p2-05"/>
+    <w:bookmarkStart w:id="53" w:name="technology-evaluation-req-nca-p2-05"/>
     <w:p>
       <w:pPr>
         <w:pStyle w:val="Heading2"/>
@@ -3045,8 +3340,8 @@
         <w:t xml:space="preserve">The deciding factor was not any single feature but the Alertmanager webhook receiver. It is what allows the monitoring system to become the primary event source for the SOAR pipeline rather than a parallel system that a human reads. Every other candidate would have required a bridging component.</w:t>
       </w:r>
     </w:p>
-    <w:bookmarkEnd w:id="38"/>
-    <w:bookmarkStart w:id="39" w:name="deployment"/>
+    <w:bookmarkEnd w:id="53"/>
+    <w:bookmarkStart w:id="60" w:name="deployment"/>
     <w:p>
       <w:pPr>
         <w:pStyle w:val="Heading2"/>
@@ -3265,6 +3560,124 @@
         <w:pStyle w:val="BodyText"/>
       </w:pPr>
       <w:r>
+        <w:drawing>
+          <wp:inline>
+            <wp:extent cx="5334000" cy="1570854"/>
+            <wp:effectExtent b="0" l="0" r="0" t="0"/>
+            <wp:docPr descr="" title="" id="55" name="Picture"/>
+            <a:graphic>
+              <a:graphicData uri="http://schemas.openxmlformats.org/drawingml/2006/picture">
+                <pic:pic>
+                  <pic:nvPicPr>
+                    <pic:cNvPr descr="evidence/n08-monitoring-pods.png" id="56" name="Picture"/>
+                    <pic:cNvPicPr>
+                      <a:picLocks noChangeArrowheads="1" noChangeAspect="1"/>
+                    </pic:cNvPicPr>
+                  </pic:nvPicPr>
+                  <pic:blipFill>
+                    <a:blip r:embed="rId54"/>
+                    <a:stretch>
+                      <a:fillRect/>
+                    </a:stretch>
+                  </pic:blipFill>
+                  <pic:spPr bwMode="auto">
+                    <a:xfrm>
+                      <a:off x="0" y="0"/>
+                      <a:ext cx="5334000" cy="1570854"/>
+                    </a:xfrm>
+                    <a:prstGeom prst="rect">
+                      <a:avLst/>
+                    </a:prstGeom>
+                    <a:noFill/>
+                    <a:ln w="9525">
+                      <a:noFill/>
+                      <a:headEnd/>
+                      <a:tailEnd/>
+                    </a:ln>
+                  </pic:spPr>
+                </pic:pic>
+              </a:graphicData>
+            </a:graphic>
+          </wp:inline>
+        </w:drawing>
+      </w:r>
+    </w:p>
+    <w:p>
+      <w:pPr>
+        <w:pStyle w:val="BodyText"/>
+      </w:pPr>
+      <w:r>
+        <w:rPr>
+          <w:iCs/>
+          <w:i/>
+        </w:rPr>
+        <w:t xml:space="preserve">Figure 7: the stack running on k3s. Alertmanager shows a much shorter age than the rest because it was restarted after the configuration defect described in Section 5.8 of the test results was corrected.</w:t>
+      </w:r>
+    </w:p>
+    <w:p>
+      <w:pPr>
+        <w:pStyle w:val="BodyText"/>
+      </w:pPr>
+      <w:r>
+        <w:drawing>
+          <wp:inline>
+            <wp:extent cx="5334000" cy="3097286"/>
+            <wp:effectExtent b="0" l="0" r="0" t="0"/>
+            <wp:docPr descr="" title="" id="58" name="Picture"/>
+            <a:graphic>
+              <a:graphicData uri="http://schemas.openxmlformats.org/drawingml/2006/picture">
+                <pic:pic>
+                  <pic:nvPicPr>
+                    <pic:cNvPr descr="evidence/n09-observability-recovery.png" id="59" name="Picture"/>
+                    <pic:cNvPicPr>
+                      <a:picLocks noChangeArrowheads="1" noChangeAspect="1"/>
+                    </pic:cNvPicPr>
+                  </pic:nvPicPr>
+                  <pic:blipFill>
+                    <a:blip r:embed="rId57"/>
+                    <a:stretch>
+                      <a:fillRect/>
+                    </a:stretch>
+                  </pic:blipFill>
+                  <pic:spPr bwMode="auto">
+                    <a:xfrm>
+                      <a:off x="0" y="0"/>
+                      <a:ext cx="5334000" cy="3097286"/>
+                    </a:xfrm>
+                    <a:prstGeom prst="rect">
+                      <a:avLst/>
+                    </a:prstGeom>
+                    <a:noFill/>
+                    <a:ln w="9525">
+                      <a:noFill/>
+                      <a:headEnd/>
+                      <a:tailEnd/>
+                    </a:ln>
+                  </pic:spPr>
+                </pic:pic>
+              </a:graphicData>
+            </a:graphic>
+          </wp:inline>
+        </w:drawing>
+      </w:r>
+    </w:p>
+    <w:p>
+      <w:pPr>
+        <w:pStyle w:val="BodyText"/>
+      </w:pPr>
+      <w:r>
+        <w:rPr>
+          <w:iCs/>
+          <w:i/>
+        </w:rPr>
+        <w:t xml:space="preserve">Figure 8: the pipeline that deploys it. Every component is applied from versioned Helm values, so the stack is reproducible without anyone running a script by hand.</w:t>
+      </w:r>
+    </w:p>
+    <w:p>
+      <w:pPr>
+        <w:pStyle w:val="BodyText"/>
+      </w:pPr>
+      <w:r>
         <w:t xml:space="preserve">k3s was used rather than EKS because the account’s service control policy denies</w:t>
       </w:r>
       <w:r>
@@ -3296,8 +3709,8 @@
         <w:t xml:space="preserve">This was not the original arrangement. The stack was first installed by running a script on the node by hand, which left it as the only part of the system not reproducible without a person, and meant a rebuilt node came back with no monitoring at all. Section 6.2 describes the pipeline that replaced it.</w:t>
       </w:r>
     </w:p>
-    <w:bookmarkEnd w:id="39"/>
-    <w:bookmarkStart w:id="40" w:name="monitoring-data-storage"/>
+    <w:bookmarkEnd w:id="60"/>
+    <w:bookmarkStart w:id="61" w:name="monitoring-data-storage"/>
     <w:p>
       <w:pPr>
         <w:pStyle w:val="Heading2"/>
@@ -3348,8 +3761,8 @@
         <w:t xml:space="preserve">The bucket lifecycle transitions objects to Infrequent Access after 30 days and expires them at 90, matching Innovatech’s stated retention requirement.</w:t>
       </w:r>
     </w:p>
-    <w:bookmarkEnd w:id="40"/>
-    <w:bookmarkStart w:id="48" w:name="soar-observability-req-nca-p2-08"/>
+    <w:bookmarkEnd w:id="61"/>
+    <w:bookmarkStart w:id="69" w:name="soar-observability-req-nca-p2-08"/>
     <w:p>
       <w:pPr>
         <w:pStyle w:val="Heading2"/>
@@ -3863,7 +4276,7 @@
         <w:t xml:space="preserve">, messages parked in either dead-letter queue</w:t>
       </w:r>
     </w:p>
-    <w:bookmarkStart w:id="47" w:name="dashboard-layout"/>
+    <w:bookmarkStart w:id="68" w:name="dashboard-layout"/>
     <w:p>
       <w:pPr>
         <w:pStyle w:val="Heading3"/>
@@ -4019,18 +4432,18 @@
           <wp:inline>
             <wp:extent cx="5334000" cy="2978039"/>
             <wp:effectExtent b="0" l="0" r="0" t="0"/>
-            <wp:docPr descr="" title="" id="42" name="Picture"/>
+            <wp:docPr descr="" title="" id="63" name="Picture"/>
             <a:graphic>
               <a:graphicData uri="http://schemas.openxmlformats.org/drawingml/2006/picture">
                 <pic:pic>
                   <pic:nvPicPr>
-                    <pic:cNvPr descr="evidence/o04-soar-dashboard.png" id="43" name="Picture"/>
+                    <pic:cNvPr descr="evidence/o04-soar-dashboard.png" id="64" name="Picture"/>
                     <pic:cNvPicPr>
                       <a:picLocks noChangeArrowheads="1" noChangeAspect="1"/>
                     </pic:cNvPicPr>
                   </pic:nvPicPr>
                   <pic:blipFill>
-                    <a:blip r:embed="rId41"/>
+                    <a:blip r:embed="rId62"/>
                     <a:stretch>
                       <a:fillRect/>
                     </a:stretch>
@@ -4066,18 +4479,18 @@
           <wp:inline>
             <wp:extent cx="5334000" cy="2801973"/>
             <wp:effectExtent b="0" l="0" r="0" t="0"/>
-            <wp:docPr descr="" title="" id="45" name="Picture"/>
+            <wp:docPr descr="" title="" id="66" name="Picture"/>
             <a:graphic>
               <a:graphicData uri="http://schemas.openxmlformats.org/drawingml/2006/picture">
                 <pic:pic>
                   <pic:nvPicPr>
-                    <pic:cNvPr descr="evidence/o04-soar-dashboard-pt2.png" id="46" name="Picture"/>
+                    <pic:cNvPr descr="evidence/o04-soar-dashboard-pt2.png" id="67" name="Picture"/>
                     <pic:cNvPicPr>
                       <a:picLocks noChangeArrowheads="1" noChangeAspect="1"/>
                     </pic:cNvPicPr>
                   </pic:nvPicPr>
                   <pic:blipFill>
-                    <a:blip r:embed="rId44"/>
+                    <a:blip r:embed="rId65"/>
                     <a:stretch>
                       <a:fillRect/>
                     </a:stretch>
@@ -4113,7 +4526,7 @@
           <w:iCs/>
           <w:i/>
         </w:rPr>
-        <w:t xml:space="preserve">Figures 16 and 17: the SOAR Operations dashboard with real data. The non-zero failure and refusal counters are not defects in the capture. Three failures are the authorisation regression described in the test results, and two refusals are the idempotency guard declining to re-block an address already blocked. Both are recorded here deliberately: a dashboard that has only ever shown zeros has not been shown to work. The scrape target panel at the bottom includes the on-premises server, so the machine that reports intrusions is itself monitored.</w:t>
+        <w:t xml:space="preserve">Figures 9 and 10: the SOAR Operations dashboard with real data. The non-zero failure and refusal counters are not defects in the capture. Three failures are the authorisation regression described in the test results, and two refusals are the idempotency guard declining to re-block an address already blocked. Both are recorded here deliberately: a dashboard that has only ever shown zeros has not been shown to work. The scrape target panel at the bottom includes the on-premises server, so the machine that reports intrusions is itself monitored.</w:t>
       </w:r>
     </w:p>
     <w:p>
@@ -4129,10 +4542,10 @@
         <w:br w:type="page"/>
       </w:r>
     </w:p>
-    <w:bookmarkEnd w:id="47"/>
-    <w:bookmarkEnd w:id="48"/>
-    <w:bookmarkEnd w:id="49"/>
-    <w:bookmarkStart w:id="59" w:name="soar-system-design"/>
+    <w:bookmarkEnd w:id="68"/>
+    <w:bookmarkEnd w:id="69"/>
+    <w:bookmarkEnd w:id="70"/>
+    <w:bookmarkStart w:id="89" w:name="soar-system-design"/>
     <w:p>
       <w:pPr>
         <w:pStyle w:val="Heading1"/>
@@ -4141,7 +4554,7 @@
         <w:t xml:space="preserve">5. SOAR system design</w:t>
       </w:r>
     </w:p>
-    <w:bookmarkStart w:id="53" w:name="event-driven-architecture-req-nca-p2-06"/>
+    <w:bookmarkStart w:id="74" w:name="event-driven-architecture-req-nca-p2-06"/>
     <w:p>
       <w:pPr>
         <w:pStyle w:val="Heading2"/>
@@ -4159,18 +4572,18 @@
           <wp:inline>
             <wp:extent cx="5334000" cy="3307080"/>
             <wp:effectExtent b="0" l="0" r="0" t="0"/>
-            <wp:docPr descr="" title="" id="51" name="Picture"/>
+            <wp:docPr descr="" title="" id="72" name="Picture"/>
             <a:graphic>
               <a:graphicData uri="http://schemas.openxmlformats.org/drawingml/2006/picture">
                 <pic:pic>
                   <pic:nvPicPr>
-                    <pic:cNvPr descr="diagrams/soar-pipeline.png" id="52" name="Picture"/>
+                    <pic:cNvPr descr="diagrams/soar-pipeline.png" id="73" name="Picture"/>
                     <pic:cNvPicPr>
                       <a:picLocks noChangeArrowheads="1" noChangeAspect="1"/>
                     </pic:cNvPicPr>
                   </pic:nvPicPr>
                   <pic:blipFill>
-                    <a:blip r:embed="rId50"/>
+                    <a:blip r:embed="rId71"/>
                     <a:stretch>
                       <a:fillRect/>
                     </a:stretch>
@@ -4197,6 +4610,18 @@
         </w:drawing>
       </w:r>
     </w:p>
+    <w:p>
+      <w:pPr>
+        <w:pStyle w:val="BodyText"/>
+      </w:pPr>
+      <w:r>
+        <w:rPr>
+          <w:iCs/>
+          <w:i/>
+        </w:rPr>
+        <w:t xml:space="preserve">Figure 11: the SOAR event pipeline. Three sources normalise into one event schema; the rule engine decides and publishes; EventBridge routes to the actions. The engine holds no permission to change anything, which is why a fault in rule evaluation cannot damage the environment.</w:t>
+      </w:r>
+    </w:p>
     <w:tbl>
       <w:tblPr>
         <w:tblStyle w:val="Table"/>
@@ -4503,8 +4928,8 @@
         <w:t xml:space="preserve">EventBridge retries dispatch twice with a five-minute maximum age, and undeliverable actions land in a dead-letter queue rather than disappearing.</w:t>
       </w:r>
     </w:p>
-    <w:bookmarkEnd w:id="53"/>
-    <w:bookmarkStart w:id="54" w:name="event-sources"/>
+    <w:bookmarkEnd w:id="74"/>
+    <w:bookmarkStart w:id="75" w:name="event-sources"/>
     <w:p>
       <w:pPr>
         <w:pStyle w:val="Heading2"/>
@@ -4780,8 +5205,8 @@
         <w:t xml:space="preserve">fires for it in the same way as for a cloud host. A server that produces security events while being invisible to monitoring is a gap an operator only discovers during an incident.</w:t>
       </w:r>
     </w:p>
-    <w:bookmarkEnd w:id="54"/>
-    <w:bookmarkStart w:id="55" w:name="event-normalisation"/>
+    <w:bookmarkEnd w:id="75"/>
+    <w:bookmarkStart w:id="76" w:name="event-normalisation"/>
     <w:p>
       <w:pPr>
         <w:pStyle w:val="Heading2"/>
@@ -5237,8 +5662,8 @@
         <w:t xml:space="preserve">rather than discarded. An event nobody has written a rule for yet is a gap in coverage, not noise.</w:t>
       </w:r>
     </w:p>
-    <w:bookmarkEnd w:id="55"/>
-    <w:bookmarkStart w:id="56" w:name="ingest-path"/>
+    <w:bookmarkEnd w:id="76"/>
+    <w:bookmarkStart w:id="77" w:name="ingest-path"/>
     <w:p>
       <w:pPr>
         <w:pStyle w:val="Heading2"/>
@@ -5279,8 +5704,8 @@
         <w:t xml:space="preserve">The SQS queue between collector and rule engine provides three things: burst absorption during an attack, durability if the rule engine is unavailable, and a dead-letter queue where repeatedly failing events can be inspected rather than lost.</w:t>
       </w:r>
     </w:p>
-    <w:bookmarkEnd w:id="56"/>
-    <w:bookmarkStart w:id="57" w:name="serverless-justification-req-nca-p2-07"/>
+    <w:bookmarkEnd w:id="77"/>
+    <w:bookmarkStart w:id="81" w:name="serverless-justification-req-nca-p2-07"/>
     <w:p>
       <w:pPr>
         <w:pStyle w:val="Heading2"/>
@@ -5372,8 +5797,67 @@
         <w:t xml:space="preserve">the VPC deliberately. They call only AWS APIs, never resources inside a subnet, so VPC attachment would add elastic network interface cold-start latency and a NAT dependency for no security gain.</w:t>
       </w:r>
     </w:p>
-    <w:bookmarkEnd w:id="57"/>
-    <w:bookmarkStart w:id="58" w:name="least-privilege"/>
+    <w:p>
+      <w:pPr>
+        <w:pStyle w:val="BodyText"/>
+      </w:pPr>
+      <w:r>
+        <w:drawing>
+          <wp:inline>
+            <wp:extent cx="5334000" cy="1101509"/>
+            <wp:effectExtent b="0" l="0" r="0" t="0"/>
+            <wp:docPr descr="" title="" id="79" name="Picture"/>
+            <a:graphic>
+              <a:graphicData uri="http://schemas.openxmlformats.org/drawingml/2006/picture">
+                <pic:pic>
+                  <pic:nvPicPr>
+                    <pic:cNvPr descr="evidence/n06-lambda-functions.png" id="80" name="Picture"/>
+                    <pic:cNvPicPr>
+                      <a:picLocks noChangeArrowheads="1" noChangeAspect="1"/>
+                    </pic:cNvPicPr>
+                  </pic:nvPicPr>
+                  <pic:blipFill>
+                    <a:blip r:embed="rId78"/>
+                    <a:stretch>
+                      <a:fillRect/>
+                    </a:stretch>
+                  </pic:blipFill>
+                  <pic:spPr bwMode="auto">
+                    <a:xfrm>
+                      <a:off x="0" y="0"/>
+                      <a:ext cx="5334000" cy="1101509"/>
+                    </a:xfrm>
+                    <a:prstGeom prst="rect">
+                      <a:avLst/>
+                    </a:prstGeom>
+                    <a:noFill/>
+                    <a:ln w="9525">
+                      <a:noFill/>
+                      <a:headEnd/>
+                      <a:tailEnd/>
+                    </a:ln>
+                  </pic:spPr>
+                </pic:pic>
+              </a:graphicData>
+            </a:graphic>
+          </wp:inline>
+        </w:drawing>
+      </w:r>
+    </w:p>
+    <w:p>
+      <w:pPr>
+        <w:pStyle w:val="BodyText"/>
+      </w:pPr>
+      <w:r>
+        <w:rPr>
+          <w:iCs/>
+          <w:i/>
+        </w:rPr>
+        <w:t xml:space="preserve">Figure 12: the six functions, all deployed by Terraform in the same apply. Zip packaging rather than container images: the handlers use only the standard library and boto3, which the runtime already provides, so an image would add roughly a hundredfold to the artefact size and a registry round trip for identical behaviour. The console is containerised because that one genuinely needs it.</w:t>
+      </w:r>
+    </w:p>
+    <w:bookmarkEnd w:id="81"/>
+    <w:bookmarkStart w:id="88" w:name="least-privilege"/>
     <w:p>
       <w:pPr>
         <w:pStyle w:val="Heading2"/>
@@ -5423,6 +5907,112 @@
         <w:pStyle w:val="BodyText"/>
       </w:pPr>
       <w:r>
+        <w:drawing>
+          <wp:inline>
+            <wp:extent cx="5334000" cy="2208792"/>
+            <wp:effectExtent b="0" l="0" r="0" t="0"/>
+            <wp:docPr descr="" title="" id="83" name="Picture"/>
+            <a:graphic>
+              <a:graphicData uri="http://schemas.openxmlformats.org/drawingml/2006/picture">
+                <pic:pic>
+                  <pic:nvPicPr>
+                    <pic:cNvPr descr="evidence/n07-rule-engine-policy.png" id="84" name="Picture"/>
+                    <pic:cNvPicPr>
+                      <a:picLocks noChangeArrowheads="1" noChangeAspect="1"/>
+                    </pic:cNvPicPr>
+                  </pic:nvPicPr>
+                  <pic:blipFill>
+                    <a:blip r:embed="rId82"/>
+                    <a:stretch>
+                      <a:fillRect/>
+                    </a:stretch>
+                  </pic:blipFill>
+                  <pic:spPr bwMode="auto">
+                    <a:xfrm>
+                      <a:off x="0" y="0"/>
+                      <a:ext cx="5334000" cy="2208792"/>
+                    </a:xfrm>
+                    <a:prstGeom prst="rect">
+                      <a:avLst/>
+                    </a:prstGeom>
+                    <a:noFill/>
+                    <a:ln w="9525">
+                      <a:noFill/>
+                      <a:headEnd/>
+                      <a:tailEnd/>
+                    </a:ln>
+                  </pic:spPr>
+                </pic:pic>
+              </a:graphicData>
+            </a:graphic>
+          </wp:inline>
+        </w:drawing>
+      </w:r>
+    </w:p>
+    <w:p>
+      <w:pPr>
+        <w:pStyle w:val="BodyText"/>
+      </w:pPr>
+      <w:r>
+        <w:drawing>
+          <wp:inline>
+            <wp:extent cx="5334000" cy="2243239"/>
+            <wp:effectExtent b="0" l="0" r="0" t="0"/>
+            <wp:docPr descr="" title="" id="86" name="Picture"/>
+            <a:graphic>
+              <a:graphicData uri="http://schemas.openxmlformats.org/drawingml/2006/picture">
+                <pic:pic>
+                  <pic:nvPicPr>
+                    <pic:cNvPr descr="evidence/n07-rule-engine-policy-pt2.png" id="87" name="Picture"/>
+                    <pic:cNvPicPr>
+                      <a:picLocks noChangeArrowheads="1" noChangeAspect="1"/>
+                    </pic:cNvPicPr>
+                  </pic:nvPicPr>
+                  <pic:blipFill>
+                    <a:blip r:embed="rId85"/>
+                    <a:stretch>
+                      <a:fillRect/>
+                    </a:stretch>
+                  </pic:blipFill>
+                  <pic:spPr bwMode="auto">
+                    <a:xfrm>
+                      <a:off x="0" y="0"/>
+                      <a:ext cx="5334000" cy="2243239"/>
+                    </a:xfrm>
+                    <a:prstGeom prst="rect">
+                      <a:avLst/>
+                    </a:prstGeom>
+                    <a:noFill/>
+                    <a:ln w="9525">
+                      <a:noFill/>
+                      <a:headEnd/>
+                      <a:tailEnd/>
+                    </a:ln>
+                  </pic:spPr>
+                </pic:pic>
+              </a:graphicData>
+            </a:graphic>
+          </wp:inline>
+        </w:drawing>
+      </w:r>
+    </w:p>
+    <w:p>
+      <w:pPr>
+        <w:pStyle w:val="BodyText"/>
+      </w:pPr>
+      <w:r>
+        <w:rPr>
+          <w:iCs/>
+          <w:i/>
+        </w:rPr>
+        <w:t xml:space="preserve">Figures 13 and 14: the rule engine’s complete inline policy, from the first statement to the closing brace. Three statements: read two DynamoDB paths, consume one queue, publish to one event bus. No statement grants write access to anything. This is the strongest security property in the system, and it is verifiable by reading rather than by trusting the description above.</w:t>
+      </w:r>
+    </w:p>
+    <w:p>
+      <w:pPr>
+        <w:pStyle w:val="BodyText"/>
+      </w:pPr>
+      <w:r>
         <w:t xml:space="preserve">The quarantine action illustrates defence in depth. The handler refuses to act on an instance without the tag</w:t>
       </w:r>
       <w:r>
@@ -5509,9 +6099,9 @@
         <w:br w:type="page"/>
       </w:r>
     </w:p>
-    <w:bookmarkEnd w:id="58"/>
-    <w:bookmarkEnd w:id="59"/>
-    <w:bookmarkStart w:id="80" w:name="deployment-and-automation"/>
+    <w:bookmarkEnd w:id="88"/>
+    <w:bookmarkEnd w:id="89"/>
+    <w:bookmarkStart w:id="110" w:name="deployment-and-automation"/>
     <w:p>
       <w:pPr>
         <w:pStyle w:val="Heading1"/>
@@ -5520,7 +6110,7 @@
         <w:t xml:space="preserve">6. Deployment and automation</w:t>
       </w:r>
     </w:p>
-    <w:bookmarkStart w:id="60" w:name="infrastructure-as-code-req-nca-p2-10"/>
+    <w:bookmarkStart w:id="90" w:name="infrastructure-as-code-req-nca-p2-10"/>
     <w:p>
       <w:pPr>
         <w:pStyle w:val="Heading2"/>
@@ -5595,8 +6185,8 @@
         <w:t xml:space="preserve">; the replacement node built itself from the same definition and came up healthy.</w:t>
       </w:r>
     </w:p>
-    <w:bookmarkEnd w:id="60"/>
-    <w:bookmarkStart w:id="79" w:name="X84e8fa2cec28c5a6ca850fb325cee2f916532f9"/>
+    <w:bookmarkEnd w:id="90"/>
+    <w:bookmarkStart w:id="109" w:name="X84e8fa2cec28c5a6ca850fb325cee2f916532f9"/>
     <w:p>
       <w:pPr>
         <w:pStyle w:val="Heading2"/>
@@ -5865,7 +6455,7 @@
         </w:tc>
       </w:tr>
     </w:tbl>
-    <w:bookmarkStart w:id="64" w:name="the-three-pipelines"/>
+    <w:bookmarkStart w:id="94" w:name="the-three-pipelines"/>
     <w:p>
       <w:pPr>
         <w:pStyle w:val="Heading3"/>
@@ -6140,18 +6730,18 @@
           <wp:inline>
             <wp:extent cx="2194560" cy="1643833"/>
             <wp:effectExtent b="0" l="0" r="0" t="0"/>
-            <wp:docPr descr="" title="" id="62" name="Picture"/>
+            <wp:docPr descr="" title="" id="92" name="Picture"/>
             <a:graphic>
               <a:graphicData uri="http://schemas.openxmlformats.org/drawingml/2006/picture">
                 <pic:pic>
                   <pic:nvPicPr>
-                    <pic:cNvPr descr="evidence/p01-workflows-list.png" id="63" name="Picture"/>
+                    <pic:cNvPr descr="evidence/p01-workflows-list.png" id="93" name="Picture"/>
                     <pic:cNvPicPr>
                       <a:picLocks noChangeArrowheads="1" noChangeAspect="1"/>
                     </pic:cNvPicPr>
                   </pic:nvPicPr>
                   <pic:blipFill>
-                    <a:blip r:embed="rId61"/>
+                    <a:blip r:embed="rId91"/>
                     <a:stretch>
                       <a:fillRect/>
                     </a:stretch>
@@ -6187,7 +6777,7 @@
           <w:iCs/>
           <w:i/>
         </w:rPr>
-        <w:t xml:space="preserve">Figure 19: the four pipelines. Between them they cover every deployable part of the system.</w:t>
+        <w:t xml:space="preserve">Figure 15: the four pipelines. Between them they cover every deployable part of the system.</w:t>
       </w:r>
     </w:p>
     <w:p>
@@ -6198,8 +6788,8 @@
         <w:t xml:space="preserve">Between them these cover every deployable part of the system. The only step that remains manual is approving a plan that would destroy a resource, and that is manual deliberately.</w:t>
       </w:r>
     </w:p>
-    <w:bookmarkEnd w:id="64"/>
-    <w:bookmarkStart w:id="65" w:name="testing"/>
+    <w:bookmarkEnd w:id="94"/>
+    <w:bookmarkStart w:id="95" w:name="testing"/>
     <w:p>
       <w:pPr>
         <w:pStyle w:val="Heading3"/>
@@ -6240,8 +6830,8 @@
         <w:t xml:space="preserve">The AWS calls themselves are not unit tested. Mocking a cloud provider proves the mock works. That confidence comes from the end-to-end scripts, which run against the real environment and assert on real state changes.</w:t>
       </w:r>
     </w:p>
-    <w:bookmarkEnd w:id="65"/>
-    <w:bookmarkStart w:id="72" w:name="deployment-is-automatic-graded-by-risk"/>
+    <w:bookmarkEnd w:id="95"/>
+    <w:bookmarkStart w:id="102" w:name="deployment-is-automatic-graded-by-risk"/>
     <w:p>
       <w:pPr>
         <w:pStyle w:val="Heading3"/>
@@ -6283,18 +6873,18 @@
           <wp:inline>
             <wp:extent cx="5334000" cy="1018215"/>
             <wp:effectExtent b="0" l="0" r="0" t="0"/>
-            <wp:docPr descr="" title="" id="67" name="Picture"/>
+            <wp:docPr descr="" title="" id="97" name="Picture"/>
             <a:graphic>
               <a:graphicData uri="http://schemas.openxmlformats.org/drawingml/2006/picture">
                 <pic:pic>
                   <pic:nvPicPr>
-                    <pic:cNvPr descr="evidence/p02-run-list.png" id="68" name="Picture"/>
+                    <pic:cNvPr descr="evidence/p02-run-list.png" id="98" name="Picture"/>
                     <pic:cNvPicPr>
                       <a:picLocks noChangeArrowheads="1" noChangeAspect="1"/>
                     </pic:cNvPicPr>
                   </pic:nvPicPr>
                   <pic:blipFill>
-                    <a:blip r:embed="rId66"/>
+                    <a:blip r:embed="rId96"/>
                     <a:stretch>
                       <a:fillRect/>
                     </a:stretch>
@@ -6330,7 +6920,7 @@
           <w:iCs/>
           <w:i/>
         </w:rPr>
-        <w:t xml:space="preserve">Figure 20: the grading in one frame. From a single commit, SOAR CI and SOAR Console deployed on their own, while Infrastructure stopped and waited. The difference is not the pipeline; it is what the plan contained.</w:t>
+        <w:t xml:space="preserve">Figure 16: the grading in one frame. From a single commit, SOAR CI and SOAR Console deployed on their own, while Infrastructure stopped and waited. The difference is not the pipeline; it is what the plan contained.</w:t>
       </w:r>
     </w:p>
     <w:p>
@@ -6342,18 +6932,18 @@
           <wp:inline>
             <wp:extent cx="5120640" cy="2509391"/>
             <wp:effectExtent b="0" l="0" r="0" t="0"/>
-            <wp:docPr descr="" title="" id="70" name="Picture"/>
+            <wp:docPr descr="" title="" id="100" name="Picture"/>
             <a:graphic>
               <a:graphicData uri="http://schemas.openxmlformats.org/drawingml/2006/picture">
                 <pic:pic>
                   <pic:nvPicPr>
-                    <pic:cNvPr descr="evidence/p03-approval-prompt.png" id="71" name="Picture"/>
+                    <pic:cNvPr descr="evidence/p03-approval-prompt.png" id="101" name="Picture"/>
                     <pic:cNvPicPr>
                       <a:picLocks noChangeArrowheads="1" noChangeAspect="1"/>
                     </pic:cNvPicPr>
                   </pic:nvPicPr>
                   <pic:blipFill>
-                    <a:blip r:embed="rId69"/>
+                    <a:blip r:embed="rId99"/>
                     <a:stretch>
                       <a:fillRect/>
                     </a:stretch>
@@ -6389,7 +6979,7 @@
           <w:iCs/>
           <w:i/>
         </w:rPr>
-        <w:t xml:space="preserve">Figure 21: why that run stopped. The plan replaces two EC2 instances, so it routed to an environment requiring review rather than applying unattended. The reviewer sees the plan summary before deciding.</w:t>
+        <w:t xml:space="preserve">Figure 17: why that run stopped. The plan replaces two EC2 instances, so it routed to an environment requiring review rather than applying unattended. The reviewer sees the plan summary before deciding.</w:t>
       </w:r>
     </w:p>
     <w:p>
@@ -6415,8 +7005,8 @@
         <w:t xml:space="preserve">so there is no gap in service, and the image is smoke tested on the runner before it is pushed.</w:t>
       </w:r>
     </w:p>
-    <w:bookmarkEnd w:id="72"/>
-    <w:bookmarkStart w:id="73" w:name="image-tagging"/>
+    <w:bookmarkEnd w:id="102"/>
+    <w:bookmarkStart w:id="103" w:name="image-tagging"/>
     <w:p>
       <w:pPr>
         <w:pStyle w:val="Heading3"/>
@@ -6468,8 +7058,8 @@
         <w:t xml:space="preserve">appears to succeed while deploying nothing. After each rollout the pipeline asserts that the running image is the one it just built, which would catch that failure mode if it ever reappeared.</w:t>
       </w:r>
     </w:p>
-    <w:bookmarkEnd w:id="73"/>
-    <w:bookmarkStart w:id="74" w:name="deploying-the-observability-stack"/>
+    <w:bookmarkEnd w:id="103"/>
+    <w:bookmarkStart w:id="104" w:name="deploying-the-observability-stack"/>
     <w:p>
       <w:pPr>
         <w:pStyle w:val="Heading3"/>
@@ -6538,8 +7128,8 @@
         <w:t xml:space="preserve">Terraform’s Helm provider was the alternative and is more literally infrastructure as code. It was not used because it needs to reach the Kubernetes API at plan time, which from a runner outside the VPC means carrying a kubeconfig through the bastion, and because it creates an ordering problem: the cluster and the workloads running on it would live in the same configuration and the same state. Helm driven by a pipeline against versioned values achieves the same reproducibility with fewer moving parts. Separating cluster and workload state, then adopting the provider, is the production recommendation.</w:t>
       </w:r>
     </w:p>
-    <w:bookmarkEnd w:id="74"/>
-    <w:bookmarkStart w:id="78" w:name="deploying-soar-to-the-container-platform"/>
+    <w:bookmarkEnd w:id="104"/>
+    <w:bookmarkStart w:id="108" w:name="deploying-soar-to-the-container-platform"/>
     <w:p>
       <w:pPr>
         <w:pStyle w:val="Heading3"/>
@@ -6573,18 +7163,18 @@
           <wp:inline>
             <wp:extent cx="5334000" cy="4334173"/>
             <wp:effectExtent b="0" l="0" r="0" t="0"/>
-            <wp:docPr descr="" title="" id="76" name="Picture"/>
+            <wp:docPr descr="" title="" id="106" name="Picture"/>
             <a:graphic>
               <a:graphicData uri="http://schemas.openxmlformats.org/drawingml/2006/picture">
                 <pic:pic>
                   <pic:nvPicPr>
-                    <pic:cNvPr descr="evidence/p06-soar-console.png" id="77" name="Picture"/>
+                    <pic:cNvPr descr="evidence/p06-soar-console.png" id="107" name="Picture"/>
                     <pic:cNvPicPr>
                       <a:picLocks noChangeArrowheads="1" noChangeAspect="1"/>
                     </pic:cNvPicPr>
                   </pic:nvPicPr>
                   <pic:blipFill>
-                    <a:blip r:embed="rId75"/>
+                    <a:blip r:embed="rId105"/>
                     <a:stretch>
                       <a:fillRect/>
                     </a:stretch>
@@ -6663,10 +7253,10 @@
         <w:br w:type="page"/>
       </w:r>
     </w:p>
-    <w:bookmarkEnd w:id="78"/>
-    <w:bookmarkEnd w:id="79"/>
-    <w:bookmarkEnd w:id="80"/>
-    <w:bookmarkStart w:id="81" w:name="failure-scenarios"/>
+    <w:bookmarkEnd w:id="108"/>
+    <w:bookmarkEnd w:id="109"/>
+    <w:bookmarkEnd w:id="110"/>
+    <w:bookmarkStart w:id="111" w:name="failure-scenarios"/>
     <w:p>
       <w:pPr>
         <w:pStyle w:val="Heading1"/>
@@ -7024,8 +7614,8 @@
         <w:br w:type="page"/>
       </w:r>
     </w:p>
-    <w:bookmarkEnd w:id="81"/>
-    <w:bookmarkStart w:id="85" w:name="decisions-taken-under-constraint"/>
+    <w:bookmarkEnd w:id="111"/>
+    <w:bookmarkStart w:id="115" w:name="decisions-taken-under-constraint"/>
     <w:p>
       <w:pPr>
         <w:pStyle w:val="Heading1"/>
@@ -7042,7 +7632,7 @@
         <w:t xml:space="preserve">Three significant design decisions were forced by constraints discovered during implementation rather than chosen freely. They are recorded here because the reasoning is part of the design.</w:t>
       </w:r>
     </w:p>
-    <w:bookmarkStart w:id="82" w:name="k3s-instead-of-eks"/>
+    <w:bookmarkStart w:id="112" w:name="k3s-instead-of-eks"/>
     <w:p>
       <w:pPr>
         <w:pStyle w:val="Heading2"/>
@@ -7071,8 +7661,8 @@
         <w:t xml:space="preserve">. This was found by probing the account before designing, not by hitting it during deployment. k3s on EC2 is CNCF-conformant, so the workload remains portable; the difference is that the control plane is self-managed rather than managed.</w:t>
       </w:r>
     </w:p>
-    <w:bookmarkEnd w:id="82"/>
-    <w:bookmarkStart w:id="83" w:name="X348368fae208ab7a7823e02f796da62e3186d3b"/>
+    <w:bookmarkEnd w:id="112"/>
+    <w:bookmarkStart w:id="113" w:name="X348368fae208ab7a7823e02f796da62e3186d3b"/>
     <w:p>
       <w:pPr>
         <w:pStyle w:val="Heading2"/>
@@ -7164,8 +7754,8 @@
         <w:t xml:space="preserve">PostgreSQL instance was always the weaker choice; the policy simply forced the stronger one. SOAR operational state moved to DynamoDB, which suits it better anyway. Events are written once and read by key, with no joins.</w:t>
       </w:r>
     </w:p>
-    <w:bookmarkEnd w:id="83"/>
-    <w:bookmarkStart w:id="84" w:name="Xe92ecc1338b76b4a21367e33c1195b0b2cb6cad"/>
+    <w:bookmarkEnd w:id="113"/>
+    <w:bookmarkStart w:id="114" w:name="Xe92ecc1338b76b4a21367e33c1195b0b2cb6cad"/>
     <w:p>
       <w:pPr>
         <w:pStyle w:val="Heading2"/>
@@ -7234,9 +7824,9 @@
         <w:br w:type="page"/>
       </w:r>
     </w:p>
-    <w:bookmarkEnd w:id="84"/>
-    <w:bookmarkEnd w:id="85"/>
-    <w:bookmarkStart w:id="86" w:name="cost"/>
+    <w:bookmarkEnd w:id="114"/>
+    <w:bookmarkEnd w:id="115"/>
+    <w:bookmarkStart w:id="116" w:name="cost"/>
     <w:p>
       <w:pPr>
         <w:pStyle w:val="Heading1"/>
@@ -7523,8 +8113,8 @@
         <w:br w:type="page"/>
       </w:r>
     </w:p>
-    <w:bookmarkEnd w:id="86"/>
-    <w:bookmarkStart w:id="87" w:name="recommendations"/>
+    <w:bookmarkEnd w:id="116"/>
+    <w:bookmarkStart w:id="117" w:name="recommendations"/>
     <w:p>
       <w:pPr>
         <w:pStyle w:val="Heading1"/>
@@ -7688,7 +8278,7 @@
         <w:t xml:space="preserve">metric, which shows which real events currently have no automated response.</w:t>
       </w:r>
     </w:p>
-    <w:bookmarkEnd w:id="87"/>
+    <w:bookmarkEnd w:id="117"/>
     <w:sectPr/>
   </w:body>
 </w:document>

</xml_diff>

<commit_message>
Correct stale addresses, counts and structure claims across the documentation
</commit_message>
<xml_diff>
--- a/docs/01-design-document.docx
+++ b/docs/01-design-document.docx
@@ -6321,6 +6321,35 @@
               <w:rPr>
                 <w:rStyle w:val="VerbatimChar"/>
               </w:rPr>
+              <w:t xml:space="preserve">soar/forwarder/</w:t>
+            </w:r>
+          </w:p>
+        </w:tc>
+        <w:tc>
+          <w:tcPr/>
+          <w:p>
+            <w:pPr>
+              <w:pStyle w:val="Compact"/>
+              <w:jc w:val="left"/>
+            </w:pPr>
+            <w:r>
+              <w:t xml:space="preserve">The agent that runs on the on-premises server</w:t>
+            </w:r>
+          </w:p>
+        </w:tc>
+      </w:tr>
+      <w:tr>
+        <w:tc>
+          <w:tcPr/>
+          <w:p>
+            <w:pPr>
+              <w:pStyle w:val="Compact"/>
+              <w:jc w:val="left"/>
+            </w:pPr>
+            <w:r>
+              <w:rPr>
+                <w:rStyle w:val="VerbatimChar"/>
+              </w:rPr>
               <w:t xml:space="preserve">soar/console/</w:t>
             </w:r>
           </w:p>
@@ -6362,7 +6391,7 @@
               <w:jc w:val="left"/>
             </w:pPr>
             <w:r>
-              <w:t xml:space="preserve">50 unit tests, no external dependencies</w:t>
+              <w:t xml:space="preserve">62 unit tests, no external dependencies</w:t>
             </w:r>
           </w:p>
         </w:tc>
@@ -6391,7 +6420,7 @@
               <w:jc w:val="left"/>
             </w:pPr>
             <w:r>
-              <w:t xml:space="preserve">Monitoring stack deployment</w:t>
+              <w:t xml:space="preserve">Helm values, alert rules and the Grafana dashboard</w:t>
             </w:r>
           </w:p>
         </w:tc>
@@ -6449,19 +6478,19 @@
               <w:jc w:val="left"/>
             </w:pPr>
             <w:r>
-              <w:t xml:space="preserve">This documentation set</w:t>
+              <w:t xml:space="preserve">This documentation set and its evidence</w:t>
             </w:r>
           </w:p>
         </w:tc>
       </w:tr>
     </w:tbl>
-    <w:bookmarkStart w:id="94" w:name="the-three-pipelines"/>
+    <w:bookmarkStart w:id="94" w:name="the-four-pipelines"/>
     <w:p>
       <w:pPr>
         <w:pStyle w:val="Heading3"/>
       </w:pPr>
       <w:r>
-        <w:t xml:space="preserve">The three pipelines</w:t>
+        <w:t xml:space="preserve">The four pipelines</w:t>
       </w:r>
     </w:p>
     <w:tbl>
@@ -8106,6 +8135,26 @@
       </w:pPr>
       <w:r>
         <w:t xml:space="preserve">The Resolver inbound endpoint is the largest single line and is behind a feature flag. Disabling it when hybrid DNS is not being demonstrated reduces the total by roughly a third; VPC-internal resolution is unaffected.</w:t>
+      </w:r>
+    </w:p>
+    <w:p>
+      <w:pPr>
+        <w:pStyle w:val="BodyText"/>
+      </w:pPr>
+      <w:r>
+        <w:t xml:space="preserve">Four EC2 instances are running: the hybrid gateway, the k3s server, the demonstration workstation, and the simulated corporate server. Only the k3s node is sized above</w:t>
+      </w:r>
+      <w:r>
+        <w:t xml:space="preserve"> </w:t>
+      </w:r>
+      <w:r>
+        <w:rPr>
+          <w:rStyle w:val="VerbatimChar"/>
+        </w:rPr>
+        <w:t xml:space="preserve">t3.micro</w:t>
+      </w:r>
+      <w:r>
+        <w:t xml:space="preserve">, because it carries the whole observability stack.</w:t>
       </w:r>
     </w:p>
     <w:p>

</xml_diff>